<commit_message>
script 1. distancias actualizado
</commit_message>
<xml_diff>
--- a/Documento auxiliar PROY II.docx
+++ b/Documento auxiliar PROY II.docx
@@ -1,15 +1,19 @@
 
 <file path=word/document.xml><?xml version="1.0" encoding="utf-8"?>
-<w:document xmlns:wpc="http://schemas.microsoft.com/office/word/2010/wordprocessingCanvas" xmlns:cx="http://schemas.microsoft.com/office/drawing/2014/chartex" xmlns:cx1="http://schemas.microsoft.com/office/drawing/2015/9/8/chartex" xmlns:cx2="http://schemas.microsoft.com/office/drawing/2015/10/21/chartex" xmlns:cx3="http://schemas.microsoft.com/office/drawing/2016/5/9/chartex" xmlns:cx4="http://schemas.microsoft.com/office/drawing/2016/5/10/chartex" xmlns:cx5="http://schemas.microsoft.com/office/drawing/2016/5/11/chartex" xmlns:cx6="http://schemas.microsoft.com/office/drawing/2016/5/12/chartex" xmlns:cx7="http://schemas.microsoft.com/office/drawing/2016/5/13/chartex" xmlns:cx8="http://schemas.microsoft.com/office/drawing/2016/5/14/chartex" xmlns:mc="http://schemas.openxmlformats.org/markup-compatibility/2006" xmlns:aink="http://schemas.microsoft.com/office/drawing/2016/ink" xmlns:am3d="http://schemas.microsoft.com/office/drawing/2017/model3d" xmlns:o="urn:schemas-microsoft-com:office:office" xmlns:oel="http://schemas.microsoft.com/office/2019/extlst" xmlns:r="http://schemas.openxmlformats.org/officeDocument/2006/relationships" xmlns:m="http://schemas.openxmlformats.org/officeDocument/2006/math" xmlns:v="urn:schemas-microsoft-com:vml" xmlns:wp14="http://schemas.microsoft.com/office/word/2010/wordprocessingDrawing" xmlns:wp="http://schemas.openxmlformats.org/drawingml/2006/wordprocessingDrawing" xmlns:w10="urn:schemas-microsoft-com:office:word" xmlns:w="http://schemas.openxmlformats.org/wordprocessingml/2006/main" xmlns:w14="http://schemas.microsoft.com/office/word/2010/wordml" xmlns:w15="http://schemas.microsoft.com/office/word/2012/wordml" xmlns:w16cex="http://schemas.microsoft.com/office/word/2018/wordml/cex" xmlns:w16cid="http://schemas.microsoft.com/office/word/2016/wordml/cid" xmlns:w16="http://schemas.microsoft.com/office/word/2018/wordml" xmlns:w16sdtdh="http://schemas.microsoft.com/office/word/2020/wordml/sdtdatahash" xmlns:w16se="http://schemas.microsoft.com/office/word/2015/wordml/symex" xmlns:wpg="http://schemas.microsoft.com/office/word/2010/wordprocessingGroup" xmlns:wpi="http://schemas.microsoft.com/office/word/2010/wordprocessingInk" xmlns:wne="http://schemas.microsoft.com/office/word/2006/wordml" xmlns:wps="http://schemas.microsoft.com/office/word/2010/wordprocessingShape" mc:Ignorable="w14 w15 w16se w16cid w16 w16cex w16sdtdh wp14">
+<w:document xmlns:wpc="http://schemas.microsoft.com/office/word/2010/wordprocessingCanvas" xmlns:cx="http://schemas.microsoft.com/office/drawing/2014/chartex" xmlns:cx1="http://schemas.microsoft.com/office/drawing/2015/9/8/chartex" xmlns:cx2="http://schemas.microsoft.com/office/drawing/2015/10/21/chartex" xmlns:cx3="http://schemas.microsoft.com/office/drawing/2016/5/9/chartex" xmlns:cx4="http://schemas.microsoft.com/office/drawing/2016/5/10/chartex" xmlns:cx5="http://schemas.microsoft.com/office/drawing/2016/5/11/chartex" xmlns:cx6="http://schemas.microsoft.com/office/drawing/2016/5/12/chartex" xmlns:cx7="http://schemas.microsoft.com/office/drawing/2016/5/13/chartex" xmlns:cx8="http://schemas.microsoft.com/office/drawing/2016/5/14/chartex" xmlns:mc="http://schemas.openxmlformats.org/markup-compatibility/2006" xmlns:aink="http://schemas.microsoft.com/office/drawing/2016/ink" xmlns:am3d="http://schemas.microsoft.com/office/drawing/2017/model3d" xmlns:o="urn:schemas-microsoft-com:office:office" xmlns:oel="http://schemas.microsoft.com/office/2019/extlst" xmlns:r="http://schemas.openxmlformats.org/officeDocument/2006/relationships" xmlns:m="http://schemas.openxmlformats.org/officeDocument/2006/math" xmlns:v="urn:schemas-microsoft-com:vml" xmlns:wp14="http://schemas.microsoft.com/office/word/2010/wordprocessingDrawing" xmlns:wp="http://schemas.openxmlformats.org/drawingml/2006/wordprocessingDrawing" xmlns:w10="urn:schemas-microsoft-com:office:word" xmlns:w="http://schemas.openxmlformats.org/wordprocessingml/2006/main" xmlns:w14="http://schemas.microsoft.com/office/word/2010/wordml" xmlns:w15="http://schemas.microsoft.com/office/word/2012/wordml" xmlns:w16cex="http://schemas.microsoft.com/office/word/2018/wordml/cex" xmlns:w16cid="http://schemas.microsoft.com/office/word/2016/wordml/cid" xmlns:w16="http://schemas.microsoft.com/office/word/2018/wordml" xmlns:w16du="http://schemas.microsoft.com/office/word/2023/wordml/word16du" xmlns:w16sdtdh="http://schemas.microsoft.com/office/word/2020/wordml/sdtdatahash" xmlns:w16sdtfl="http://schemas.microsoft.com/office/word/2024/wordml/sdtformatlock" xmlns:w16se="http://schemas.microsoft.com/office/word/2015/wordml/symex" xmlns:wpg="http://schemas.microsoft.com/office/word/2010/wordprocessingGroup" xmlns:wpi="http://schemas.microsoft.com/office/word/2010/wordprocessingInk" xmlns:wne="http://schemas.microsoft.com/office/word/2006/wordml" xmlns:wps="http://schemas.microsoft.com/office/word/2010/wordprocessingShape" mc:Ignorable="w14 w15 w16se w16cid w16 w16cex w16sdtdh w16sdtfl w16du wp14">
   <w:body>
     <w:p>
       <w:pPr>
         <w:spacing w:after="0"/>
         <w:jc w:val="center"/>
-      </w:pPr>
-      <w:r>
-        <w:rPr>
-          <w:rFonts w:ascii="Arial" w:hAnsi="Arial" w:eastAsia="Arial" w:cs="Arial"/>
+        <w:rPr>
+          <w:b/>
+          <w:bCs/>
+        </w:rPr>
+      </w:pPr>
+      <w:r>
+        <w:rPr>
+          <w:rFonts w:ascii="Arial" w:eastAsia="Arial" w:hAnsi="Arial" w:cs="Arial"/>
           <w:b/>
           <w:bCs/>
           <w:color w:val="000000" w:themeColor="text1"/>
@@ -18,63 +22,121 @@
         </w:rPr>
         <w:t>BASES DE DATOS PROYECTO</w:t>
       </w:r>
+      <w:r>
+        <w:rPr>
+          <w:b/>
+          <w:bCs/>
+        </w:rPr>
+        <w:t>:</w:t>
+      </w:r>
     </w:p>
     <w:p>
       <w:pPr>
         <w:spacing w:after="0"/>
-      </w:pPr>
-      <w:r>
-        <w:rPr>
-          <w:rFonts w:ascii="Arial" w:hAnsi="Arial" w:eastAsia="Arial" w:cs="Arial"/>
-          <w:b/>
-          <w:bCs/>
-          <w:color w:val="000000" w:themeColor="text1"/>
-          <w:sz w:val="28"/>
-          <w:szCs w:val="28"/>
-        </w:rPr>
-        <w:t xml:space="preserve"> </w:t>
-      </w:r>
-    </w:p>
-    <w:p>
-      <w:pPr>
-        <w:rPr>
-          <w:b w:val="1"/>
-          <w:bCs w:val="1"/>
-        </w:rPr>
-      </w:pPr>
-      <w:r>
-        <w:rPr>
-          <w:b w:val="1"/>
-          <w:bCs w:val="1"/>
-        </w:rPr>
-        <w:t>CUESTIONARIO</w:t>
-      </w:r>
-      <w:r>
-        <w:rPr>
-          <w:b w:val="1"/>
-          <w:bCs w:val="1"/>
-        </w:rPr>
-        <w:t>:</w:t>
-      </w:r>
-    </w:p>
-    <w:p>
-      <w:pPr>
-        <w:pStyle w:val="Prrafodelista"/>
+        <w:jc w:val="center"/>
+        <w:rPr>
+          <w:b/>
+          <w:bCs/>
+        </w:rPr>
+      </w:pPr>
+    </w:p>
+    <w:p>
+      <w:pPr>
+        <w:spacing w:after="0"/>
+      </w:pPr>
+      <w:r>
+        <w:t>Hay que tener en cuenta que se han eliminado todos los municipios con aquella conexión a internet menor a 90 (</w:t>
+      </w:r>
+      <w:r>
+        <w:rPr>
+          <w:i/>
+          <w:iCs/>
+        </w:rPr>
+        <w:t>conectividad a internet</w:t>
+      </w:r>
+      <w:r>
+        <w:t>)</w:t>
+      </w:r>
+      <w:r>
+        <w:t>.</w:t>
+      </w:r>
+    </w:p>
+    <w:p>
+      <w:pPr>
+        <w:spacing w:after="0"/>
+        <w:rPr>
+          <w:b/>
+          <w:bCs/>
+        </w:rPr>
+      </w:pPr>
+    </w:p>
+    <w:p>
+      <w:pPr>
+        <w:spacing w:after="0"/>
+        <w:rPr>
+          <w:b/>
+          <w:bCs/>
+        </w:rPr>
+      </w:pPr>
+      <w:r>
+        <w:rPr>
+          <w:b/>
+          <w:bCs/>
+        </w:rPr>
+        <w:t>FORMULARIO:</w:t>
+      </w:r>
+      <w:r>
+        <w:tab/>
+      </w:r>
+    </w:p>
+    <w:p>
+      <w:pPr>
+        <w:pStyle w:val="ListParagraph"/>
         <w:numPr>
           <w:ilvl w:val="0"/>
-          <w:numId w:val="13"/>
+          <w:numId w:val="8"/>
         </w:numPr>
       </w:pPr>
       <w:r>
         <w:t>EDAD</w:t>
       </w:r>
-    </w:p>
-    <w:p>
-      <w:pPr>
-        <w:pStyle w:val="Prrafodelista"/>
+      <w:r>
+        <w:t xml:space="preserve"> </w:t>
+      </w:r>
+      <w:r>
+        <w:t>–</w:t>
+      </w:r>
+      <w:r>
+        <w:t xml:space="preserve"> </w:t>
+      </w:r>
+      <w:r>
+        <w:rPr>
+          <w:i/>
+          <w:iCs/>
+        </w:rPr>
+        <w:t>Índice</w:t>
+      </w:r>
+      <w:r>
+        <w:rPr>
+          <w:i/>
+          <w:iCs/>
+        </w:rPr>
+        <w:t xml:space="preserve"> </w:t>
+      </w:r>
+      <w:r>
+        <w:rPr>
+          <w:i/>
+          <w:iCs/>
+        </w:rPr>
+        <w:t>envejecimiento</w:t>
+      </w:r>
+    </w:p>
+    <w:p>
+      <w:pPr>
+        <w:pStyle w:val="ListParagraph"/>
         <w:numPr>
           <w:ilvl w:val="0"/>
-          <w:numId w:val="13"/>
+          <w:numId w:val="8"/>
         </w:numPr>
       </w:pPr>
       <w:r>
@@ -86,13 +148,29 @@
       <w:r>
         <w:t>EN EL HOGAR</w:t>
       </w:r>
-    </w:p>
-    <w:p>
-      <w:pPr>
-        <w:pStyle w:val="Prrafodelista"/>
+      <w:r>
+        <w:t xml:space="preserve"> </w:t>
+      </w:r>
+      <w:r>
+        <w:t>–</w:t>
+      </w:r>
+      <w:r>
+        <w:t xml:space="preserve"> </w:t>
+      </w:r>
+      <w:r>
+        <w:rPr>
+          <w:i/>
+          <w:iCs/>
+        </w:rPr>
+        <w:t>Ratio colegios o distancia centro educativo</w:t>
+      </w:r>
+    </w:p>
+    <w:p>
+      <w:pPr>
+        <w:pStyle w:val="ListParagraph"/>
         <w:numPr>
           <w:ilvl w:val="1"/>
-          <w:numId w:val="13"/>
+          <w:numId w:val="8"/>
         </w:numPr>
       </w:pPr>
       <w:r>
@@ -104,10 +182,10 @@
     </w:p>
     <w:p>
       <w:pPr>
-        <w:pStyle w:val="Prrafodelista"/>
+        <w:pStyle w:val="ListParagraph"/>
         <w:numPr>
           <w:ilvl w:val="0"/>
-          <w:numId w:val="13"/>
+          <w:numId w:val="8"/>
         </w:numPr>
       </w:pPr>
       <w:r>
@@ -119,102 +197,166 @@
       <w:r>
         <w:t>QUE PRECISE DE HOSPITAL</w:t>
       </w:r>
-    </w:p>
-    <w:p>
-      <w:pPr>
-        <w:pStyle w:val="Prrafodelista"/>
+      <w:r>
+        <w:t xml:space="preserve"> </w:t>
+      </w:r>
+      <w:r>
+        <w:t>–</w:t>
+      </w:r>
+      <w:r>
+        <w:t xml:space="preserve"> </w:t>
+      </w:r>
+      <w:r>
+        <w:rPr>
+          <w:i/>
+          <w:iCs/>
+        </w:rPr>
+        <w:t>Ratio hospital o distancia hospital</w:t>
+      </w:r>
+    </w:p>
+    <w:p>
+      <w:pPr>
+        <w:pStyle w:val="ListParagraph"/>
         <w:numPr>
           <w:ilvl w:val="0"/>
-          <w:numId w:val="13"/>
+          <w:numId w:val="8"/>
         </w:numPr>
+        <w:rPr>
+          <w:i/>
+          <w:iCs/>
+        </w:rPr>
       </w:pPr>
       <w:r>
         <w:t>PROPENSO A CONTRAER ENFERMEDADES</w:t>
       </w:r>
       <w:r>
-        <w:t>-CENTRO SALUD</w:t>
-      </w:r>
-    </w:p>
-    <w:p>
-      <w:pPr>
-        <w:pStyle w:val="Prrafodelista"/>
+        <w:t xml:space="preserve"> – </w:t>
+      </w:r>
+      <w:r>
+        <w:rPr>
+          <w:i/>
+          <w:iCs/>
+        </w:rPr>
+        <w:t>Ratio centro de salud o existencia consultorio local</w:t>
+      </w:r>
+    </w:p>
+    <w:p>
+      <w:pPr>
+        <w:pStyle w:val="ListParagraph"/>
         <w:numPr>
           <w:ilvl w:val="0"/>
-          <w:numId w:val="13"/>
+          <w:numId w:val="8"/>
         </w:numPr>
       </w:pPr>
       <w:r>
         <w:t>RENTA</w:t>
       </w:r>
-    </w:p>
-    <w:p>
-      <w:pPr>
-        <w:pStyle w:val="Prrafodelista"/>
+      <w:r>
+        <w:t xml:space="preserve"> O CUÁNTO DE TU RENTA ESTÁS DISPUESTO A GASTAR EN </w:t>
+      </w:r>
+      <w:r>
+        <w:t>LA VIVIENDA</w:t>
+      </w:r>
+      <w:r>
+        <w:t xml:space="preserve"> </w:t>
+      </w:r>
+      <w:r>
+        <w:t xml:space="preserve">– </w:t>
+      </w:r>
+      <w:r>
+        <w:rPr>
+          <w:i/>
+          <w:iCs/>
+        </w:rPr>
+        <w:t>Esfuerzo alquiler</w:t>
+      </w:r>
+    </w:p>
+    <w:p>
+      <w:pPr>
+        <w:pStyle w:val="ListParagraph"/>
         <w:numPr>
           <w:ilvl w:val="0"/>
-          <w:numId w:val="13"/>
+          <w:numId w:val="8"/>
         </w:numPr>
-        <w:rPr/>
-      </w:pPr>
-      <w:r>
-        <w:rPr/>
+      </w:pPr>
+      <w:r>
         <w:t>BUSCAS TRANQUILIDAD</w:t>
       </w:r>
       <w:r>
-        <w:rPr/>
         <w:t xml:space="preserve"> </w:t>
       </w:r>
       <w:r>
-        <w:rPr/>
-        <w:t>(ESPACIOS EN VERDE DISTRITOS)</w:t>
-      </w:r>
-    </w:p>
-    <w:p>
-      <w:pPr>
-        <w:pStyle w:val="Prrafodelista"/>
+        <w:t xml:space="preserve">– </w:t>
+      </w:r>
+      <w:r>
+        <w:rPr>
+          <w:i/>
+          <w:iCs/>
+        </w:rPr>
+        <w:t>Espacios verdes en distritos</w:t>
+      </w:r>
+    </w:p>
+    <w:p>
+      <w:pPr>
+        <w:pStyle w:val="ListParagraph"/>
         <w:numPr>
           <w:ilvl w:val="0"/>
-          <w:numId w:val="13"/>
+          <w:numId w:val="8"/>
         </w:numPr>
       </w:pPr>
       <w:r>
         <w:t>TIENES COCHE</w:t>
       </w:r>
     </w:p>
-    <w:p>
-      <w:pPr>
-        <w:pStyle w:val="Prrafodelista"/>
+    <w:p/>
+    <w:p>
+      <w:pPr>
+        <w:pStyle w:val="ListParagraph"/>
         <w:numPr>
           <w:ilvl w:val="0"/>
-          <w:numId w:val="13"/>
+          <w:numId w:val="8"/>
         </w:numPr>
       </w:pPr>
-    </w:p>
-    <w:p>
-      <w:pPr>
-        <w:pStyle w:val="Prrafodelista"/>
+      <w:r>
+        <w:t>CLIMA</w:t>
+      </w:r>
+      <w:r>
+        <w:t xml:space="preserve"> (PARA DIFERENCIAR ENTRE VIZCAYA/VALENCIA)</w:t>
+      </w:r>
+    </w:p>
+    <w:p>
+      <w:pPr>
+        <w:pStyle w:val="ListParagraph"/>
+      </w:pPr>
+    </w:p>
+    <w:p>
+      <w:pPr>
+        <w:pStyle w:val="ListParagraph"/>
         <w:numPr>
           <w:ilvl w:val="0"/>
-          <w:numId w:val="13"/>
+          <w:numId w:val="8"/>
         </w:numPr>
       </w:pPr>
       <w:r>
-        <w:t>CLIMA</w:t>
-      </w:r>
-      <w:r>
-        <w:t xml:space="preserve"> (PARA DIFERENCIAR ENTRE VIZCAYA/VALENCIA)</w:t>
-      </w:r>
-    </w:p>
-    <w:p>
-      <w:pPr>
-        <w:pStyle w:val="Prrafodelista"/>
+        <w:t xml:space="preserve">LAS VARIABLES </w:t>
+      </w:r>
+      <w:r>
+        <w:t xml:space="preserve">RELACIONADAS CON LOS CONTRATOS POR SECTORES SOLO SIRVEN PARA CLUSTERING O </w:t>
+      </w:r>
+      <w:r>
+        <w:t>CREAR UNA PREGUNTA SOBRE ELLO??</w:t>
+      </w:r>
+    </w:p>
+    <w:p>
+      <w:pPr>
+        <w:pStyle w:val="ListParagraph"/>
       </w:pPr>
     </w:p>
     <w:p>
       <w:pPr>
         <w:spacing w:after="0"/>
         <w:rPr>
-          <w:rFonts w:ascii="Arial" w:hAnsi="Arial" w:eastAsia="Arial" w:cs="Arial"/>
+          <w:rFonts w:ascii="Arial" w:eastAsia="Arial" w:hAnsi="Arial" w:cs="Arial"/>
           <w:b/>
           <w:bCs/>
           <w:color w:val="000000" w:themeColor="text1"/>
@@ -227,7 +369,7 @@
       <w:pPr>
         <w:spacing w:after="0"/>
         <w:rPr>
-          <w:rFonts w:ascii="Arial" w:hAnsi="Arial" w:eastAsia="Arial" w:cs="Arial"/>
+          <w:rFonts w:ascii="Arial" w:eastAsia="Arial" w:hAnsi="Arial" w:cs="Arial"/>
           <w:b/>
           <w:bCs/>
           <w:color w:val="000000" w:themeColor="text1"/>
@@ -240,7 +382,7 @@
       <w:pPr>
         <w:spacing w:after="0"/>
         <w:rPr>
-          <w:rFonts w:ascii="Arial" w:hAnsi="Arial" w:eastAsia="Arial" w:cs="Arial"/>
+          <w:rFonts w:ascii="Arial" w:eastAsia="Arial" w:hAnsi="Arial" w:cs="Arial"/>
           <w:b/>
           <w:bCs/>
           <w:color w:val="000000" w:themeColor="text1"/>
@@ -253,7 +395,7 @@
       <w:pPr>
         <w:spacing w:after="0"/>
         <w:rPr>
-          <w:rFonts w:ascii="Arial" w:hAnsi="Arial" w:eastAsia="Arial" w:cs="Arial"/>
+          <w:rFonts w:ascii="Arial" w:eastAsia="Arial" w:hAnsi="Arial" w:cs="Arial"/>
           <w:b/>
           <w:bCs/>
           <w:color w:val="000000" w:themeColor="text1"/>
@@ -266,7 +408,7 @@
       <w:pPr>
         <w:spacing w:after="0"/>
         <w:rPr>
-          <w:rFonts w:ascii="Arial" w:hAnsi="Arial" w:eastAsia="Arial" w:cs="Arial"/>
+          <w:rFonts w:ascii="Arial" w:eastAsia="Arial" w:hAnsi="Arial" w:cs="Arial"/>
           <w:b/>
           <w:bCs/>
           <w:color w:val="000000" w:themeColor="text1"/>
@@ -279,7 +421,7 @@
       <w:pPr>
         <w:spacing w:after="0"/>
         <w:rPr>
-          <w:rFonts w:ascii="Arial" w:hAnsi="Arial" w:eastAsia="Arial" w:cs="Arial"/>
+          <w:rFonts w:ascii="Arial" w:eastAsia="Arial" w:hAnsi="Arial" w:cs="Arial"/>
           <w:b/>
           <w:bCs/>
           <w:color w:val="000000" w:themeColor="text1"/>
@@ -292,7 +434,7 @@
       <w:pPr>
         <w:spacing w:after="0"/>
         <w:rPr>
-          <w:rFonts w:ascii="Arial" w:hAnsi="Arial" w:eastAsia="Arial" w:cs="Arial"/>
+          <w:rFonts w:ascii="Arial" w:eastAsia="Arial" w:hAnsi="Arial" w:cs="Arial"/>
           <w:b/>
           <w:bCs/>
           <w:color w:val="000000" w:themeColor="text1"/>
@@ -305,7 +447,7 @@
       <w:pPr>
         <w:spacing w:after="0"/>
         <w:rPr>
-          <w:rFonts w:ascii="Arial" w:hAnsi="Arial" w:eastAsia="Arial" w:cs="Arial"/>
+          <w:rFonts w:ascii="Arial" w:eastAsia="Arial" w:hAnsi="Arial" w:cs="Arial"/>
           <w:b/>
           <w:bCs/>
           <w:color w:val="000000" w:themeColor="text1"/>
@@ -318,7 +460,7 @@
       <w:pPr>
         <w:spacing w:after="0"/>
         <w:rPr>
-          <w:rFonts w:ascii="Arial" w:hAnsi="Arial" w:eastAsia="Arial" w:cs="Arial"/>
+          <w:rFonts w:ascii="Arial" w:eastAsia="Arial" w:hAnsi="Arial" w:cs="Arial"/>
           <w:b/>
           <w:bCs/>
           <w:color w:val="000000" w:themeColor="text1"/>
@@ -331,7 +473,7 @@
       <w:pPr>
         <w:spacing w:after="0"/>
         <w:rPr>
-          <w:rFonts w:ascii="Arial" w:hAnsi="Arial" w:eastAsia="Arial" w:cs="Arial"/>
+          <w:rFonts w:ascii="Arial" w:eastAsia="Arial" w:hAnsi="Arial" w:cs="Arial"/>
           <w:b/>
           <w:bCs/>
           <w:color w:val="000000" w:themeColor="text1"/>
@@ -344,7 +486,7 @@
       <w:pPr>
         <w:spacing w:after="0"/>
         <w:rPr>
-          <w:rFonts w:ascii="Arial" w:hAnsi="Arial" w:eastAsia="Arial" w:cs="Arial"/>
+          <w:rFonts w:ascii="Arial" w:eastAsia="Arial" w:hAnsi="Arial" w:cs="Arial"/>
           <w:b/>
           <w:bCs/>
           <w:color w:val="000000" w:themeColor="text1"/>
@@ -357,7 +499,7 @@
       <w:pPr>
         <w:spacing w:after="0"/>
         <w:rPr>
-          <w:rFonts w:ascii="Arial" w:hAnsi="Arial" w:eastAsia="Arial" w:cs="Arial"/>
+          <w:rFonts w:ascii="Arial" w:eastAsia="Arial" w:hAnsi="Arial" w:cs="Arial"/>
           <w:b/>
           <w:bCs/>
           <w:color w:val="000000" w:themeColor="text1"/>
@@ -370,7 +512,7 @@
       <w:pPr>
         <w:spacing w:after="0"/>
         <w:rPr>
-          <w:rFonts w:ascii="Arial" w:hAnsi="Arial" w:eastAsia="Arial" w:cs="Arial"/>
+          <w:rFonts w:ascii="Arial" w:eastAsia="Arial" w:hAnsi="Arial" w:cs="Arial"/>
           <w:b/>
           <w:bCs/>
           <w:color w:val="000000" w:themeColor="text1"/>
@@ -383,7 +525,7 @@
       <w:pPr>
         <w:spacing w:after="0"/>
         <w:rPr>
-          <w:rFonts w:ascii="Arial" w:hAnsi="Arial" w:eastAsia="Arial" w:cs="Arial"/>
+          <w:rFonts w:ascii="Arial" w:eastAsia="Arial" w:hAnsi="Arial" w:cs="Arial"/>
           <w:b/>
           <w:bCs/>
           <w:color w:val="000000" w:themeColor="text1"/>
@@ -396,7 +538,7 @@
       <w:pPr>
         <w:spacing w:after="0"/>
         <w:rPr>
-          <w:rFonts w:ascii="Arial" w:hAnsi="Arial" w:eastAsia="Arial" w:cs="Arial"/>
+          <w:rFonts w:ascii="Arial" w:eastAsia="Arial" w:hAnsi="Arial" w:cs="Arial"/>
           <w:b/>
           <w:bCs/>
           <w:color w:val="000000" w:themeColor="text1"/>
@@ -409,7 +551,7 @@
       <w:pPr>
         <w:spacing w:after="0"/>
         <w:rPr>
-          <w:rFonts w:ascii="Arial" w:hAnsi="Arial" w:eastAsia="Arial" w:cs="Arial"/>
+          <w:rFonts w:ascii="Arial" w:eastAsia="Arial" w:hAnsi="Arial" w:cs="Arial"/>
           <w:b/>
           <w:bCs/>
           <w:color w:val="000000" w:themeColor="text1"/>
@@ -422,7 +564,7 @@
       <w:pPr>
         <w:spacing w:after="0"/>
         <w:rPr>
-          <w:rFonts w:ascii="Arial" w:hAnsi="Arial" w:eastAsia="Arial" w:cs="Arial"/>
+          <w:rFonts w:ascii="Arial" w:eastAsia="Arial" w:hAnsi="Arial" w:cs="Arial"/>
           <w:b/>
           <w:bCs/>
           <w:color w:val="000000" w:themeColor="text1"/>
@@ -435,7 +577,7 @@
       <w:pPr>
         <w:spacing w:after="0"/>
         <w:rPr>
-          <w:rFonts w:ascii="Arial" w:hAnsi="Arial" w:eastAsia="Arial" w:cs="Arial"/>
+          <w:rFonts w:ascii="Arial" w:eastAsia="Arial" w:hAnsi="Arial" w:cs="Arial"/>
           <w:b/>
           <w:bCs/>
           <w:color w:val="000000" w:themeColor="text1"/>
@@ -448,7 +590,7 @@
       <w:pPr>
         <w:spacing w:after="0"/>
         <w:rPr>
-          <w:rFonts w:ascii="Arial" w:hAnsi="Arial" w:eastAsia="Arial" w:cs="Arial"/>
+          <w:rFonts w:ascii="Arial" w:eastAsia="Arial" w:hAnsi="Arial" w:cs="Arial"/>
           <w:b/>
           <w:bCs/>
           <w:color w:val="000000" w:themeColor="text1"/>
@@ -461,7 +603,7 @@
       <w:pPr>
         <w:spacing w:after="0"/>
         <w:rPr>
-          <w:rFonts w:ascii="Arial" w:hAnsi="Arial" w:eastAsia="Arial" w:cs="Arial"/>
+          <w:rFonts w:ascii="Arial" w:eastAsia="Arial" w:hAnsi="Arial" w:cs="Arial"/>
           <w:b/>
           <w:bCs/>
           <w:color w:val="000000" w:themeColor="text1"/>
@@ -474,7 +616,7 @@
       <w:pPr>
         <w:spacing w:after="0"/>
         <w:rPr>
-          <w:rFonts w:ascii="Arial" w:hAnsi="Arial" w:eastAsia="Arial" w:cs="Arial"/>
+          <w:rFonts w:ascii="Arial" w:eastAsia="Arial" w:hAnsi="Arial" w:cs="Arial"/>
           <w:b/>
           <w:bCs/>
           <w:color w:val="000000" w:themeColor="text1"/>
@@ -487,7 +629,7 @@
       <w:pPr>
         <w:spacing w:after="0"/>
         <w:rPr>
-          <w:rFonts w:ascii="Arial" w:hAnsi="Arial" w:eastAsia="Arial" w:cs="Arial"/>
+          <w:rFonts w:ascii="Arial" w:eastAsia="Arial" w:hAnsi="Arial" w:cs="Arial"/>
           <w:b/>
           <w:bCs/>
           <w:color w:val="000000" w:themeColor="text1"/>
@@ -500,7 +642,7 @@
       <w:pPr>
         <w:spacing w:after="0"/>
         <w:rPr>
-          <w:rFonts w:ascii="Arial" w:hAnsi="Arial" w:eastAsia="Arial" w:cs="Arial"/>
+          <w:rFonts w:ascii="Arial" w:eastAsia="Arial" w:hAnsi="Arial" w:cs="Arial"/>
           <w:b/>
           <w:bCs/>
           <w:color w:val="000000" w:themeColor="text1"/>
@@ -513,7 +655,7 @@
       <w:pPr>
         <w:spacing w:after="0"/>
         <w:rPr>
-          <w:rFonts w:ascii="Arial" w:hAnsi="Arial" w:eastAsia="Arial" w:cs="Arial"/>
+          <w:rFonts w:ascii="Arial" w:eastAsia="Arial" w:hAnsi="Arial" w:cs="Arial"/>
           <w:b/>
           <w:bCs/>
           <w:color w:val="000000" w:themeColor="text1"/>
@@ -526,7 +668,7 @@
       <w:pPr>
         <w:spacing w:after="0"/>
         <w:rPr>
-          <w:rFonts w:ascii="Arial" w:hAnsi="Arial" w:eastAsia="Arial" w:cs="Arial"/>
+          <w:rFonts w:ascii="Arial" w:eastAsia="Arial" w:hAnsi="Arial" w:cs="Arial"/>
           <w:b/>
           <w:bCs/>
           <w:color w:val="000000" w:themeColor="text1"/>
@@ -539,7 +681,7 @@
       <w:pPr>
         <w:spacing w:after="0"/>
         <w:rPr>
-          <w:rFonts w:ascii="Arial" w:hAnsi="Arial" w:eastAsia="Arial" w:cs="Arial"/>
+          <w:rFonts w:ascii="Arial" w:eastAsia="Arial" w:hAnsi="Arial" w:cs="Arial"/>
           <w:b/>
           <w:bCs/>
           <w:color w:val="000000" w:themeColor="text1"/>
@@ -551,146 +693,16 @@
     <w:p>
       <w:pPr>
         <w:spacing w:after="0"/>
-        <w:rPr>
-          <w:rFonts w:ascii="Arial" w:hAnsi="Arial" w:eastAsia="Arial" w:cs="Arial"/>
+      </w:pPr>
+      <w:r>
+        <w:rPr>
+          <w:rFonts w:ascii="Arial" w:eastAsia="Arial" w:hAnsi="Arial" w:cs="Arial"/>
           <w:b/>
           <w:bCs/>
           <w:color w:val="000000" w:themeColor="text1"/>
           <w:sz w:val="26"/>
           <w:szCs w:val="26"/>
         </w:rPr>
-      </w:pPr>
-    </w:p>
-    <w:p>
-      <w:pPr>
-        <w:spacing w:after="0"/>
-        <w:rPr>
-          <w:rFonts w:ascii="Arial" w:hAnsi="Arial" w:eastAsia="Arial" w:cs="Arial"/>
-          <w:b/>
-          <w:bCs/>
-          <w:color w:val="000000" w:themeColor="text1"/>
-          <w:sz w:val="26"/>
-          <w:szCs w:val="26"/>
-        </w:rPr>
-      </w:pPr>
-    </w:p>
-    <w:p>
-      <w:pPr>
-        <w:spacing w:after="0"/>
-        <w:rPr>
-          <w:rFonts w:ascii="Arial" w:hAnsi="Arial" w:eastAsia="Arial" w:cs="Arial"/>
-          <w:b/>
-          <w:bCs/>
-          <w:color w:val="000000" w:themeColor="text1"/>
-          <w:sz w:val="26"/>
-          <w:szCs w:val="26"/>
-        </w:rPr>
-      </w:pPr>
-    </w:p>
-    <w:p>
-      <w:pPr>
-        <w:spacing w:after="0"/>
-        <w:rPr>
-          <w:rFonts w:ascii="Arial" w:hAnsi="Arial" w:eastAsia="Arial" w:cs="Arial"/>
-          <w:b/>
-          <w:bCs/>
-          <w:color w:val="000000" w:themeColor="text1"/>
-          <w:sz w:val="26"/>
-          <w:szCs w:val="26"/>
-        </w:rPr>
-      </w:pPr>
-    </w:p>
-    <w:p>
-      <w:pPr>
-        <w:spacing w:after="0"/>
-        <w:rPr>
-          <w:rFonts w:ascii="Arial" w:hAnsi="Arial" w:eastAsia="Arial" w:cs="Arial"/>
-          <w:b/>
-          <w:bCs/>
-          <w:color w:val="000000" w:themeColor="text1"/>
-          <w:sz w:val="26"/>
-          <w:szCs w:val="26"/>
-        </w:rPr>
-      </w:pPr>
-    </w:p>
-    <w:p>
-      <w:pPr>
-        <w:spacing w:after="0"/>
-        <w:rPr>
-          <w:rFonts w:ascii="Arial" w:hAnsi="Arial" w:eastAsia="Arial" w:cs="Arial"/>
-          <w:b/>
-          <w:bCs/>
-          <w:color w:val="000000" w:themeColor="text1"/>
-          <w:sz w:val="26"/>
-          <w:szCs w:val="26"/>
-        </w:rPr>
-      </w:pPr>
-    </w:p>
-    <w:p>
-      <w:pPr>
-        <w:spacing w:after="0"/>
-        <w:rPr>
-          <w:rFonts w:ascii="Arial" w:hAnsi="Arial" w:eastAsia="Arial" w:cs="Arial"/>
-          <w:b/>
-          <w:bCs/>
-          <w:color w:val="000000" w:themeColor="text1"/>
-          <w:sz w:val="26"/>
-          <w:szCs w:val="26"/>
-        </w:rPr>
-      </w:pPr>
-    </w:p>
-    <w:p>
-      <w:pPr>
-        <w:spacing w:after="0"/>
-        <w:rPr>
-          <w:rFonts w:ascii="Arial" w:hAnsi="Arial" w:eastAsia="Arial" w:cs="Arial"/>
-          <w:b/>
-          <w:bCs/>
-          <w:color w:val="000000" w:themeColor="text1"/>
-          <w:sz w:val="26"/>
-          <w:szCs w:val="26"/>
-        </w:rPr>
-      </w:pPr>
-    </w:p>
-    <w:p>
-      <w:pPr>
-        <w:spacing w:after="0"/>
-        <w:rPr>
-          <w:rFonts w:ascii="Arial" w:hAnsi="Arial" w:eastAsia="Arial" w:cs="Arial"/>
-          <w:b/>
-          <w:bCs/>
-          <w:color w:val="000000" w:themeColor="text1"/>
-          <w:sz w:val="26"/>
-          <w:szCs w:val="26"/>
-        </w:rPr>
-      </w:pPr>
-    </w:p>
-    <w:p>
-      <w:pPr>
-        <w:spacing w:after="0"/>
-        <w:rPr>
-          <w:rFonts w:ascii="Arial" w:hAnsi="Arial" w:eastAsia="Arial" w:cs="Arial"/>
-          <w:b/>
-          <w:bCs/>
-          <w:color w:val="000000" w:themeColor="text1"/>
-          <w:sz w:val="26"/>
-          <w:szCs w:val="26"/>
-        </w:rPr>
-      </w:pPr>
-    </w:p>
-    <w:p>
-      <w:pPr>
-        <w:spacing w:after="0"/>
-      </w:pPr>
-      <w:r>
-        <w:rPr>
-          <w:rFonts w:ascii="Arial" w:hAnsi="Arial" w:eastAsia="Arial" w:cs="Arial"/>
-          <w:b/>
-          <w:bCs/>
-          <w:color w:val="000000" w:themeColor="text1"/>
-          <w:sz w:val="26"/>
-          <w:szCs w:val="26"/>
-        </w:rPr>
         <w:t>Ciudad vs pueblo</w:t>
       </w:r>
     </w:p>
@@ -702,7 +714,7 @@
       </w:pPr>
       <w:r>
         <w:rPr>
-          <w:rFonts w:ascii="Arial" w:hAnsi="Arial" w:eastAsia="Arial" w:cs="Arial"/>
+          <w:rFonts w:ascii="Arial" w:eastAsia="Arial" w:hAnsi="Arial" w:cs="Arial"/>
           <w:color w:val="000000" w:themeColor="text1"/>
           <w:sz w:val="22"/>
           <w:szCs w:val="22"/>
@@ -717,7 +729,7 @@
       </w:pPr>
       <w:r>
         <w:rPr>
-          <w:rFonts w:ascii="Arial" w:hAnsi="Arial" w:eastAsia="Arial" w:cs="Arial"/>
+          <w:rFonts w:ascii="Arial" w:eastAsia="Arial" w:hAnsi="Arial" w:cs="Arial"/>
           <w:b/>
           <w:bCs/>
           <w:color w:val="000000" w:themeColor="text1"/>
@@ -730,24 +742,24 @@
     <w:p/>
     <w:p>
       <w:pPr>
-        <w:pStyle w:val="Prrafodelista"/>
+        <w:pStyle w:val="ListParagraph"/>
         <w:numPr>
           <w:ilvl w:val="0"/>
-          <w:numId w:val="7"/>
+          <w:numId w:val="12"/>
         </w:numPr>
         <w:spacing w:before="220" w:after="220"/>
         <w:rPr>
-          <w:rFonts w:ascii="Arial" w:hAnsi="Arial" w:eastAsia="Arial" w:cs="Arial"/>
-          <w:b/>
-          <w:bCs/>
-          <w:color w:val="000000" w:themeColor="text1"/>
-          <w:sz w:val="22"/>
-          <w:szCs w:val="22"/>
-        </w:rPr>
-      </w:pPr>
-      <w:r>
-        <w:rPr>
-          <w:rFonts w:ascii="Arial" w:hAnsi="Arial" w:eastAsia="Arial" w:cs="Arial"/>
+          <w:rFonts w:ascii="Arial" w:eastAsia="Arial" w:hAnsi="Arial" w:cs="Arial"/>
+          <w:b/>
+          <w:bCs/>
+          <w:color w:val="000000" w:themeColor="text1"/>
+          <w:sz w:val="22"/>
+          <w:szCs w:val="22"/>
+        </w:rPr>
+      </w:pPr>
+      <w:r>
+        <w:rPr>
+          <w:rFonts w:ascii="Arial" w:eastAsia="Arial" w:hAnsi="Arial" w:cs="Arial"/>
           <w:b/>
           <w:bCs/>
           <w:color w:val="000000" w:themeColor="text1"/>
@@ -765,8 +777,8 @@
       <w:hyperlink r:id="rId7">
         <w:r>
           <w:rPr>
-            <w:rStyle w:val="Hipervnculo"/>
-            <w:rFonts w:ascii="Arial" w:hAnsi="Arial" w:eastAsia="Arial" w:cs="Arial"/>
+            <w:rStyle w:val="Hyperlink"/>
+            <w:rFonts w:ascii="Arial" w:eastAsia="Arial" w:hAnsi="Arial" w:cs="Arial"/>
             <w:b/>
             <w:bCs/>
             <w:color w:val="1155CC"/>
@@ -780,22 +792,22 @@
     </w:p>
     <w:p>
       <w:pPr>
-        <w:pStyle w:val="Prrafodelista"/>
+        <w:pStyle w:val="ListParagraph"/>
         <w:numPr>
           <w:ilvl w:val="0"/>
-          <w:numId w:val="6"/>
+          <w:numId w:val="9"/>
         </w:numPr>
         <w:spacing w:before="220" w:after="220"/>
         <w:rPr>
-          <w:rFonts w:ascii="Arial" w:hAnsi="Arial" w:eastAsia="Arial" w:cs="Arial"/>
-          <w:color w:val="000000" w:themeColor="text1"/>
-          <w:sz w:val="22"/>
-          <w:szCs w:val="22"/>
-        </w:rPr>
-      </w:pPr>
-      <w:r>
-        <w:rPr>
-          <w:rFonts w:ascii="Arial" w:hAnsi="Arial" w:eastAsia="Arial" w:cs="Arial"/>
+          <w:rFonts w:ascii="Arial" w:eastAsia="Arial" w:hAnsi="Arial" w:cs="Arial"/>
+          <w:color w:val="000000" w:themeColor="text1"/>
+          <w:sz w:val="22"/>
+          <w:szCs w:val="22"/>
+        </w:rPr>
+      </w:pPr>
+      <w:r>
+        <w:rPr>
+          <w:rFonts w:ascii="Arial" w:eastAsia="Arial" w:hAnsi="Arial" w:cs="Arial"/>
           <w:b/>
           <w:bCs/>
           <w:color w:val="000000" w:themeColor="text1"/>
@@ -806,7 +818,7 @@
       </w:r>
       <w:r>
         <w:rPr>
-          <w:rFonts w:ascii="Arial" w:hAnsi="Arial" w:eastAsia="Arial" w:cs="Arial"/>
+          <w:rFonts w:ascii="Arial" w:eastAsia="Arial" w:hAnsi="Arial" w:cs="Arial"/>
           <w:color w:val="000000" w:themeColor="text1"/>
           <w:sz w:val="22"/>
           <w:szCs w:val="22"/>
@@ -816,22 +828,22 @@
     </w:p>
     <w:p>
       <w:pPr>
-        <w:pStyle w:val="Prrafodelista"/>
+        <w:pStyle w:val="ListParagraph"/>
         <w:numPr>
           <w:ilvl w:val="0"/>
-          <w:numId w:val="6"/>
+          <w:numId w:val="9"/>
         </w:numPr>
         <w:spacing w:before="220" w:after="220"/>
         <w:rPr>
-          <w:rFonts w:ascii="Arial" w:hAnsi="Arial" w:eastAsia="Arial" w:cs="Arial"/>
-          <w:color w:val="000000" w:themeColor="text1"/>
-          <w:sz w:val="22"/>
-          <w:szCs w:val="22"/>
-        </w:rPr>
-      </w:pPr>
-      <w:r>
-        <w:rPr>
-          <w:rFonts w:ascii="Arial" w:hAnsi="Arial" w:eastAsia="Arial" w:cs="Arial"/>
+          <w:rFonts w:ascii="Arial" w:eastAsia="Arial" w:hAnsi="Arial" w:cs="Arial"/>
+          <w:color w:val="000000" w:themeColor="text1"/>
+          <w:sz w:val="22"/>
+          <w:szCs w:val="22"/>
+        </w:rPr>
+      </w:pPr>
+      <w:r>
+        <w:rPr>
+          <w:rFonts w:ascii="Arial" w:eastAsia="Arial" w:hAnsi="Arial" w:cs="Arial"/>
           <w:b/>
           <w:bCs/>
           <w:color w:val="000000" w:themeColor="text1"/>
@@ -842,7 +854,7 @@
       </w:r>
       <w:r>
         <w:rPr>
-          <w:rFonts w:ascii="Arial" w:hAnsi="Arial" w:eastAsia="Arial" w:cs="Arial"/>
+          <w:rFonts w:ascii="Arial" w:eastAsia="Arial" w:hAnsi="Arial" w:cs="Arial"/>
           <w:color w:val="000000" w:themeColor="text1"/>
           <w:sz w:val="22"/>
           <w:szCs w:val="22"/>
@@ -852,24 +864,24 @@
     </w:p>
     <w:p>
       <w:pPr>
-        <w:pStyle w:val="Prrafodelista"/>
+        <w:pStyle w:val="ListParagraph"/>
         <w:numPr>
           <w:ilvl w:val="0"/>
-          <w:numId w:val="6"/>
+          <w:numId w:val="9"/>
         </w:numPr>
         <w:spacing w:before="220" w:after="220"/>
         <w:rPr>
-          <w:rFonts w:ascii="Arial" w:hAnsi="Arial" w:eastAsia="Arial" w:cs="Arial"/>
-          <w:b/>
-          <w:bCs/>
-          <w:color w:val="000000" w:themeColor="text1"/>
-          <w:sz w:val="22"/>
-          <w:szCs w:val="22"/>
-        </w:rPr>
-      </w:pPr>
-      <w:r>
-        <w:rPr>
-          <w:rFonts w:ascii="Arial" w:hAnsi="Arial" w:eastAsia="Arial" w:cs="Arial"/>
+          <w:rFonts w:ascii="Arial" w:eastAsia="Arial" w:hAnsi="Arial" w:cs="Arial"/>
+          <w:b/>
+          <w:bCs/>
+          <w:color w:val="000000" w:themeColor="text1"/>
+          <w:sz w:val="22"/>
+          <w:szCs w:val="22"/>
+        </w:rPr>
+      </w:pPr>
+      <w:r>
+        <w:rPr>
+          <w:rFonts w:ascii="Arial" w:eastAsia="Arial" w:hAnsi="Arial" w:cs="Arial"/>
           <w:b/>
           <w:bCs/>
           <w:color w:val="000000" w:themeColor="text1"/>
@@ -881,22 +893,22 @@
     </w:p>
     <w:p>
       <w:pPr>
-        <w:pStyle w:val="Prrafodelista"/>
+        <w:pStyle w:val="ListParagraph"/>
         <w:numPr>
           <w:ilvl w:val="1"/>
-          <w:numId w:val="6"/>
+          <w:numId w:val="9"/>
         </w:numPr>
         <w:spacing w:before="220" w:after="220"/>
         <w:rPr>
-          <w:rFonts w:ascii="Arial" w:hAnsi="Arial" w:eastAsia="Arial" w:cs="Arial"/>
-          <w:color w:val="000000" w:themeColor="text1"/>
-          <w:sz w:val="22"/>
-          <w:szCs w:val="22"/>
-        </w:rPr>
-      </w:pPr>
-      <w:r>
-        <w:rPr>
-          <w:rFonts w:ascii="Arial" w:hAnsi="Arial" w:eastAsia="Arial" w:cs="Arial"/>
+          <w:rFonts w:ascii="Arial" w:eastAsia="Arial" w:hAnsi="Arial" w:cs="Arial"/>
+          <w:color w:val="000000" w:themeColor="text1"/>
+          <w:sz w:val="22"/>
+          <w:szCs w:val="22"/>
+        </w:rPr>
+      </w:pPr>
+      <w:r>
+        <w:rPr>
+          <w:rFonts w:ascii="Arial" w:eastAsia="Arial" w:hAnsi="Arial" w:cs="Arial"/>
           <w:b/>
           <w:bCs/>
           <w:color w:val="000000" w:themeColor="text1"/>
@@ -907,7 +919,7 @@
       </w:r>
       <w:r>
         <w:rPr>
-          <w:rFonts w:ascii="Arial" w:hAnsi="Arial" w:eastAsia="Arial" w:cs="Arial"/>
+          <w:rFonts w:ascii="Arial" w:eastAsia="Arial" w:hAnsi="Arial" w:cs="Arial"/>
           <w:color w:val="000000" w:themeColor="text1"/>
           <w:sz w:val="22"/>
           <w:szCs w:val="22"/>
@@ -917,22 +929,22 @@
     </w:p>
     <w:p>
       <w:pPr>
-        <w:pStyle w:val="Prrafodelista"/>
+        <w:pStyle w:val="ListParagraph"/>
         <w:numPr>
           <w:ilvl w:val="1"/>
-          <w:numId w:val="6"/>
+          <w:numId w:val="9"/>
         </w:numPr>
         <w:spacing w:before="220" w:after="220"/>
         <w:rPr>
-          <w:rFonts w:ascii="Arial" w:hAnsi="Arial" w:eastAsia="Arial" w:cs="Arial"/>
-          <w:color w:val="000000" w:themeColor="text1"/>
-          <w:sz w:val="22"/>
-          <w:szCs w:val="22"/>
-        </w:rPr>
-      </w:pPr>
-      <w:r>
-        <w:rPr>
-          <w:rFonts w:ascii="Arial" w:hAnsi="Arial" w:eastAsia="Arial" w:cs="Arial"/>
+          <w:rFonts w:ascii="Arial" w:eastAsia="Arial" w:hAnsi="Arial" w:cs="Arial"/>
+          <w:color w:val="000000" w:themeColor="text1"/>
+          <w:sz w:val="22"/>
+          <w:szCs w:val="22"/>
+        </w:rPr>
+      </w:pPr>
+      <w:r>
+        <w:rPr>
+          <w:rFonts w:ascii="Arial" w:eastAsia="Arial" w:hAnsi="Arial" w:cs="Arial"/>
           <w:b/>
           <w:bCs/>
           <w:color w:val="000000" w:themeColor="text1"/>
@@ -943,7 +955,7 @@
       </w:r>
       <w:r>
         <w:rPr>
-          <w:rFonts w:ascii="Arial" w:hAnsi="Arial" w:eastAsia="Arial" w:cs="Arial"/>
+          <w:rFonts w:ascii="Arial" w:eastAsia="Arial" w:hAnsi="Arial" w:cs="Arial"/>
           <w:color w:val="000000" w:themeColor="text1"/>
           <w:sz w:val="22"/>
           <w:szCs w:val="22"/>
@@ -953,22 +965,22 @@
     </w:p>
     <w:p>
       <w:pPr>
-        <w:pStyle w:val="Prrafodelista"/>
+        <w:pStyle w:val="ListParagraph"/>
         <w:numPr>
           <w:ilvl w:val="1"/>
-          <w:numId w:val="6"/>
+          <w:numId w:val="9"/>
         </w:numPr>
         <w:spacing w:before="220" w:after="220"/>
         <w:rPr>
-          <w:rFonts w:ascii="Arial" w:hAnsi="Arial" w:eastAsia="Arial" w:cs="Arial"/>
-          <w:color w:val="000000" w:themeColor="text1"/>
-          <w:sz w:val="22"/>
-          <w:szCs w:val="22"/>
-        </w:rPr>
-      </w:pPr>
-      <w:r>
-        <w:rPr>
-          <w:rFonts w:ascii="Arial" w:hAnsi="Arial" w:eastAsia="Arial" w:cs="Arial"/>
+          <w:rFonts w:ascii="Arial" w:eastAsia="Arial" w:hAnsi="Arial" w:cs="Arial"/>
+          <w:color w:val="000000" w:themeColor="text1"/>
+          <w:sz w:val="22"/>
+          <w:szCs w:val="22"/>
+        </w:rPr>
+      </w:pPr>
+      <w:r>
+        <w:rPr>
+          <w:rFonts w:ascii="Arial" w:eastAsia="Arial" w:hAnsi="Arial" w:cs="Arial"/>
           <w:b/>
           <w:bCs/>
           <w:color w:val="000000" w:themeColor="text1"/>
@@ -979,7 +991,7 @@
       </w:r>
       <w:r>
         <w:rPr>
-          <w:rFonts w:ascii="Arial" w:hAnsi="Arial" w:eastAsia="Arial" w:cs="Arial"/>
+          <w:rFonts w:ascii="Arial" w:eastAsia="Arial" w:hAnsi="Arial" w:cs="Arial"/>
           <w:color w:val="000000" w:themeColor="text1"/>
           <w:sz w:val="22"/>
           <w:szCs w:val="22"/>
@@ -989,22 +1001,22 @@
     </w:p>
     <w:p>
       <w:pPr>
-        <w:pStyle w:val="Prrafodelista"/>
+        <w:pStyle w:val="ListParagraph"/>
         <w:numPr>
           <w:ilvl w:val="1"/>
-          <w:numId w:val="6"/>
+          <w:numId w:val="9"/>
         </w:numPr>
         <w:spacing w:before="220" w:after="220"/>
         <w:rPr>
-          <w:rFonts w:ascii="Arial" w:hAnsi="Arial" w:eastAsia="Arial" w:cs="Arial"/>
-          <w:color w:val="000000" w:themeColor="text1"/>
-          <w:sz w:val="22"/>
-          <w:szCs w:val="22"/>
-        </w:rPr>
-      </w:pPr>
-      <w:r>
-        <w:rPr>
-          <w:rFonts w:ascii="Arial" w:hAnsi="Arial" w:eastAsia="Arial" w:cs="Arial"/>
+          <w:rFonts w:ascii="Arial" w:eastAsia="Arial" w:hAnsi="Arial" w:cs="Arial"/>
+          <w:color w:val="000000" w:themeColor="text1"/>
+          <w:sz w:val="22"/>
+          <w:szCs w:val="22"/>
+        </w:rPr>
+      </w:pPr>
+      <w:r>
+        <w:rPr>
+          <w:rFonts w:ascii="Arial" w:eastAsia="Arial" w:hAnsi="Arial" w:cs="Arial"/>
           <w:b/>
           <w:bCs/>
           <w:color w:val="000000" w:themeColor="text1"/>
@@ -1015,7 +1027,7 @@
       </w:r>
       <w:r>
         <w:rPr>
-          <w:rFonts w:ascii="Arial" w:hAnsi="Arial" w:eastAsia="Arial" w:cs="Arial"/>
+          <w:rFonts w:ascii="Arial" w:eastAsia="Arial" w:hAnsi="Arial" w:cs="Arial"/>
           <w:color w:val="000000" w:themeColor="text1"/>
           <w:sz w:val="22"/>
           <w:szCs w:val="22"/>
@@ -1025,22 +1037,22 @@
     </w:p>
     <w:p>
       <w:pPr>
-        <w:pStyle w:val="Prrafodelista"/>
+        <w:pStyle w:val="ListParagraph"/>
         <w:numPr>
           <w:ilvl w:val="1"/>
-          <w:numId w:val="6"/>
+          <w:numId w:val="9"/>
         </w:numPr>
         <w:spacing w:before="220" w:after="220"/>
         <w:rPr>
-          <w:rFonts w:ascii="Arial" w:hAnsi="Arial" w:eastAsia="Arial" w:cs="Arial"/>
-          <w:color w:val="000000" w:themeColor="text1"/>
-          <w:sz w:val="22"/>
-          <w:szCs w:val="22"/>
-        </w:rPr>
-      </w:pPr>
-      <w:r>
-        <w:rPr>
-          <w:rFonts w:ascii="Arial" w:hAnsi="Arial" w:eastAsia="Arial" w:cs="Arial"/>
+          <w:rFonts w:ascii="Arial" w:eastAsia="Arial" w:hAnsi="Arial" w:cs="Arial"/>
+          <w:color w:val="000000" w:themeColor="text1"/>
+          <w:sz w:val="22"/>
+          <w:szCs w:val="22"/>
+        </w:rPr>
+      </w:pPr>
+      <w:r>
+        <w:rPr>
+          <w:rFonts w:ascii="Arial" w:eastAsia="Arial" w:hAnsi="Arial" w:cs="Arial"/>
           <w:b/>
           <w:bCs/>
           <w:color w:val="000000" w:themeColor="text1"/>
@@ -1051,7 +1063,7 @@
       </w:r>
       <w:r>
         <w:rPr>
-          <w:rFonts w:ascii="Arial" w:hAnsi="Arial" w:eastAsia="Arial" w:cs="Arial"/>
+          <w:rFonts w:ascii="Arial" w:eastAsia="Arial" w:hAnsi="Arial" w:cs="Arial"/>
           <w:color w:val="000000" w:themeColor="text1"/>
           <w:sz w:val="22"/>
           <w:szCs w:val="22"/>
@@ -1061,22 +1073,22 @@
     </w:p>
     <w:p>
       <w:pPr>
-        <w:pStyle w:val="Prrafodelista"/>
+        <w:pStyle w:val="ListParagraph"/>
         <w:numPr>
           <w:ilvl w:val="1"/>
-          <w:numId w:val="6"/>
+          <w:numId w:val="9"/>
         </w:numPr>
         <w:spacing w:before="220" w:after="220"/>
         <w:rPr>
-          <w:rFonts w:ascii="Arial" w:hAnsi="Arial" w:eastAsia="Arial" w:cs="Arial"/>
-          <w:color w:val="000000" w:themeColor="text1"/>
-          <w:sz w:val="22"/>
-          <w:szCs w:val="22"/>
-        </w:rPr>
-      </w:pPr>
-      <w:r>
-        <w:rPr>
-          <w:rFonts w:ascii="Arial" w:hAnsi="Arial" w:eastAsia="Arial" w:cs="Arial"/>
+          <w:rFonts w:ascii="Arial" w:eastAsia="Arial" w:hAnsi="Arial" w:cs="Arial"/>
+          <w:color w:val="000000" w:themeColor="text1"/>
+          <w:sz w:val="22"/>
+          <w:szCs w:val="22"/>
+        </w:rPr>
+      </w:pPr>
+      <w:r>
+        <w:rPr>
+          <w:rFonts w:ascii="Arial" w:eastAsia="Arial" w:hAnsi="Arial" w:cs="Arial"/>
           <w:b/>
           <w:bCs/>
           <w:color w:val="000000" w:themeColor="text1"/>
@@ -1087,7 +1099,7 @@
       </w:r>
       <w:r>
         <w:rPr>
-          <w:rFonts w:ascii="Arial" w:hAnsi="Arial" w:eastAsia="Arial" w:cs="Arial"/>
+          <w:rFonts w:ascii="Arial" w:eastAsia="Arial" w:hAnsi="Arial" w:cs="Arial"/>
           <w:color w:val="000000" w:themeColor="text1"/>
           <w:sz w:val="22"/>
           <w:szCs w:val="22"/>
@@ -1097,22 +1109,22 @@
     </w:p>
     <w:p>
       <w:pPr>
-        <w:pStyle w:val="Prrafodelista"/>
+        <w:pStyle w:val="ListParagraph"/>
         <w:numPr>
           <w:ilvl w:val="1"/>
-          <w:numId w:val="6"/>
+          <w:numId w:val="9"/>
         </w:numPr>
         <w:spacing w:before="220" w:after="220"/>
         <w:rPr>
-          <w:rFonts w:ascii="Arial" w:hAnsi="Arial" w:eastAsia="Arial" w:cs="Arial"/>
-          <w:color w:val="000000" w:themeColor="text1"/>
-          <w:sz w:val="22"/>
-          <w:szCs w:val="22"/>
-        </w:rPr>
-      </w:pPr>
-      <w:r>
-        <w:rPr>
-          <w:rFonts w:ascii="Arial" w:hAnsi="Arial" w:eastAsia="Arial" w:cs="Arial"/>
+          <w:rFonts w:ascii="Arial" w:eastAsia="Arial" w:hAnsi="Arial" w:cs="Arial"/>
+          <w:color w:val="000000" w:themeColor="text1"/>
+          <w:sz w:val="22"/>
+          <w:szCs w:val="22"/>
+        </w:rPr>
+      </w:pPr>
+      <w:r>
+        <w:rPr>
+          <w:rFonts w:ascii="Arial" w:eastAsia="Arial" w:hAnsi="Arial" w:cs="Arial"/>
           <w:b/>
           <w:bCs/>
           <w:color w:val="000000" w:themeColor="text1"/>
@@ -1123,7 +1135,7 @@
       </w:r>
       <w:r>
         <w:rPr>
-          <w:rFonts w:ascii="Arial" w:hAnsi="Arial" w:eastAsia="Arial" w:cs="Arial"/>
+          <w:rFonts w:ascii="Arial" w:eastAsia="Arial" w:hAnsi="Arial" w:cs="Arial"/>
           <w:color w:val="000000" w:themeColor="text1"/>
           <w:sz w:val="22"/>
           <w:szCs w:val="22"/>
@@ -1133,34 +1145,33 @@
     </w:p>
     <w:p>
       <w:pPr>
-        <w:pStyle w:val="Prrafodelista"/>
+        <w:pStyle w:val="ListParagraph"/>
         <w:numPr>
           <w:ilvl w:val="0"/>
-          <w:numId w:val="6"/>
+          <w:numId w:val="9"/>
         </w:numPr>
         <w:spacing w:before="220" w:after="220"/>
         <w:rPr>
-          <w:rFonts w:ascii="Arial" w:hAnsi="Arial" w:eastAsia="Arial" w:cs="Arial"/>
-          <w:color w:val="000000" w:themeColor="text1"/>
-          <w:sz w:val="22"/>
-          <w:szCs w:val="22"/>
-        </w:rPr>
-      </w:pPr>
-      <w:r>
-        <w:rPr>
-          <w:rFonts w:ascii="Arial" w:hAnsi="Arial" w:eastAsia="Arial" w:cs="Arial"/>
-          <w:b/>
-          <w:bCs/>
-          <w:color w:val="000000" w:themeColor="text1"/>
-          <w:sz w:val="22"/>
-          <w:szCs w:val="22"/>
-        </w:rPr>
-        <w:lastRenderedPageBreak/>
+          <w:rFonts w:ascii="Arial" w:eastAsia="Arial" w:hAnsi="Arial" w:cs="Arial"/>
+          <w:color w:val="000000" w:themeColor="text1"/>
+          <w:sz w:val="22"/>
+          <w:szCs w:val="22"/>
+        </w:rPr>
+      </w:pPr>
+      <w:r>
+        <w:rPr>
+          <w:rFonts w:ascii="Arial" w:eastAsia="Arial" w:hAnsi="Arial" w:cs="Arial"/>
+          <w:b/>
+          <w:bCs/>
+          <w:color w:val="000000" w:themeColor="text1"/>
+          <w:sz w:val="22"/>
+          <w:szCs w:val="22"/>
+        </w:rPr>
         <w:t xml:space="preserve">HAY datos faltantes: </w:t>
       </w:r>
       <w:r>
         <w:rPr>
-          <w:rFonts w:ascii="Arial" w:hAnsi="Arial" w:eastAsia="Arial" w:cs="Arial"/>
+          <w:rFonts w:ascii="Arial" w:eastAsia="Arial" w:hAnsi="Arial" w:cs="Arial"/>
           <w:color w:val="000000" w:themeColor="text1"/>
           <w:sz w:val="22"/>
           <w:szCs w:val="22"/>
@@ -1171,24 +1182,24 @@
     <w:p/>
     <w:p>
       <w:pPr>
-        <w:pStyle w:val="Prrafodelista"/>
+        <w:pStyle w:val="ListParagraph"/>
         <w:numPr>
           <w:ilvl w:val="0"/>
           <w:numId w:val="5"/>
         </w:numPr>
         <w:spacing w:before="220" w:after="220"/>
         <w:rPr>
-          <w:rFonts w:ascii="Arial" w:hAnsi="Arial" w:eastAsia="Arial" w:cs="Arial"/>
-          <w:b/>
-          <w:bCs/>
-          <w:color w:val="000000" w:themeColor="text1"/>
-          <w:sz w:val="22"/>
-          <w:szCs w:val="22"/>
-        </w:rPr>
-      </w:pPr>
-      <w:r>
-        <w:rPr>
-          <w:rFonts w:ascii="Arial" w:hAnsi="Arial" w:eastAsia="Arial" w:cs="Arial"/>
+          <w:rFonts w:ascii="Arial" w:eastAsia="Arial" w:hAnsi="Arial" w:cs="Arial"/>
+          <w:b/>
+          <w:bCs/>
+          <w:color w:val="000000" w:themeColor="text1"/>
+          <w:sz w:val="22"/>
+          <w:szCs w:val="22"/>
+        </w:rPr>
+      </w:pPr>
+      <w:r>
+        <w:rPr>
+          <w:rFonts w:ascii="Arial" w:eastAsia="Arial" w:hAnsi="Arial" w:cs="Arial"/>
           <w:b/>
           <w:bCs/>
           <w:color w:val="000000" w:themeColor="text1"/>
@@ -1206,8 +1217,8 @@
       <w:hyperlink r:id="rId8">
         <w:r>
           <w:rPr>
-            <w:rStyle w:val="Hipervnculo"/>
-            <w:rFonts w:ascii="Arial" w:hAnsi="Arial" w:eastAsia="Arial" w:cs="Arial"/>
+            <w:rStyle w:val="Hyperlink"/>
+            <w:rFonts w:ascii="Arial" w:eastAsia="Arial" w:hAnsi="Arial" w:cs="Arial"/>
             <w:b/>
             <w:bCs/>
             <w:color w:val="1155CC"/>
@@ -1220,7 +1231,7 @@
       </w:hyperlink>
       <w:r>
         <w:rPr>
-          <w:rFonts w:ascii="Arial" w:hAnsi="Arial" w:eastAsia="Arial" w:cs="Arial"/>
+          <w:rFonts w:ascii="Arial" w:eastAsia="Arial" w:hAnsi="Arial" w:cs="Arial"/>
           <w:b/>
           <w:bCs/>
           <w:color w:val="000000" w:themeColor="text1"/>
@@ -1237,7 +1248,7 @@
       </w:pPr>
       <w:r>
         <w:rPr>
-          <w:rFonts w:ascii="Arial" w:hAnsi="Arial" w:eastAsia="Arial" w:cs="Arial"/>
+          <w:rFonts w:ascii="Arial" w:eastAsia="Arial" w:hAnsi="Arial" w:cs="Arial"/>
           <w:color w:val="000000" w:themeColor="text1"/>
           <w:sz w:val="22"/>
           <w:szCs w:val="22"/>
@@ -1247,16 +1258,16 @@
     </w:p>
     <w:p>
       <w:pPr>
-        <w:pStyle w:val="Prrafodelista"/>
+        <w:pStyle w:val="ListParagraph"/>
         <w:numPr>
           <w:ilvl w:val="0"/>
-          <w:numId w:val="4"/>
+          <w:numId w:val="1"/>
         </w:numPr>
         <w:spacing w:before="220" w:after="220"/>
       </w:pPr>
       <w:r>
         <w:rPr>
-          <w:rFonts w:ascii="Arial" w:hAnsi="Arial" w:eastAsia="Arial" w:cs="Arial"/>
+          <w:rFonts w:ascii="Arial" w:eastAsia="Arial" w:hAnsi="Arial" w:cs="Arial"/>
           <w:color w:val="000000" w:themeColor="text1"/>
           <w:sz w:val="22"/>
           <w:szCs w:val="22"/>
@@ -1266,7 +1277,7 @@
     </w:p>
     <w:p>
       <w:pPr>
-        <w:pStyle w:val="Prrafodelista"/>
+        <w:pStyle w:val="ListParagraph"/>
         <w:numPr>
           <w:ilvl w:val="0"/>
           <w:numId w:val="3"/>
@@ -1275,7 +1286,7 @@
       </w:pPr>
       <w:r>
         <w:rPr>
-          <w:rFonts w:ascii="Arial" w:hAnsi="Arial" w:eastAsia="Arial" w:cs="Arial"/>
+          <w:rFonts w:ascii="Arial" w:eastAsia="Arial" w:hAnsi="Arial" w:cs="Arial"/>
           <w:b/>
           <w:bCs/>
           <w:color w:val="000000" w:themeColor="text1"/>
@@ -1286,7 +1297,7 @@
       </w:r>
       <w:r>
         <w:rPr>
-          <w:rFonts w:ascii="Arial" w:hAnsi="Arial" w:eastAsia="Arial" w:cs="Arial"/>
+          <w:rFonts w:ascii="Arial" w:eastAsia="Arial" w:hAnsi="Arial" w:cs="Arial"/>
           <w:color w:val="000000" w:themeColor="text1"/>
           <w:sz w:val="22"/>
           <w:szCs w:val="22"/>
@@ -1296,7 +1307,7 @@
     </w:p>
     <w:p>
       <w:pPr>
-        <w:pStyle w:val="Prrafodelista"/>
+        <w:pStyle w:val="ListParagraph"/>
         <w:numPr>
           <w:ilvl w:val="0"/>
           <w:numId w:val="3"/>
@@ -1305,7 +1316,7 @@
       </w:pPr>
       <w:r>
         <w:rPr>
-          <w:rFonts w:ascii="Arial" w:hAnsi="Arial" w:eastAsia="Arial" w:cs="Arial"/>
+          <w:rFonts w:ascii="Arial" w:eastAsia="Arial" w:hAnsi="Arial" w:cs="Arial"/>
           <w:b/>
           <w:bCs/>
           <w:color w:val="000000" w:themeColor="text1"/>
@@ -1316,7 +1327,7 @@
       </w:r>
       <w:r>
         <w:rPr>
-          <w:rFonts w:ascii="Arial" w:hAnsi="Arial" w:eastAsia="Arial" w:cs="Arial"/>
+          <w:rFonts w:ascii="Arial" w:eastAsia="Arial" w:hAnsi="Arial" w:cs="Arial"/>
           <w:color w:val="000000" w:themeColor="text1"/>
           <w:sz w:val="22"/>
           <w:szCs w:val="22"/>
@@ -1326,7 +1337,7 @@
     </w:p>
     <w:p>
       <w:pPr>
-        <w:pStyle w:val="Prrafodelista"/>
+        <w:pStyle w:val="ListParagraph"/>
         <w:numPr>
           <w:ilvl w:val="0"/>
           <w:numId w:val="3"/>
@@ -1335,7 +1346,7 @@
       </w:pPr>
       <w:r>
         <w:rPr>
-          <w:rFonts w:ascii="Arial" w:hAnsi="Arial" w:eastAsia="Arial" w:cs="Arial"/>
+          <w:rFonts w:ascii="Arial" w:eastAsia="Arial" w:hAnsi="Arial" w:cs="Arial"/>
           <w:b/>
           <w:bCs/>
           <w:color w:val="000000" w:themeColor="text1"/>
@@ -1346,7 +1357,7 @@
       </w:r>
       <w:r>
         <w:rPr>
-          <w:rFonts w:ascii="Arial" w:hAnsi="Arial" w:eastAsia="Arial" w:cs="Arial"/>
+          <w:rFonts w:ascii="Arial" w:eastAsia="Arial" w:hAnsi="Arial" w:cs="Arial"/>
           <w:color w:val="000000" w:themeColor="text1"/>
           <w:sz w:val="22"/>
           <w:szCs w:val="22"/>
@@ -1356,7 +1367,7 @@
     </w:p>
     <w:p>
       <w:pPr>
-        <w:pStyle w:val="Prrafodelista"/>
+        <w:pStyle w:val="ListParagraph"/>
         <w:numPr>
           <w:ilvl w:val="0"/>
           <w:numId w:val="3"/>
@@ -1365,7 +1376,7 @@
       </w:pPr>
       <w:r>
         <w:rPr>
-          <w:rFonts w:ascii="Arial" w:hAnsi="Arial" w:eastAsia="Arial" w:cs="Arial"/>
+          <w:rFonts w:ascii="Arial" w:eastAsia="Arial" w:hAnsi="Arial" w:cs="Arial"/>
           <w:color w:val="000000" w:themeColor="text1"/>
           <w:sz w:val="22"/>
           <w:szCs w:val="22"/>
@@ -1375,22 +1386,22 @@
     </w:p>
     <w:p>
       <w:pPr>
-        <w:pStyle w:val="Prrafodelista"/>
+        <w:pStyle w:val="ListParagraph"/>
         <w:numPr>
           <w:ilvl w:val="0"/>
           <w:numId w:val="3"/>
         </w:numPr>
         <w:spacing w:before="220" w:after="220"/>
         <w:rPr>
-          <w:rFonts w:ascii="Arial" w:hAnsi="Arial" w:eastAsia="Arial" w:cs="Arial"/>
-          <w:color w:val="000000" w:themeColor="text1"/>
-          <w:sz w:val="22"/>
-          <w:szCs w:val="22"/>
-        </w:rPr>
-      </w:pPr>
-      <w:r>
-        <w:rPr>
-          <w:rFonts w:ascii="Arial" w:hAnsi="Arial" w:eastAsia="Arial" w:cs="Arial"/>
+          <w:rFonts w:ascii="Arial" w:eastAsia="Arial" w:hAnsi="Arial" w:cs="Arial"/>
+          <w:color w:val="000000" w:themeColor="text1"/>
+          <w:sz w:val="22"/>
+          <w:szCs w:val="22"/>
+        </w:rPr>
+      </w:pPr>
+      <w:r>
+        <w:rPr>
+          <w:rFonts w:ascii="Arial" w:eastAsia="Arial" w:hAnsi="Arial" w:cs="Arial"/>
           <w:color w:val="000000" w:themeColor="text1"/>
           <w:sz w:val="22"/>
           <w:szCs w:val="22"/>
@@ -1401,24 +1412,24 @@
     <w:p/>
     <w:p>
       <w:pPr>
-        <w:pStyle w:val="Prrafodelista"/>
+        <w:pStyle w:val="ListParagraph"/>
         <w:numPr>
           <w:ilvl w:val="0"/>
-          <w:numId w:val="2"/>
+          <w:numId w:val="10"/>
         </w:numPr>
         <w:spacing w:before="220" w:after="220"/>
         <w:rPr>
-          <w:rFonts w:ascii="Arial" w:hAnsi="Arial" w:eastAsia="Arial" w:cs="Arial"/>
-          <w:b/>
-          <w:bCs/>
-          <w:color w:val="000000" w:themeColor="text1"/>
-          <w:sz w:val="22"/>
-          <w:szCs w:val="22"/>
-        </w:rPr>
-      </w:pPr>
-      <w:r>
-        <w:rPr>
-          <w:rFonts w:ascii="Arial" w:hAnsi="Arial" w:eastAsia="Arial" w:cs="Arial"/>
+          <w:rFonts w:ascii="Arial" w:eastAsia="Arial" w:hAnsi="Arial" w:cs="Arial"/>
+          <w:b/>
+          <w:bCs/>
+          <w:color w:val="000000" w:themeColor="text1"/>
+          <w:sz w:val="22"/>
+          <w:szCs w:val="22"/>
+        </w:rPr>
+      </w:pPr>
+      <w:r>
+        <w:rPr>
+          <w:rFonts w:ascii="Arial" w:eastAsia="Arial" w:hAnsi="Arial" w:cs="Arial"/>
           <w:b/>
           <w:bCs/>
           <w:color w:val="000000" w:themeColor="text1"/>
@@ -1429,7 +1440,7 @@
       </w:r>
       <w:r>
         <w:rPr>
-          <w:rFonts w:ascii="Arial" w:hAnsi="Arial" w:eastAsia="Arial" w:cs="Arial"/>
+          <w:rFonts w:ascii="Arial" w:eastAsia="Arial" w:hAnsi="Arial" w:cs="Arial"/>
           <w:b/>
           <w:bCs/>
           <w:color w:val="000000" w:themeColor="text1"/>
@@ -1447,8 +1458,8 @@
       <w:hyperlink r:id="rId9">
         <w:r>
           <w:rPr>
-            <w:rStyle w:val="Hipervnculo"/>
-            <w:rFonts w:ascii="Arial" w:hAnsi="Arial" w:eastAsia="Arial" w:cs="Arial"/>
+            <w:rStyle w:val="Hyperlink"/>
+            <w:rFonts w:ascii="Arial" w:eastAsia="Arial" w:hAnsi="Arial" w:cs="Arial"/>
             <w:b/>
             <w:bCs/>
             <w:color w:val="1155CC"/>
@@ -1461,7 +1472,7 @@
       </w:hyperlink>
       <w:r>
         <w:rPr>
-          <w:rFonts w:ascii="Arial" w:hAnsi="Arial" w:eastAsia="Arial" w:cs="Arial"/>
+          <w:rFonts w:ascii="Arial" w:eastAsia="Arial" w:hAnsi="Arial" w:cs="Arial"/>
           <w:b/>
           <w:bCs/>
           <w:color w:val="000000" w:themeColor="text1"/>
@@ -1478,7 +1489,7 @@
       </w:pPr>
       <w:r>
         <w:rPr>
-          <w:rFonts w:ascii="Arial" w:hAnsi="Arial" w:eastAsia="Arial" w:cs="Arial"/>
+          <w:rFonts w:ascii="Arial" w:eastAsia="Arial" w:hAnsi="Arial" w:cs="Arial"/>
           <w:b/>
           <w:bCs/>
           <w:color w:val="000000" w:themeColor="text1"/>
@@ -1489,7 +1500,7 @@
       </w:r>
       <w:r>
         <w:rPr>
-          <w:rFonts w:ascii="Arial" w:hAnsi="Arial" w:eastAsia="Arial" w:cs="Arial"/>
+          <w:rFonts w:ascii="Arial" w:eastAsia="Arial" w:hAnsi="Arial" w:cs="Arial"/>
           <w:color w:val="000000" w:themeColor="text1"/>
           <w:sz w:val="22"/>
           <w:szCs w:val="22"/>
@@ -1498,7 +1509,7 @@
       </w:r>
       <w:r>
         <w:rPr>
-          <w:rFonts w:ascii="Roboto" w:hAnsi="Roboto" w:eastAsia="Roboto" w:cs="Roboto"/>
+          <w:rFonts w:ascii="Roboto" w:eastAsia="Roboto" w:hAnsi="Roboto" w:cs="Roboto"/>
           <w:color w:val="212529"/>
           <w:sz w:val="22"/>
           <w:szCs w:val="22"/>
@@ -1513,7 +1524,7 @@
       </w:pPr>
       <w:r>
         <w:rPr>
-          <w:rFonts w:ascii="Roboto" w:hAnsi="Roboto" w:eastAsia="Roboto" w:cs="Roboto"/>
+          <w:rFonts w:ascii="Roboto" w:eastAsia="Roboto" w:hAnsi="Roboto" w:cs="Roboto"/>
           <w:b/>
           <w:bCs/>
           <w:color w:val="212529"/>
@@ -1524,7 +1535,7 @@
       </w:r>
       <w:r>
         <w:rPr>
-          <w:rFonts w:ascii="Roboto" w:hAnsi="Roboto" w:eastAsia="Roboto" w:cs="Roboto"/>
+          <w:rFonts w:ascii="Roboto" w:eastAsia="Roboto" w:hAnsi="Roboto" w:cs="Roboto"/>
           <w:color w:val="212529"/>
           <w:sz w:val="22"/>
           <w:szCs w:val="22"/>
@@ -1537,7 +1548,7 @@
         <w:spacing w:after="0"/>
         <w:ind w:left="720"/>
         <w:rPr>
-          <w:rFonts w:ascii="Roboto" w:hAnsi="Roboto" w:eastAsia="Roboto" w:cs="Roboto"/>
+          <w:rFonts w:ascii="Roboto" w:eastAsia="Roboto" w:hAnsi="Roboto" w:cs="Roboto"/>
           <w:color w:val="212529"/>
           <w:sz w:val="22"/>
           <w:szCs w:val="22"/>
@@ -1545,7 +1556,7 @@
       </w:pPr>
       <w:r>
         <w:rPr>
-          <w:rFonts w:ascii="Roboto" w:hAnsi="Roboto" w:eastAsia="Roboto" w:cs="Roboto"/>
+          <w:rFonts w:ascii="Roboto" w:eastAsia="Roboto" w:hAnsi="Roboto" w:cs="Roboto"/>
           <w:b/>
           <w:bCs/>
           <w:color w:val="212529"/>
@@ -1556,7 +1567,7 @@
       </w:r>
       <w:r>
         <w:rPr>
-          <w:rFonts w:ascii="Roboto" w:hAnsi="Roboto" w:eastAsia="Roboto" w:cs="Roboto"/>
+          <w:rFonts w:ascii="Roboto" w:eastAsia="Roboto" w:hAnsi="Roboto" w:cs="Roboto"/>
           <w:color w:val="212529"/>
           <w:sz w:val="22"/>
           <w:szCs w:val="22"/>
@@ -1575,7 +1586,7 @@
       </w:pPr>
       <w:r>
         <w:rPr>
-          <w:rFonts w:ascii="Roboto" w:hAnsi="Roboto" w:eastAsia="Roboto" w:cs="Roboto"/>
+          <w:rFonts w:ascii="Roboto" w:eastAsia="Roboto" w:hAnsi="Roboto" w:cs="Roboto"/>
           <w:color w:val="212529"/>
           <w:sz w:val="22"/>
           <w:szCs w:val="22"/>
@@ -1591,8 +1602,8 @@
       <w:hyperlink r:id="rId10">
         <w:r>
           <w:rPr>
-            <w:rStyle w:val="Hipervnculo"/>
-            <w:rFonts w:ascii="Roboto" w:hAnsi="Roboto" w:eastAsia="Roboto" w:cs="Roboto"/>
+            <w:rStyle w:val="Hyperlink"/>
+            <w:rFonts w:ascii="Roboto" w:eastAsia="Roboto" w:hAnsi="Roboto" w:cs="Roboto"/>
             <w:color w:val="1155CC"/>
             <w:sz w:val="22"/>
             <w:szCs w:val="22"/>
@@ -1609,7 +1620,7 @@
       </w:pPr>
       <w:r>
         <w:rPr>
-          <w:rFonts w:ascii="Arial" w:hAnsi="Arial" w:eastAsia="Arial" w:cs="Arial"/>
+          <w:rFonts w:ascii="Arial" w:eastAsia="Arial" w:hAnsi="Arial" w:cs="Arial"/>
           <w:b/>
           <w:bCs/>
           <w:color w:val="000000" w:themeColor="text1"/>
@@ -1620,7 +1631,7 @@
       </w:r>
       <w:r>
         <w:rPr>
-          <w:rFonts w:ascii="Arial" w:hAnsi="Arial" w:eastAsia="Arial" w:cs="Arial"/>
+          <w:rFonts w:ascii="Arial" w:eastAsia="Arial" w:hAnsi="Arial" w:cs="Arial"/>
           <w:color w:val="000000" w:themeColor="text1"/>
           <w:sz w:val="22"/>
           <w:szCs w:val="22"/>
@@ -1629,7 +1640,7 @@
       </w:r>
       <w:r>
         <w:rPr>
-          <w:rFonts w:ascii="Roboto" w:hAnsi="Roboto" w:eastAsia="Roboto" w:cs="Roboto"/>
+          <w:rFonts w:ascii="Roboto" w:eastAsia="Roboto" w:hAnsi="Roboto" w:cs="Roboto"/>
           <w:color w:val="212529"/>
           <w:sz w:val="22"/>
           <w:szCs w:val="22"/>
@@ -1644,7 +1655,7 @@
       </w:pPr>
       <w:r>
         <w:rPr>
-          <w:rFonts w:ascii="Roboto" w:hAnsi="Roboto" w:eastAsia="Roboto" w:cs="Roboto"/>
+          <w:rFonts w:ascii="Roboto" w:eastAsia="Roboto" w:hAnsi="Roboto" w:cs="Roboto"/>
           <w:b/>
           <w:bCs/>
           <w:color w:val="212529"/>
@@ -1655,7 +1666,7 @@
       </w:r>
       <w:r>
         <w:rPr>
-          <w:rFonts w:ascii="Roboto" w:hAnsi="Roboto" w:eastAsia="Roboto" w:cs="Roboto"/>
+          <w:rFonts w:ascii="Roboto" w:eastAsia="Roboto" w:hAnsi="Roboto" w:cs="Roboto"/>
           <w:color w:val="212529"/>
           <w:sz w:val="22"/>
           <w:szCs w:val="22"/>
@@ -1670,7 +1681,7 @@
       </w:pPr>
       <w:r>
         <w:rPr>
-          <w:rFonts w:ascii="Roboto" w:hAnsi="Roboto" w:eastAsia="Roboto" w:cs="Roboto"/>
+          <w:rFonts w:ascii="Roboto" w:eastAsia="Roboto" w:hAnsi="Roboto" w:cs="Roboto"/>
           <w:b/>
           <w:bCs/>
           <w:color w:val="212529"/>
@@ -1681,7 +1692,7 @@
       </w:r>
       <w:r>
         <w:rPr>
-          <w:rFonts w:ascii="Roboto" w:hAnsi="Roboto" w:eastAsia="Roboto" w:cs="Roboto"/>
+          <w:rFonts w:ascii="Roboto" w:eastAsia="Roboto" w:hAnsi="Roboto" w:cs="Roboto"/>
           <w:color w:val="212529"/>
           <w:sz w:val="22"/>
           <w:szCs w:val="22"/>
@@ -1697,12 +1708,11 @@
       </w:pPr>
       <w:r>
         <w:rPr>
-          <w:rFonts w:ascii="Arial" w:hAnsi="Arial" w:eastAsia="Arial" w:cs="Arial"/>
-          <w:color w:val="000000" w:themeColor="text1"/>
-          <w:sz w:val="22"/>
-          <w:szCs w:val="22"/>
-        </w:rPr>
-        <w:lastRenderedPageBreak/>
+          <w:rFonts w:ascii="Arial" w:eastAsia="Arial" w:hAnsi="Arial" w:cs="Arial"/>
+          <w:color w:val="000000" w:themeColor="text1"/>
+          <w:sz w:val="22"/>
+          <w:szCs w:val="22"/>
+        </w:rPr>
         <w:t>Todos los valores son absolutos (número de personas)</w:t>
       </w:r>
     </w:p>
@@ -1719,7 +1729,7 @@
       </w:pPr>
       <w:r>
         <w:rPr>
-          <w:rFonts w:ascii="Arial" w:hAnsi="Arial" w:eastAsia="Arial" w:cs="Arial"/>
+          <w:rFonts w:ascii="Arial" w:eastAsia="Arial" w:hAnsi="Arial" w:cs="Arial"/>
           <w:color w:val="000000" w:themeColor="text1"/>
           <w:sz w:val="22"/>
           <w:szCs w:val="22"/>
@@ -1730,24 +1740,24 @@
     <w:p/>
     <w:p>
       <w:pPr>
-        <w:pStyle w:val="Prrafodelista"/>
+        <w:pStyle w:val="ListParagraph"/>
         <w:numPr>
           <w:ilvl w:val="0"/>
-          <w:numId w:val="1"/>
+          <w:numId w:val="7"/>
         </w:numPr>
         <w:spacing w:before="220" w:after="220"/>
         <w:rPr>
-          <w:rFonts w:ascii="Arial" w:hAnsi="Arial" w:eastAsia="Arial" w:cs="Arial"/>
-          <w:b/>
-          <w:bCs/>
-          <w:color w:val="000000" w:themeColor="text1"/>
-          <w:sz w:val="22"/>
-          <w:szCs w:val="22"/>
-        </w:rPr>
-      </w:pPr>
-      <w:r>
-        <w:rPr>
-          <w:rFonts w:ascii="Arial" w:hAnsi="Arial" w:eastAsia="Arial" w:cs="Arial"/>
+          <w:rFonts w:ascii="Arial" w:eastAsia="Arial" w:hAnsi="Arial" w:cs="Arial"/>
+          <w:b/>
+          <w:bCs/>
+          <w:color w:val="000000" w:themeColor="text1"/>
+          <w:sz w:val="22"/>
+          <w:szCs w:val="22"/>
+        </w:rPr>
+      </w:pPr>
+      <w:r>
+        <w:rPr>
+          <w:rFonts w:ascii="Arial" w:eastAsia="Arial" w:hAnsi="Arial" w:cs="Arial"/>
           <w:b/>
           <w:bCs/>
           <w:color w:val="000000" w:themeColor="text1"/>
@@ -1767,8 +1777,8 @@
       <w:hyperlink r:id="rId11">
         <w:r>
           <w:rPr>
-            <w:rStyle w:val="Hipervnculo"/>
-            <w:rFonts w:ascii="Arial" w:hAnsi="Arial" w:eastAsia="Arial" w:cs="Arial"/>
+            <w:rStyle w:val="Hyperlink"/>
+            <w:rFonts w:ascii="Arial" w:eastAsia="Arial" w:hAnsi="Arial" w:cs="Arial"/>
             <w:b/>
             <w:bCs/>
             <w:color w:val="1155CC"/>
@@ -1787,7 +1797,7 @@
       </w:pPr>
       <w:r>
         <w:rPr>
-          <w:rFonts w:ascii="Arial" w:hAnsi="Arial" w:eastAsia="Arial" w:cs="Arial"/>
+          <w:rFonts w:ascii="Arial" w:eastAsia="Arial" w:hAnsi="Arial" w:cs="Arial"/>
           <w:b/>
           <w:bCs/>
           <w:color w:val="000000" w:themeColor="text1"/>
@@ -1798,7 +1808,7 @@
       </w:r>
       <w:r>
         <w:rPr>
-          <w:rFonts w:ascii="Arial" w:hAnsi="Arial" w:eastAsia="Arial" w:cs="Arial"/>
+          <w:rFonts w:ascii="Arial" w:eastAsia="Arial" w:hAnsi="Arial" w:cs="Arial"/>
           <w:color w:val="000000" w:themeColor="text1"/>
           <w:sz w:val="22"/>
           <w:szCs w:val="22"/>
@@ -1814,7 +1824,7 @@
       </w:pPr>
       <w:r>
         <w:rPr>
-          <w:rFonts w:ascii="Arial" w:hAnsi="Arial" w:eastAsia="Arial" w:cs="Arial"/>
+          <w:rFonts w:ascii="Arial" w:eastAsia="Arial" w:hAnsi="Arial" w:cs="Arial"/>
           <w:b/>
           <w:bCs/>
           <w:color w:val="000000" w:themeColor="text1"/>
@@ -1825,7 +1835,7 @@
       </w:r>
       <w:r>
         <w:rPr>
-          <w:rFonts w:ascii="Arial" w:hAnsi="Arial" w:eastAsia="Arial" w:cs="Arial"/>
+          <w:rFonts w:ascii="Arial" w:eastAsia="Arial" w:hAnsi="Arial" w:cs="Arial"/>
           <w:color w:val="000000" w:themeColor="text1"/>
           <w:sz w:val="22"/>
           <w:szCs w:val="22"/>
@@ -1841,7 +1851,7 @@
       </w:pPr>
       <w:r>
         <w:rPr>
-          <w:rFonts w:ascii="Arial" w:hAnsi="Arial" w:eastAsia="Arial" w:cs="Arial"/>
+          <w:rFonts w:ascii="Arial" w:eastAsia="Arial" w:hAnsi="Arial" w:cs="Arial"/>
           <w:b/>
           <w:bCs/>
           <w:color w:val="000000" w:themeColor="text1"/>
@@ -1852,7 +1862,7 @@
       </w:r>
       <w:r>
         <w:rPr>
-          <w:rFonts w:ascii="Arial" w:hAnsi="Arial" w:eastAsia="Arial" w:cs="Arial"/>
+          <w:rFonts w:ascii="Arial" w:eastAsia="Arial" w:hAnsi="Arial" w:cs="Arial"/>
           <w:color w:val="000000" w:themeColor="text1"/>
           <w:sz w:val="22"/>
           <w:szCs w:val="22"/>
@@ -1868,7 +1878,7 @@
       </w:pPr>
       <w:r>
         <w:rPr>
-          <w:rFonts w:ascii="Arial" w:hAnsi="Arial" w:eastAsia="Arial" w:cs="Arial"/>
+          <w:rFonts w:ascii="Arial" w:eastAsia="Arial" w:hAnsi="Arial" w:cs="Arial"/>
           <w:b/>
           <w:bCs/>
           <w:color w:val="000000" w:themeColor="text1"/>
@@ -1879,7 +1889,7 @@
       </w:r>
       <w:r>
         <w:rPr>
-          <w:rFonts w:ascii="Arial" w:hAnsi="Arial" w:eastAsia="Arial" w:cs="Arial"/>
+          <w:rFonts w:ascii="Arial" w:eastAsia="Arial" w:hAnsi="Arial" w:cs="Arial"/>
           <w:color w:val="000000" w:themeColor="text1"/>
           <w:sz w:val="22"/>
           <w:szCs w:val="22"/>
@@ -1888,7 +1898,7 @@
       </w:r>
       <w:r>
         <w:rPr>
-          <w:rFonts w:ascii="Arial" w:hAnsi="Arial" w:eastAsia="Arial" w:cs="Arial"/>
+          <w:rFonts w:ascii="Arial" w:eastAsia="Arial" w:hAnsi="Arial" w:cs="Arial"/>
           <w:i/>
           <w:iCs/>
           <w:color w:val="000000" w:themeColor="text1"/>
@@ -1899,7 +1909,7 @@
       </w:r>
       <w:r>
         <w:rPr>
-          <w:rFonts w:ascii="Arial" w:hAnsi="Arial" w:eastAsia="Arial" w:cs="Arial"/>
+          <w:rFonts w:ascii="Arial" w:eastAsia="Arial" w:hAnsi="Arial" w:cs="Arial"/>
           <w:color w:val="000000" w:themeColor="text1"/>
           <w:sz w:val="22"/>
           <w:szCs w:val="22"/>
@@ -1915,7 +1925,7 @@
       </w:pPr>
       <w:r>
         <w:rPr>
-          <w:rFonts w:ascii="Arial" w:hAnsi="Arial" w:eastAsia="Arial" w:cs="Arial"/>
+          <w:rFonts w:ascii="Arial" w:eastAsia="Arial" w:hAnsi="Arial" w:cs="Arial"/>
           <w:b/>
           <w:bCs/>
           <w:color w:val="000000" w:themeColor="text1"/>
@@ -1926,7 +1936,7 @@
       </w:r>
       <w:r>
         <w:rPr>
-          <w:rFonts w:ascii="Arial" w:hAnsi="Arial" w:eastAsia="Arial" w:cs="Arial"/>
+          <w:rFonts w:ascii="Arial" w:eastAsia="Arial" w:hAnsi="Arial" w:cs="Arial"/>
           <w:color w:val="000000" w:themeColor="text1"/>
           <w:sz w:val="22"/>
           <w:szCs w:val="22"/>
@@ -1943,8 +1953,8 @@
       <w:hyperlink r:id="rId12">
         <w:r>
           <w:rPr>
-            <w:rStyle w:val="Hipervnculo"/>
-            <w:rFonts w:ascii="Arial" w:hAnsi="Arial" w:eastAsia="Arial" w:cs="Arial"/>
+            <w:rStyle w:val="Hyperlink"/>
+            <w:rFonts w:ascii="Arial" w:eastAsia="Arial" w:hAnsi="Arial" w:cs="Arial"/>
             <w:b/>
             <w:bCs/>
             <w:color w:val="1155CC"/>
@@ -1963,7 +1973,7 @@
       </w:pPr>
       <w:r>
         <w:rPr>
-          <w:rFonts w:ascii="Arial" w:hAnsi="Arial" w:eastAsia="Arial" w:cs="Arial"/>
+          <w:rFonts w:ascii="Arial" w:eastAsia="Arial" w:hAnsi="Arial" w:cs="Arial"/>
           <w:color w:val="000000" w:themeColor="text1"/>
           <w:sz w:val="22"/>
           <w:szCs w:val="22"/>
@@ -1972,7 +1982,7 @@
       </w:r>
       <w:r>
         <w:rPr>
-          <w:rFonts w:ascii="Arial" w:hAnsi="Arial" w:eastAsia="Arial" w:cs="Arial"/>
+          <w:rFonts w:ascii="Arial" w:eastAsia="Arial" w:hAnsi="Arial" w:cs="Arial"/>
           <w:b/>
           <w:bCs/>
           <w:color w:val="000000" w:themeColor="text1"/>
@@ -1983,7 +1993,7 @@
       </w:r>
       <w:r>
         <w:rPr>
-          <w:rFonts w:ascii="Arial" w:hAnsi="Arial" w:eastAsia="Arial" w:cs="Arial"/>
+          <w:rFonts w:ascii="Arial" w:eastAsia="Arial" w:hAnsi="Arial" w:cs="Arial"/>
           <w:color w:val="000000" w:themeColor="text1"/>
           <w:sz w:val="22"/>
           <w:szCs w:val="22"/>
@@ -1998,7 +2008,7 @@
       </w:pPr>
       <w:r>
         <w:rPr>
-          <w:rFonts w:ascii="Arial" w:hAnsi="Arial" w:eastAsia="Arial" w:cs="Arial"/>
+          <w:rFonts w:ascii="Arial" w:eastAsia="Arial" w:hAnsi="Arial" w:cs="Arial"/>
           <w:b/>
           <w:bCs/>
           <w:color w:val="000000" w:themeColor="text1"/>
@@ -2009,7 +2019,7 @@
       </w:r>
       <w:r>
         <w:rPr>
-          <w:rFonts w:ascii="Arial" w:hAnsi="Arial" w:eastAsia="Arial" w:cs="Arial"/>
+          <w:rFonts w:ascii="Arial" w:eastAsia="Arial" w:hAnsi="Arial" w:cs="Arial"/>
           <w:color w:val="000000" w:themeColor="text1"/>
           <w:sz w:val="22"/>
           <w:szCs w:val="22"/>
@@ -2024,7 +2034,7 @@
       </w:pPr>
       <w:r>
         <w:rPr>
-          <w:rFonts w:ascii="Arial" w:hAnsi="Arial" w:eastAsia="Arial" w:cs="Arial"/>
+          <w:rFonts w:ascii="Arial" w:eastAsia="Arial" w:hAnsi="Arial" w:cs="Arial"/>
           <w:b/>
           <w:bCs/>
           <w:color w:val="000000" w:themeColor="text1"/>
@@ -2035,7 +2045,7 @@
       </w:r>
       <w:r>
         <w:rPr>
-          <w:rFonts w:ascii="Arial" w:hAnsi="Arial" w:eastAsia="Arial" w:cs="Arial"/>
+          <w:rFonts w:ascii="Arial" w:eastAsia="Arial" w:hAnsi="Arial" w:cs="Arial"/>
           <w:color w:val="000000" w:themeColor="text1"/>
           <w:sz w:val="22"/>
           <w:szCs w:val="22"/>
@@ -2050,7 +2060,7 @@
       </w:pPr>
       <w:r>
         <w:rPr>
-          <w:rFonts w:ascii="Arial" w:hAnsi="Arial" w:eastAsia="Arial" w:cs="Arial"/>
+          <w:rFonts w:ascii="Arial" w:eastAsia="Arial" w:hAnsi="Arial" w:cs="Arial"/>
           <w:b/>
           <w:bCs/>
           <w:color w:val="000000" w:themeColor="text1"/>
@@ -2061,7 +2071,7 @@
       </w:r>
       <w:r>
         <w:rPr>
-          <w:rFonts w:ascii="Arial" w:hAnsi="Arial" w:eastAsia="Arial" w:cs="Arial"/>
+          <w:rFonts w:ascii="Arial" w:eastAsia="Arial" w:hAnsi="Arial" w:cs="Arial"/>
           <w:color w:val="000000" w:themeColor="text1"/>
           <w:sz w:val="22"/>
           <w:szCs w:val="22"/>
@@ -2076,7 +2086,7 @@
       </w:pPr>
       <w:r>
         <w:rPr>
-          <w:rFonts w:ascii="Arial" w:hAnsi="Arial" w:eastAsia="Arial" w:cs="Arial"/>
+          <w:rFonts w:ascii="Arial" w:eastAsia="Arial" w:hAnsi="Arial" w:cs="Arial"/>
           <w:b/>
           <w:bCs/>
           <w:color w:val="000000" w:themeColor="text1"/>
@@ -2087,7 +2097,7 @@
       </w:r>
       <w:r>
         <w:rPr>
-          <w:rFonts w:ascii="Arial" w:hAnsi="Arial" w:eastAsia="Arial" w:cs="Arial"/>
+          <w:rFonts w:ascii="Arial" w:eastAsia="Arial" w:hAnsi="Arial" w:cs="Arial"/>
           <w:color w:val="000000" w:themeColor="text1"/>
           <w:sz w:val="22"/>
           <w:szCs w:val="22"/>
@@ -2102,7 +2112,7 @@
       </w:pPr>
       <w:r>
         <w:rPr>
-          <w:rFonts w:ascii="Arial" w:hAnsi="Arial" w:eastAsia="Arial" w:cs="Arial"/>
+          <w:rFonts w:ascii="Arial" w:eastAsia="Arial" w:hAnsi="Arial" w:cs="Arial"/>
           <w:b/>
           <w:bCs/>
           <w:color w:val="000000" w:themeColor="text1"/>
@@ -2121,8 +2131,8 @@
       <w:hyperlink r:id="rId13">
         <w:r>
           <w:rPr>
-            <w:rStyle w:val="Hipervnculo"/>
-            <w:rFonts w:ascii="Arial" w:hAnsi="Arial" w:eastAsia="Arial" w:cs="Arial"/>
+            <w:rStyle w:val="Hyperlink"/>
+            <w:rFonts w:ascii="Arial" w:eastAsia="Arial" w:hAnsi="Arial" w:cs="Arial"/>
             <w:b/>
             <w:bCs/>
             <w:color w:val="1155CC"/>
@@ -2141,7 +2151,7 @@
       </w:pPr>
       <w:r>
         <w:rPr>
-          <w:rFonts w:ascii="Arial" w:hAnsi="Arial" w:eastAsia="Arial" w:cs="Arial"/>
+          <w:rFonts w:ascii="Arial" w:eastAsia="Arial" w:hAnsi="Arial" w:cs="Arial"/>
           <w:b/>
           <w:bCs/>
           <w:color w:val="000000" w:themeColor="text1"/>
@@ -2152,7 +2162,7 @@
       </w:r>
       <w:r>
         <w:rPr>
-          <w:rFonts w:ascii="Arial" w:hAnsi="Arial" w:eastAsia="Arial" w:cs="Arial"/>
+          <w:rFonts w:ascii="Arial" w:eastAsia="Arial" w:hAnsi="Arial" w:cs="Arial"/>
           <w:color w:val="000000" w:themeColor="text1"/>
           <w:sz w:val="22"/>
           <w:szCs w:val="22"/>
@@ -2167,7 +2177,7 @@
       </w:pPr>
       <w:r>
         <w:rPr>
-          <w:rFonts w:ascii="Arial" w:hAnsi="Arial" w:eastAsia="Arial" w:cs="Arial"/>
+          <w:rFonts w:ascii="Arial" w:eastAsia="Arial" w:hAnsi="Arial" w:cs="Arial"/>
           <w:b/>
           <w:bCs/>
           <w:color w:val="000000" w:themeColor="text1"/>
@@ -2178,7 +2188,7 @@
       </w:r>
       <w:r>
         <w:rPr>
-          <w:rFonts w:ascii="Arial" w:hAnsi="Arial" w:eastAsia="Arial" w:cs="Arial"/>
+          <w:rFonts w:ascii="Arial" w:eastAsia="Arial" w:hAnsi="Arial" w:cs="Arial"/>
           <w:color w:val="000000" w:themeColor="text1"/>
           <w:sz w:val="22"/>
           <w:szCs w:val="22"/>
@@ -2193,19 +2203,18 @@
       </w:pPr>
       <w:r>
         <w:rPr>
-          <w:rFonts w:ascii="Arial" w:hAnsi="Arial" w:eastAsia="Arial" w:cs="Arial"/>
-          <w:b/>
-          <w:bCs/>
-          <w:color w:val="000000" w:themeColor="text1"/>
-          <w:sz w:val="22"/>
-          <w:szCs w:val="22"/>
-        </w:rPr>
-        <w:lastRenderedPageBreak/>
+          <w:rFonts w:ascii="Arial" w:eastAsia="Arial" w:hAnsi="Arial" w:cs="Arial"/>
+          <w:b/>
+          <w:bCs/>
+          <w:color w:val="000000" w:themeColor="text1"/>
+          <w:sz w:val="22"/>
+          <w:szCs w:val="22"/>
+        </w:rPr>
         <w:t xml:space="preserve">-Columnas (11): </w:t>
       </w:r>
       <w:r>
         <w:rPr>
-          <w:rFonts w:ascii="Arial" w:hAnsi="Arial" w:eastAsia="Arial" w:cs="Arial"/>
+          <w:rFonts w:ascii="Arial" w:eastAsia="Arial" w:hAnsi="Arial" w:cs="Arial"/>
           <w:color w:val="000000" w:themeColor="text1"/>
           <w:sz w:val="22"/>
           <w:szCs w:val="22"/>
@@ -2220,7 +2229,7 @@
       </w:pPr>
       <w:r>
         <w:rPr>
-          <w:rFonts w:ascii="Arial" w:hAnsi="Arial" w:eastAsia="Arial" w:cs="Arial"/>
+          <w:rFonts w:ascii="Arial" w:eastAsia="Arial" w:hAnsi="Arial" w:cs="Arial"/>
           <w:b/>
           <w:bCs/>
           <w:color w:val="000000" w:themeColor="text1"/>
@@ -2231,7 +2240,7 @@
       </w:r>
       <w:r>
         <w:rPr>
-          <w:rFonts w:ascii="Arial" w:hAnsi="Arial" w:eastAsia="Arial" w:cs="Arial"/>
+          <w:rFonts w:ascii="Arial" w:eastAsia="Arial" w:hAnsi="Arial" w:cs="Arial"/>
           <w:color w:val="000000" w:themeColor="text1"/>
           <w:sz w:val="22"/>
           <w:szCs w:val="22"/>
@@ -2246,7 +2255,7 @@
       </w:pPr>
       <w:r>
         <w:rPr>
-          <w:rFonts w:ascii="Arial" w:hAnsi="Arial" w:eastAsia="Arial" w:cs="Arial"/>
+          <w:rFonts w:ascii="Arial" w:eastAsia="Arial" w:hAnsi="Arial" w:cs="Arial"/>
           <w:b/>
           <w:bCs/>
           <w:color w:val="000000" w:themeColor="text1"/>
@@ -2257,7 +2266,7 @@
       </w:r>
       <w:r>
         <w:rPr>
-          <w:rFonts w:ascii="Arial" w:hAnsi="Arial" w:eastAsia="Arial" w:cs="Arial"/>
+          <w:rFonts w:ascii="Arial" w:eastAsia="Arial" w:hAnsi="Arial" w:cs="Arial"/>
           <w:color w:val="000000" w:themeColor="text1"/>
           <w:sz w:val="22"/>
           <w:szCs w:val="22"/>
@@ -2276,7 +2285,7 @@
       </w:pPr>
       <w:r>
         <w:rPr>
-          <w:rFonts w:ascii="Arial" w:hAnsi="Arial" w:eastAsia="Arial" w:cs="Arial"/>
+          <w:rFonts w:ascii="Arial" w:eastAsia="Arial" w:hAnsi="Arial" w:cs="Arial"/>
           <w:color w:val="000000" w:themeColor="text1"/>
           <w:sz w:val="22"/>
           <w:szCs w:val="22"/>
@@ -2292,7 +2301,7 @@
       </w:pPr>
       <w:r>
         <w:rPr>
-          <w:rFonts w:ascii="Arial" w:hAnsi="Arial" w:eastAsia="Arial" w:cs="Arial"/>
+          <w:rFonts w:ascii="Arial" w:eastAsia="Arial" w:hAnsi="Arial" w:cs="Arial"/>
           <w:color w:val="000000" w:themeColor="text1"/>
           <w:sz w:val="22"/>
           <w:szCs w:val="22"/>
@@ -2307,7 +2316,7 @@
       </w:pPr>
       <w:r>
         <w:rPr>
-          <w:rFonts w:ascii="Arial" w:hAnsi="Arial" w:eastAsia="Arial" w:cs="Arial"/>
+          <w:rFonts w:ascii="Arial" w:eastAsia="Arial" w:hAnsi="Arial" w:cs="Arial"/>
           <w:color w:val="000000" w:themeColor="text1"/>
           <w:sz w:val="22"/>
           <w:szCs w:val="22"/>
@@ -2323,7 +2332,7 @@
       </w:pPr>
       <w:r>
         <w:rPr>
-          <w:rFonts w:ascii="Arial" w:hAnsi="Arial" w:eastAsia="Arial" w:cs="Arial"/>
+          <w:rFonts w:ascii="Arial" w:eastAsia="Arial" w:hAnsi="Arial" w:cs="Arial"/>
           <w:color w:val="000000" w:themeColor="text1"/>
           <w:sz w:val="22"/>
           <w:szCs w:val="22"/>
@@ -2338,7 +2347,7 @@
       </w:pPr>
       <w:r>
         <w:rPr>
-          <w:rFonts w:ascii="Arial" w:hAnsi="Arial" w:eastAsia="Arial" w:cs="Arial"/>
+          <w:rFonts w:ascii="Arial" w:eastAsia="Arial" w:hAnsi="Arial" w:cs="Arial"/>
           <w:color w:val="000000" w:themeColor="text1"/>
           <w:sz w:val="22"/>
           <w:szCs w:val="22"/>
@@ -2351,7 +2360,7 @@
       </w:r>
       <w:r>
         <w:rPr>
-          <w:rFonts w:ascii="Arial" w:hAnsi="Arial" w:eastAsia="Arial" w:cs="Arial"/>
+          <w:rFonts w:ascii="Arial" w:eastAsia="Arial" w:hAnsi="Arial" w:cs="Arial"/>
           <w:color w:val="000000" w:themeColor="text1"/>
           <w:sz w:val="22"/>
           <w:szCs w:val="22"/>
@@ -2366,7 +2375,7 @@
       </w:pPr>
       <w:r>
         <w:rPr>
-          <w:rFonts w:ascii="Arial" w:hAnsi="Arial" w:eastAsia="Arial" w:cs="Arial"/>
+          <w:rFonts w:ascii="Arial" w:eastAsia="Arial" w:hAnsi="Arial" w:cs="Arial"/>
           <w:color w:val="000000" w:themeColor="text1"/>
           <w:sz w:val="22"/>
           <w:szCs w:val="22"/>
@@ -2381,7 +2390,7 @@
       </w:pPr>
       <w:r>
         <w:rPr>
-          <w:rFonts w:ascii="Arial" w:hAnsi="Arial" w:eastAsia="Arial" w:cs="Arial"/>
+          <w:rFonts w:ascii="Arial" w:eastAsia="Arial" w:hAnsi="Arial" w:cs="Arial"/>
           <w:color w:val="000000" w:themeColor="text1"/>
           <w:sz w:val="22"/>
           <w:szCs w:val="22"/>
@@ -2398,7 +2407,7 @@
       </w:pPr>
       <w:r>
         <w:rPr>
-          <w:rFonts w:ascii="Arial" w:hAnsi="Arial" w:eastAsia="Arial" w:cs="Arial"/>
+          <w:rFonts w:ascii="Arial" w:eastAsia="Arial" w:hAnsi="Arial" w:cs="Arial"/>
           <w:color w:val="000000" w:themeColor="text1"/>
           <w:sz w:val="22"/>
           <w:szCs w:val="22"/>
@@ -2413,7 +2422,7 @@
       </w:pPr>
       <w:r>
         <w:rPr>
-          <w:rFonts w:ascii="Arial" w:hAnsi="Arial" w:eastAsia="Arial" w:cs="Arial"/>
+          <w:rFonts w:ascii="Arial" w:eastAsia="Arial" w:hAnsi="Arial" w:cs="Arial"/>
           <w:color w:val="000000" w:themeColor="text1"/>
           <w:sz w:val="22"/>
           <w:szCs w:val="22"/>
@@ -2428,7 +2437,7 @@
       </w:pPr>
       <w:r>
         <w:rPr>
-          <w:rFonts w:ascii="Verdana" w:hAnsi="Verdana" w:eastAsia="Verdana" w:cs="Verdana"/>
+          <w:rFonts w:ascii="Verdana" w:eastAsia="Verdana" w:hAnsi="Verdana" w:cs="Verdana"/>
           <w:color w:val="000000" w:themeColor="text1"/>
           <w:sz w:val="22"/>
           <w:szCs w:val="22"/>
@@ -2448,7 +2457,7 @@
       </w:pPr>
       <w:r>
         <w:rPr>
-          <w:rFonts w:ascii="Verdana" w:hAnsi="Verdana" w:eastAsia="Verdana" w:cs="Verdana"/>
+          <w:rFonts w:ascii="Verdana" w:eastAsia="Verdana" w:hAnsi="Verdana" w:cs="Verdana"/>
           <w:color w:val="000000" w:themeColor="text1"/>
           <w:sz w:val="22"/>
           <w:szCs w:val="22"/>
@@ -2457,7 +2466,7 @@
       </w:r>
       <w:r>
         <w:rPr>
-          <w:rFonts w:ascii="Verdana" w:hAnsi="Verdana" w:eastAsia="Verdana" w:cs="Verdana"/>
+          <w:rFonts w:ascii="Verdana" w:eastAsia="Verdana" w:hAnsi="Verdana" w:cs="Verdana"/>
           <w:color w:val="000000" w:themeColor="text1"/>
           <w:sz w:val="22"/>
           <w:szCs w:val="22"/>
@@ -2466,7 +2475,7 @@
       </w:r>
       <w:r>
         <w:rPr>
-          <w:rFonts w:ascii="Verdana" w:hAnsi="Verdana" w:eastAsia="Verdana" w:cs="Verdana"/>
+          <w:rFonts w:ascii="Verdana" w:eastAsia="Verdana" w:hAnsi="Verdana" w:cs="Verdana"/>
           <w:color w:val="000000" w:themeColor="text1"/>
           <w:sz w:val="22"/>
           <w:szCs w:val="22"/>
@@ -2475,7 +2484,7 @@
       </w:r>
       <w:r>
         <w:rPr>
-          <w:rFonts w:ascii="Verdana" w:hAnsi="Verdana" w:eastAsia="Verdana" w:cs="Verdana"/>
+          <w:rFonts w:ascii="Verdana" w:eastAsia="Verdana" w:hAnsi="Verdana" w:cs="Verdana"/>
           <w:color w:val="000000" w:themeColor="text1"/>
           <w:sz w:val="22"/>
           <w:szCs w:val="22"/>
@@ -2484,7 +2493,7 @@
       </w:r>
       <w:r>
         <w:rPr>
-          <w:rFonts w:ascii="Verdana" w:hAnsi="Verdana" w:eastAsia="Verdana" w:cs="Verdana"/>
+          <w:rFonts w:ascii="Verdana" w:eastAsia="Verdana" w:hAnsi="Verdana" w:cs="Verdana"/>
           <w:color w:val="000000" w:themeColor="text1"/>
           <w:sz w:val="22"/>
           <w:szCs w:val="22"/>
@@ -2493,7 +2502,7 @@
       </w:r>
       <w:r>
         <w:rPr>
-          <w:rFonts w:ascii="Verdana" w:hAnsi="Verdana" w:eastAsia="Verdana" w:cs="Verdana"/>
+          <w:rFonts w:ascii="Verdana" w:eastAsia="Verdana" w:hAnsi="Verdana" w:cs="Verdana"/>
           <w:color w:val="000000" w:themeColor="text1"/>
           <w:sz w:val="22"/>
           <w:szCs w:val="22"/>
@@ -2502,7 +2511,7 @@
       </w:r>
       <w:r>
         <w:rPr>
-          <w:rFonts w:ascii="Verdana" w:hAnsi="Verdana" w:eastAsia="Verdana" w:cs="Verdana"/>
+          <w:rFonts w:ascii="Verdana" w:eastAsia="Verdana" w:hAnsi="Verdana" w:cs="Verdana"/>
           <w:color w:val="000000" w:themeColor="text1"/>
           <w:sz w:val="22"/>
           <w:szCs w:val="22"/>
@@ -2511,7 +2520,7 @@
       </w:r>
       <w:r>
         <w:rPr>
-          <w:rFonts w:ascii="Verdana" w:hAnsi="Verdana" w:eastAsia="Verdana" w:cs="Verdana"/>
+          <w:rFonts w:ascii="Verdana" w:eastAsia="Verdana" w:hAnsi="Verdana" w:cs="Verdana"/>
           <w:sz w:val="22"/>
           <w:szCs w:val="22"/>
         </w:rPr>
@@ -2519,7 +2528,7 @@
       </w:r>
       <w:r>
         <w:rPr>
-          <w:rFonts w:ascii="Verdana" w:hAnsi="Verdana" w:eastAsia="Verdana" w:cs="Verdana"/>
+          <w:rFonts w:ascii="Verdana" w:eastAsia="Verdana" w:hAnsi="Verdana" w:cs="Verdana"/>
           <w:sz w:val="22"/>
           <w:szCs w:val="22"/>
         </w:rPr>
@@ -2527,7 +2536,7 @@
       </w:r>
       <w:r>
         <w:rPr>
-          <w:rFonts w:ascii="Verdana" w:hAnsi="Verdana" w:eastAsia="Verdana" w:cs="Verdana"/>
+          <w:rFonts w:ascii="Verdana" w:eastAsia="Verdana" w:hAnsi="Verdana" w:cs="Verdana"/>
           <w:color w:val="000000" w:themeColor="text1"/>
           <w:sz w:val="22"/>
           <w:szCs w:val="22"/>
@@ -2536,7 +2545,7 @@
       </w:r>
       <w:r>
         <w:rPr>
-          <w:rFonts w:ascii="Verdana" w:hAnsi="Verdana" w:eastAsia="Verdana" w:cs="Verdana"/>
+          <w:rFonts w:ascii="Verdana" w:eastAsia="Verdana" w:hAnsi="Verdana" w:cs="Verdana"/>
           <w:color w:val="000000" w:themeColor="text1"/>
           <w:sz w:val="22"/>
           <w:szCs w:val="22"/>
@@ -2545,7 +2554,7 @@
       </w:r>
       <w:r>
         <w:rPr>
-          <w:rFonts w:ascii="Verdana" w:hAnsi="Verdana" w:eastAsia="Verdana" w:cs="Verdana"/>
+          <w:rFonts w:ascii="Verdana" w:eastAsia="Verdana" w:hAnsi="Verdana" w:cs="Verdana"/>
           <w:color w:val="000000" w:themeColor="text1"/>
           <w:sz w:val="22"/>
           <w:szCs w:val="22"/>
@@ -2554,7 +2563,7 @@
       </w:r>
       <w:r>
         <w:rPr>
-          <w:rFonts w:ascii="Verdana" w:hAnsi="Verdana" w:eastAsia="Verdana" w:cs="Verdana"/>
+          <w:rFonts w:ascii="Verdana" w:eastAsia="Verdana" w:hAnsi="Verdana" w:cs="Verdana"/>
           <w:color w:val="000000" w:themeColor="text1"/>
           <w:sz w:val="22"/>
           <w:szCs w:val="22"/>
@@ -2563,7 +2572,7 @@
       </w:r>
       <w:r>
         <w:rPr>
-          <w:rFonts w:ascii="Verdana" w:hAnsi="Verdana" w:eastAsia="Verdana" w:cs="Verdana"/>
+          <w:rFonts w:ascii="Verdana" w:eastAsia="Verdana" w:hAnsi="Verdana" w:cs="Verdana"/>
           <w:sz w:val="22"/>
           <w:szCs w:val="22"/>
         </w:rPr>
@@ -2571,7 +2580,7 @@
       </w:r>
       <w:r>
         <w:rPr>
-          <w:rFonts w:ascii="Verdana" w:hAnsi="Verdana" w:eastAsia="Verdana" w:cs="Verdana"/>
+          <w:rFonts w:ascii="Verdana" w:eastAsia="Verdana" w:hAnsi="Verdana" w:cs="Verdana"/>
           <w:color w:val="000000" w:themeColor="text1"/>
           <w:sz w:val="22"/>
           <w:szCs w:val="22"/>
@@ -2580,7 +2589,7 @@
       </w:r>
       <w:r>
         <w:rPr>
-          <w:rFonts w:ascii="Verdana" w:hAnsi="Verdana" w:eastAsia="Verdana" w:cs="Verdana"/>
+          <w:rFonts w:ascii="Verdana" w:eastAsia="Verdana" w:hAnsi="Verdana" w:cs="Verdana"/>
           <w:color w:val="000000" w:themeColor="text1"/>
           <w:sz w:val="22"/>
           <w:szCs w:val="22"/>
@@ -2589,7 +2598,7 @@
       </w:r>
       <w:r>
         <w:rPr>
-          <w:rFonts w:ascii="Verdana" w:hAnsi="Verdana" w:eastAsia="Verdana" w:cs="Verdana"/>
+          <w:rFonts w:ascii="Verdana" w:eastAsia="Verdana" w:hAnsi="Verdana" w:cs="Verdana"/>
           <w:color w:val="000000" w:themeColor="text1"/>
           <w:sz w:val="22"/>
           <w:szCs w:val="22"/>
@@ -2598,7 +2607,7 @@
       </w:r>
       <w:r>
         <w:rPr>
-          <w:rFonts w:ascii="Verdana" w:hAnsi="Verdana" w:eastAsia="Verdana" w:cs="Verdana"/>
+          <w:rFonts w:ascii="Verdana" w:eastAsia="Verdana" w:hAnsi="Verdana" w:cs="Verdana"/>
           <w:color w:val="000000" w:themeColor="text1"/>
           <w:sz w:val="22"/>
           <w:szCs w:val="22"/>
@@ -2610,25 +2619,24 @@
       <w:pPr>
         <w:spacing w:after="200"/>
         <w:rPr>
-          <w:rFonts w:ascii="Verdana" w:hAnsi="Verdana" w:eastAsia="Verdana" w:cs="Verdana"/>
-          <w:color w:val="000000" w:themeColor="text1"/>
-          <w:sz w:val="22"/>
-          <w:szCs w:val="22"/>
-        </w:rPr>
-      </w:pPr>
-      <w:r>
-        <w:rPr>
-          <w:rFonts w:ascii="Verdana" w:hAnsi="Verdana" w:eastAsia="Verdana" w:cs="Verdana"/>
-          <w:color w:val="000000" w:themeColor="text1"/>
-          <w:sz w:val="22"/>
-          <w:szCs w:val="22"/>
-        </w:rPr>
-        <w:lastRenderedPageBreak/>
+          <w:rFonts w:ascii="Verdana" w:eastAsia="Verdana" w:hAnsi="Verdana" w:cs="Verdana"/>
+          <w:color w:val="000000" w:themeColor="text1"/>
+          <w:sz w:val="22"/>
+          <w:szCs w:val="22"/>
+        </w:rPr>
+      </w:pPr>
+      <w:r>
+        <w:rPr>
+          <w:rFonts w:ascii="Verdana" w:eastAsia="Verdana" w:hAnsi="Verdana" w:cs="Verdana"/>
+          <w:color w:val="000000" w:themeColor="text1"/>
+          <w:sz w:val="22"/>
+          <w:szCs w:val="22"/>
+        </w:rPr>
         <w:t>2-</w:t>
       </w:r>
       <w:r>
         <w:rPr>
-          <w:rFonts w:ascii="Verdana" w:hAnsi="Verdana" w:eastAsia="Verdana" w:cs="Verdana"/>
+          <w:rFonts w:ascii="Verdana" w:eastAsia="Verdana" w:hAnsi="Verdana" w:cs="Verdana"/>
           <w:color w:val="000000" w:themeColor="text1"/>
           <w:sz w:val="22"/>
           <w:szCs w:val="22"/>
@@ -2637,7 +2645,7 @@
       </w:r>
       <w:r>
         <w:rPr>
-          <w:rFonts w:ascii="Verdana" w:hAnsi="Verdana" w:eastAsia="Verdana" w:cs="Verdana"/>
+          <w:rFonts w:ascii="Verdana" w:eastAsia="Verdana" w:hAnsi="Verdana" w:cs="Verdana"/>
           <w:color w:val="000000" w:themeColor="text1"/>
           <w:sz w:val="22"/>
           <w:szCs w:val="22"/>
@@ -2646,7 +2654,7 @@
       </w:r>
       <w:r>
         <w:rPr>
-          <w:rFonts w:ascii="Verdana" w:hAnsi="Verdana" w:eastAsia="Verdana" w:cs="Verdana"/>
+          <w:rFonts w:ascii="Verdana" w:eastAsia="Verdana" w:hAnsi="Verdana" w:cs="Verdana"/>
           <w:color w:val="000000" w:themeColor="text1"/>
           <w:sz w:val="22"/>
           <w:szCs w:val="22"/>
@@ -2655,7 +2663,7 @@
       </w:r>
       <w:r>
         <w:rPr>
-          <w:rFonts w:ascii="Verdana" w:hAnsi="Verdana" w:eastAsia="Verdana" w:cs="Verdana"/>
+          <w:rFonts w:ascii="Verdana" w:eastAsia="Verdana" w:hAnsi="Verdana" w:cs="Verdana"/>
           <w:color w:val="000000" w:themeColor="text1"/>
           <w:sz w:val="22"/>
           <w:szCs w:val="22"/>
@@ -2664,7 +2672,7 @@
       </w:r>
       <w:r>
         <w:rPr>
-          <w:rFonts w:ascii="Verdana" w:hAnsi="Verdana" w:eastAsia="Verdana" w:cs="Verdana"/>
+          <w:rFonts w:ascii="Verdana" w:eastAsia="Verdana" w:hAnsi="Verdana" w:cs="Verdana"/>
           <w:color w:val="000000" w:themeColor="text1"/>
           <w:sz w:val="22"/>
           <w:szCs w:val="22"/>
@@ -2673,7 +2681,7 @@
       </w:r>
       <w:r>
         <w:rPr>
-          <w:rFonts w:ascii="Verdana" w:hAnsi="Verdana" w:eastAsia="Verdana" w:cs="Verdana"/>
+          <w:rFonts w:ascii="Verdana" w:eastAsia="Verdana" w:hAnsi="Verdana" w:cs="Verdana"/>
           <w:color w:val="000000" w:themeColor="text1"/>
           <w:sz w:val="22"/>
           <w:szCs w:val="22"/>
@@ -2682,7 +2690,7 @@
       </w:r>
       <w:r>
         <w:rPr>
-          <w:rFonts w:ascii="Verdana" w:hAnsi="Verdana" w:eastAsia="Verdana" w:cs="Verdana"/>
+          <w:rFonts w:ascii="Verdana" w:eastAsia="Verdana" w:hAnsi="Verdana" w:cs="Verdana"/>
           <w:color w:val="000000" w:themeColor="text1"/>
           <w:sz w:val="22"/>
           <w:szCs w:val="22"/>
@@ -2691,7 +2699,7 @@
       </w:r>
       <w:r>
         <w:rPr>
-          <w:rFonts w:ascii="Verdana" w:hAnsi="Verdana" w:eastAsia="Verdana" w:cs="Verdana"/>
+          <w:rFonts w:ascii="Verdana" w:eastAsia="Verdana" w:hAnsi="Verdana" w:cs="Verdana"/>
           <w:color w:val="000000" w:themeColor="text1"/>
           <w:sz w:val="22"/>
           <w:szCs w:val="22"/>
@@ -2700,7 +2708,7 @@
       </w:r>
       <w:r>
         <w:rPr>
-          <w:rFonts w:ascii="Verdana" w:hAnsi="Verdana" w:eastAsia="Verdana" w:cs="Verdana"/>
+          <w:rFonts w:ascii="Verdana" w:eastAsia="Verdana" w:hAnsi="Verdana" w:cs="Verdana"/>
           <w:color w:val="000000" w:themeColor="text1"/>
           <w:sz w:val="22"/>
           <w:szCs w:val="22"/>
@@ -2709,7 +2717,7 @@
       </w:r>
       <w:r>
         <w:rPr>
-          <w:rFonts w:ascii="Verdana" w:hAnsi="Verdana" w:eastAsia="Verdana" w:cs="Verdana"/>
+          <w:rFonts w:ascii="Verdana" w:eastAsia="Verdana" w:hAnsi="Verdana" w:cs="Verdana"/>
           <w:color w:val="000000" w:themeColor="text1"/>
           <w:sz w:val="22"/>
           <w:szCs w:val="22"/>
@@ -2718,7 +2726,7 @@
       </w:r>
       <w:r>
         <w:rPr>
-          <w:rFonts w:ascii="Verdana" w:hAnsi="Verdana" w:eastAsia="Verdana" w:cs="Verdana"/>
+          <w:rFonts w:ascii="Verdana" w:eastAsia="Verdana" w:hAnsi="Verdana" w:cs="Verdana"/>
           <w:color w:val="000000" w:themeColor="text1"/>
           <w:sz w:val="22"/>
           <w:szCs w:val="22"/>
@@ -2727,7 +2735,7 @@
       </w:r>
       <w:r>
         <w:rPr>
-          <w:rFonts w:ascii="Verdana" w:hAnsi="Verdana" w:eastAsia="Verdana" w:cs="Verdana"/>
+          <w:rFonts w:ascii="Verdana" w:eastAsia="Verdana" w:hAnsi="Verdana" w:cs="Verdana"/>
           <w:color w:val="000000" w:themeColor="text1"/>
           <w:sz w:val="22"/>
           <w:szCs w:val="22"/>
@@ -2736,7 +2744,7 @@
       </w:r>
       <w:r>
         <w:rPr>
-          <w:rFonts w:ascii="Verdana" w:hAnsi="Verdana" w:eastAsia="Verdana" w:cs="Verdana"/>
+          <w:rFonts w:ascii="Verdana" w:eastAsia="Verdana" w:hAnsi="Verdana" w:cs="Verdana"/>
           <w:color w:val="000000" w:themeColor="text1"/>
           <w:sz w:val="22"/>
           <w:szCs w:val="22"/>
@@ -2745,7 +2753,7 @@
       </w:r>
       <w:r>
         <w:rPr>
-          <w:rFonts w:ascii="Verdana" w:hAnsi="Verdana" w:eastAsia="Verdana" w:cs="Verdana"/>
+          <w:rFonts w:ascii="Verdana" w:eastAsia="Verdana" w:hAnsi="Verdana" w:cs="Verdana"/>
           <w:color w:val="000000" w:themeColor="text1"/>
           <w:sz w:val="22"/>
           <w:szCs w:val="22"/>
@@ -2754,7 +2762,7 @@
       </w:r>
       <w:r>
         <w:rPr>
-          <w:rFonts w:ascii="Verdana" w:hAnsi="Verdana" w:eastAsia="Verdana" w:cs="Verdana"/>
+          <w:rFonts w:ascii="Verdana" w:eastAsia="Verdana" w:hAnsi="Verdana" w:cs="Verdana"/>
           <w:color w:val="000000" w:themeColor="text1"/>
           <w:sz w:val="22"/>
           <w:szCs w:val="22"/>
@@ -2763,7 +2771,7 @@
       </w:r>
       <w:r>
         <w:rPr>
-          <w:rFonts w:ascii="Verdana" w:hAnsi="Verdana" w:eastAsia="Verdana" w:cs="Verdana"/>
+          <w:rFonts w:ascii="Verdana" w:eastAsia="Verdana" w:hAnsi="Verdana" w:cs="Verdana"/>
           <w:color w:val="000000" w:themeColor="text1"/>
           <w:sz w:val="22"/>
           <w:szCs w:val="22"/>
@@ -2775,15 +2783,15 @@
       <w:pPr>
         <w:spacing w:after="200"/>
         <w:rPr>
-          <w:rFonts w:ascii="Verdana" w:hAnsi="Verdana" w:eastAsia="Verdana" w:cs="Verdana"/>
-          <w:color w:val="000000" w:themeColor="text1"/>
-          <w:sz w:val="22"/>
-          <w:szCs w:val="22"/>
-        </w:rPr>
-      </w:pPr>
-      <w:r>
-        <w:rPr>
-          <w:rFonts w:ascii="Verdana" w:hAnsi="Verdana" w:eastAsia="Verdana" w:cs="Verdana"/>
+          <w:rFonts w:ascii="Verdana" w:eastAsia="Verdana" w:hAnsi="Verdana" w:cs="Verdana"/>
+          <w:color w:val="000000" w:themeColor="text1"/>
+          <w:sz w:val="22"/>
+          <w:szCs w:val="22"/>
+        </w:rPr>
+      </w:pPr>
+      <w:r>
+        <w:rPr>
+          <w:rFonts w:ascii="Verdana" w:eastAsia="Verdana" w:hAnsi="Verdana" w:cs="Verdana"/>
           <w:color w:val="000000" w:themeColor="text1"/>
           <w:sz w:val="22"/>
           <w:szCs w:val="22"/>
@@ -2792,7 +2800,7 @@
       </w:r>
       <w:r>
         <w:rPr>
-          <w:rFonts w:ascii="Verdana" w:hAnsi="Verdana" w:eastAsia="Verdana" w:cs="Verdana"/>
+          <w:rFonts w:ascii="Verdana" w:eastAsia="Verdana" w:hAnsi="Verdana" w:cs="Verdana"/>
           <w:color w:val="000000" w:themeColor="text1"/>
           <w:sz w:val="22"/>
           <w:szCs w:val="22"/>
@@ -2806,7 +2814,7 @@
       </w:pPr>
       <w:r>
         <w:rPr>
-          <w:rFonts w:ascii="Verdana" w:hAnsi="Verdana" w:eastAsia="Verdana" w:cs="Verdana"/>
+          <w:rFonts w:ascii="Verdana" w:eastAsia="Verdana" w:hAnsi="Verdana" w:cs="Verdana"/>
           <w:color w:val="000000" w:themeColor="text1"/>
           <w:sz w:val="22"/>
           <w:szCs w:val="22"/>
@@ -2815,7 +2823,7 @@
       </w:r>
       <w:r>
         <w:rPr>
-          <w:rFonts w:ascii="Verdana" w:hAnsi="Verdana" w:eastAsia="Verdana" w:cs="Verdana"/>
+          <w:rFonts w:ascii="Verdana" w:eastAsia="Verdana" w:hAnsi="Verdana" w:cs="Verdana"/>
           <w:color w:val="000000" w:themeColor="text1"/>
           <w:sz w:val="22"/>
           <w:szCs w:val="22"/>
@@ -2824,7 +2832,7 @@
       </w:r>
       <w:r>
         <w:rPr>
-          <w:rFonts w:ascii="Verdana" w:hAnsi="Verdana" w:eastAsia="Verdana" w:cs="Verdana"/>
+          <w:rFonts w:ascii="Verdana" w:eastAsia="Verdana" w:hAnsi="Verdana" w:cs="Verdana"/>
           <w:color w:val="000000" w:themeColor="text1"/>
           <w:sz w:val="22"/>
           <w:szCs w:val="22"/>
@@ -2833,7 +2841,7 @@
       </w:r>
       <w:r>
         <w:rPr>
-          <w:rFonts w:ascii="Verdana" w:hAnsi="Verdana" w:eastAsia="Verdana" w:cs="Verdana"/>
+          <w:rFonts w:ascii="Verdana" w:eastAsia="Verdana" w:hAnsi="Verdana" w:cs="Verdana"/>
           <w:color w:val="000000" w:themeColor="text1"/>
           <w:sz w:val="22"/>
           <w:szCs w:val="22"/>
@@ -2842,7 +2850,7 @@
       </w:r>
       <w:r>
         <w:rPr>
-          <w:rFonts w:ascii="Verdana" w:hAnsi="Verdana" w:eastAsia="Verdana" w:cs="Verdana"/>
+          <w:rFonts w:ascii="Verdana" w:eastAsia="Verdana" w:hAnsi="Verdana" w:cs="Verdana"/>
           <w:color w:val="000000" w:themeColor="text1"/>
           <w:sz w:val="22"/>
           <w:szCs w:val="22"/>
@@ -2856,7 +2864,7 @@
       </w:pPr>
       <w:r>
         <w:rPr>
-          <w:rFonts w:ascii="Verdana" w:hAnsi="Verdana" w:eastAsia="Verdana" w:cs="Verdana"/>
+          <w:rFonts w:ascii="Verdana" w:eastAsia="Verdana" w:hAnsi="Verdana" w:cs="Verdana"/>
           <w:color w:val="000000" w:themeColor="text1"/>
           <w:sz w:val="22"/>
           <w:szCs w:val="22"/>
@@ -2868,7 +2876,7 @@
       <w:pPr>
         <w:spacing w:after="200"/>
         <w:rPr>
-          <w:rFonts w:ascii="Verdana" w:hAnsi="Verdana" w:eastAsia="Verdana" w:cs="Verdana"/>
+          <w:rFonts w:ascii="Verdana" w:eastAsia="Verdana" w:hAnsi="Verdana" w:cs="Verdana"/>
           <w:color w:val="000000" w:themeColor="text1"/>
           <w:sz w:val="22"/>
           <w:szCs w:val="22"/>
@@ -2879,15 +2887,15 @@
       <w:pPr>
         <w:spacing w:after="200"/>
         <w:rPr>
-          <w:rFonts w:ascii="Verdana" w:hAnsi="Verdana" w:eastAsia="Verdana" w:cs="Verdana"/>
-          <w:color w:val="000000" w:themeColor="text1"/>
-          <w:sz w:val="22"/>
-          <w:szCs w:val="22"/>
-        </w:rPr>
-      </w:pPr>
-      <w:r>
-        <w:rPr>
-          <w:rFonts w:ascii="Verdana" w:hAnsi="Verdana" w:eastAsia="Verdana" w:cs="Verdana"/>
+          <w:rFonts w:ascii="Verdana" w:eastAsia="Verdana" w:hAnsi="Verdana" w:cs="Verdana"/>
+          <w:color w:val="000000" w:themeColor="text1"/>
+          <w:sz w:val="22"/>
+          <w:szCs w:val="22"/>
+        </w:rPr>
+      </w:pPr>
+      <w:r>
+        <w:rPr>
+          <w:rFonts w:ascii="Verdana" w:eastAsia="Verdana" w:hAnsi="Verdana" w:cs="Verdana"/>
           <w:color w:val="000000" w:themeColor="text1"/>
           <w:sz w:val="22"/>
           <w:szCs w:val="22"/>
@@ -2899,7 +2907,7 @@
       <w:pPr>
         <w:spacing w:after="200"/>
         <w:rPr>
-          <w:rFonts w:ascii="Verdana" w:hAnsi="Verdana" w:eastAsia="Verdana" w:cs="Verdana"/>
+          <w:rFonts w:ascii="Verdana" w:eastAsia="Verdana" w:hAnsi="Verdana" w:cs="Verdana"/>
           <w:color w:val="000000" w:themeColor="text1"/>
           <w:sz w:val="22"/>
           <w:szCs w:val="22"/>
@@ -2908,8 +2916,8 @@
       <w:hyperlink r:id="rId14">
         <w:r>
           <w:rPr>
-            <w:rStyle w:val="Hipervnculo"/>
-            <w:rFonts w:ascii="Verdana" w:hAnsi="Verdana" w:eastAsia="Verdana" w:cs="Verdana"/>
+            <w:rStyle w:val="Hyperlink"/>
+            <w:rFonts w:ascii="Verdana" w:eastAsia="Verdana" w:hAnsi="Verdana" w:cs="Verdana"/>
             <w:sz w:val="22"/>
             <w:szCs w:val="22"/>
           </w:rPr>
@@ -2933,7 +2941,7 @@
       <w:hyperlink r:id="rId15">
         <w:r>
           <w:rPr>
-            <w:rStyle w:val="Hipervnculo"/>
+            <w:rStyle w:val="Hyperlink"/>
             <w:highlight w:val="lightGray"/>
           </w:rPr>
           <w:t>https://www.bilbao.eus/opendata/es/catalogo/dato-habitantes-distrito-barrio-edad-2022</w:t>
@@ -2949,7 +2957,7 @@
       <w:hyperlink r:id="rId16">
         <w:r>
           <w:rPr>
-            <w:rStyle w:val="Hipervnculo"/>
+            <w:rStyle w:val="Hyperlink"/>
             <w:highlight w:val="lightGray"/>
           </w:rPr>
           <w:t>Renta Media Municipios / Distritos</w:t>
@@ -2965,7 +2973,7 @@
       <w:hyperlink r:id="rId17">
         <w:r>
           <w:rPr>
-            <w:rStyle w:val="Hipervnculo"/>
+            <w:rStyle w:val="Hyperlink"/>
             <w:highlight w:val="lightGray"/>
           </w:rPr>
           <w:t>https://www.bilbao.eus/opendata/es/catalogo/dato-distritos</w:t>
@@ -2981,25 +2989,25 @@
       <w:hyperlink r:id="rId18">
         <w:r>
           <w:rPr>
-            <w:rStyle w:val="Hipervnculo"/>
+            <w:rStyle w:val="Hyperlink"/>
           </w:rPr>
           <w:t>Renta familiar media por barrios</w:t>
         </w:r>
         <w:r>
           <w:rPr>
-            <w:rStyle w:val="Hipervnculo"/>
+            <w:rStyle w:val="Hyperlink"/>
           </w:rPr>
           <w:t xml:space="preserve"> Bilbao</w:t>
         </w:r>
         <w:r>
           <w:rPr>
-            <w:rStyle w:val="Hipervnculo"/>
+            <w:rStyle w:val="Hyperlink"/>
           </w:rPr>
           <w:t xml:space="preserve"> (2023)</w:t>
         </w:r>
         <w:r>
           <w:rPr>
-            <w:rStyle w:val="Hipervnculo"/>
+            <w:rStyle w:val="Hyperlink"/>
           </w:rPr>
           <w:t xml:space="preserve"> </w:t>
         </w:r>
@@ -3014,14 +3022,14 @@
       <w:hyperlink r:id="rId19">
         <w:r>
           <w:rPr>
-            <w:rStyle w:val="Hipervnculo"/>
+            <w:rStyle w:val="Hyperlink"/>
             <w:highlight w:val="lightGray"/>
           </w:rPr>
           <w:t>Idealista evolución alquiler barrios Bilbao</w:t>
         </w:r>
         <w:r>
           <w:rPr>
-            <w:rStyle w:val="Hipervnculo"/>
+            <w:rStyle w:val="Hyperlink"/>
             <w:highlight w:val="lightGray"/>
           </w:rPr>
           <w:t xml:space="preserve"> (2021-2026)</w:t>
@@ -3032,7 +3040,7 @@
       <w:hyperlink r:id="rId20">
         <w:r>
           <w:rPr>
-            <w:rStyle w:val="Hipervnculo"/>
+            <w:rStyle w:val="Hyperlink"/>
           </w:rPr>
           <w:t>PDF pág. 7 precio medio alquiler por barrios de Bilbao (2018)</w:t>
         </w:r>
@@ -3053,7 +3061,7 @@
       <w:hyperlink r:id="rId21">
         <w:r>
           <w:rPr>
-            <w:rStyle w:val="Hipervnculo"/>
+            <w:rStyle w:val="Hyperlink"/>
             <w:highlight w:val="lightGray"/>
           </w:rPr>
           <w:t>Censo por distritos por 3 grupos de edad</w:t>
@@ -3069,7 +3077,7 @@
       <w:hyperlink r:id="rId22">
         <w:r>
           <w:rPr>
-            <w:rStyle w:val="Hipervnculo"/>
+            <w:rStyle w:val="Hyperlink"/>
             <w:highlight w:val="lightGray"/>
           </w:rPr>
           <w:t>Idealista evolución alquiler barrios Valencia (2021-2026)</w:t>
@@ -3085,7 +3093,7 @@
       <w:hyperlink r:id="rId23">
         <w:r>
           <w:rPr>
-            <w:rStyle w:val="Hipervnculo"/>
+            <w:rStyle w:val="Hyperlink"/>
             <w:highlight w:val="lightGray"/>
           </w:rPr>
           <w:t>Renta Media Por Municipios/Distritos</w:t>
@@ -3108,7 +3116,7 @@
       <w:hyperlink r:id="rId24">
         <w:r>
           <w:rPr>
-            <w:rStyle w:val="Hipervnculo"/>
+            <w:rStyle w:val="Hyperlink"/>
           </w:rPr>
           <w:t>https://www.valencia.es/cas/estadistica/mapa-barrios</w:t>
         </w:r>
@@ -3121,7 +3129,7 @@
       <w:hyperlink r:id="rId25">
         <w:r>
           <w:rPr>
-            <w:rStyle w:val="Hipervnculo"/>
+            <w:rStyle w:val="Hyperlink"/>
           </w:rPr>
           <w:t>Censo Distrito por lugar de nacimiento</w:t>
         </w:r>
@@ -3131,7 +3139,7 @@
       <w:hyperlink r:id="rId26">
         <w:r>
           <w:rPr>
-            <w:rStyle w:val="Hipervnculo"/>
+            <w:rStyle w:val="Hyperlink"/>
           </w:rPr>
           <w:t>Desempleo por nacionalidad y edad distritos</w:t>
         </w:r>
@@ -3355,7 +3363,7 @@
     <w:sectPr>
       <w:headerReference w:type="default" r:id="rId27"/>
       <w:footerReference w:type="default" r:id="rId28"/>
-      <w:pgSz w:w="11906" w:h="16838" w:orient="portrait"/>
+      <w:pgSz w:w="11906" w:h="16838"/>
       <w:pgMar w:top="1440" w:right="1440" w:bottom="1440" w:left="1440" w:header="720" w:footer="720" w:gutter="0"/>
       <w:cols w:space="720"/>
       <w:docGrid w:linePitch="360"/>
@@ -3365,7 +3373,7 @@
 </file>
 
 <file path=word/endnotes.xml><?xml version="1.0" encoding="utf-8"?>
-<w:endnotes xmlns:wpc="http://schemas.microsoft.com/office/word/2010/wordprocessingCanvas" xmlns:cx="http://schemas.microsoft.com/office/drawing/2014/chartex" xmlns:cx1="http://schemas.microsoft.com/office/drawing/2015/9/8/chartex" xmlns:cx2="http://schemas.microsoft.com/office/drawing/2015/10/21/chartex" xmlns:cx3="http://schemas.microsoft.com/office/drawing/2016/5/9/chartex" xmlns:cx4="http://schemas.microsoft.com/office/drawing/2016/5/10/chartex" xmlns:cx5="http://schemas.microsoft.com/office/drawing/2016/5/11/chartex" xmlns:cx6="http://schemas.microsoft.com/office/drawing/2016/5/12/chartex" xmlns:cx7="http://schemas.microsoft.com/office/drawing/2016/5/13/chartex" xmlns:cx8="http://schemas.microsoft.com/office/drawing/2016/5/14/chartex" xmlns:mc="http://schemas.openxmlformats.org/markup-compatibility/2006" xmlns:aink="http://schemas.microsoft.com/office/drawing/2016/ink" xmlns:am3d="http://schemas.microsoft.com/office/drawing/2017/model3d" xmlns:o="urn:schemas-microsoft-com:office:office" xmlns:oel="http://schemas.microsoft.com/office/2019/extlst" xmlns:r="http://schemas.openxmlformats.org/officeDocument/2006/relationships" xmlns:m="http://schemas.openxmlformats.org/officeDocument/2006/math" xmlns:v="urn:schemas-microsoft-com:vml" xmlns:wp14="http://schemas.microsoft.com/office/word/2010/wordprocessingDrawing" xmlns:wp="http://schemas.openxmlformats.org/drawingml/2006/wordprocessingDrawing" xmlns:w10="urn:schemas-microsoft-com:office:word" xmlns:w="http://schemas.openxmlformats.org/wordprocessingml/2006/main" xmlns:w14="http://schemas.microsoft.com/office/word/2010/wordml" xmlns:w15="http://schemas.microsoft.com/office/word/2012/wordml" xmlns:w16cex="http://schemas.microsoft.com/office/word/2018/wordml/cex" xmlns:w16cid="http://schemas.microsoft.com/office/word/2016/wordml/cid" xmlns:w16="http://schemas.microsoft.com/office/word/2018/wordml" xmlns:w16sdtdh="http://schemas.microsoft.com/office/word/2020/wordml/sdtdatahash" xmlns:w16se="http://schemas.microsoft.com/office/word/2015/wordml/symex" xmlns:wpg="http://schemas.microsoft.com/office/word/2010/wordprocessingGroup" xmlns:wpi="http://schemas.microsoft.com/office/word/2010/wordprocessingInk" xmlns:wne="http://schemas.microsoft.com/office/word/2006/wordml" xmlns:wps="http://schemas.microsoft.com/office/word/2010/wordprocessingShape" mc:Ignorable="w14 w15 w16se w16cid w16 w16cex w16sdtdh wp14">
+<w:endnotes xmlns:wpc="http://schemas.microsoft.com/office/word/2010/wordprocessingCanvas" xmlns:cx="http://schemas.microsoft.com/office/drawing/2014/chartex" xmlns:cx1="http://schemas.microsoft.com/office/drawing/2015/9/8/chartex" xmlns:cx2="http://schemas.microsoft.com/office/drawing/2015/10/21/chartex" xmlns:cx3="http://schemas.microsoft.com/office/drawing/2016/5/9/chartex" xmlns:cx4="http://schemas.microsoft.com/office/drawing/2016/5/10/chartex" xmlns:cx5="http://schemas.microsoft.com/office/drawing/2016/5/11/chartex" xmlns:cx6="http://schemas.microsoft.com/office/drawing/2016/5/12/chartex" xmlns:cx7="http://schemas.microsoft.com/office/drawing/2016/5/13/chartex" xmlns:cx8="http://schemas.microsoft.com/office/drawing/2016/5/14/chartex" xmlns:mc="http://schemas.openxmlformats.org/markup-compatibility/2006" xmlns:aink="http://schemas.microsoft.com/office/drawing/2016/ink" xmlns:am3d="http://schemas.microsoft.com/office/drawing/2017/model3d" xmlns:o="urn:schemas-microsoft-com:office:office" xmlns:oel="http://schemas.microsoft.com/office/2019/extlst" xmlns:r="http://schemas.openxmlformats.org/officeDocument/2006/relationships" xmlns:m="http://schemas.openxmlformats.org/officeDocument/2006/math" xmlns:v="urn:schemas-microsoft-com:vml" xmlns:wp14="http://schemas.microsoft.com/office/word/2010/wordprocessingDrawing" xmlns:wp="http://schemas.openxmlformats.org/drawingml/2006/wordprocessingDrawing" xmlns:w10="urn:schemas-microsoft-com:office:word" xmlns:w="http://schemas.openxmlformats.org/wordprocessingml/2006/main" xmlns:w14="http://schemas.microsoft.com/office/word/2010/wordml" xmlns:w15="http://schemas.microsoft.com/office/word/2012/wordml" xmlns:w16cex="http://schemas.microsoft.com/office/word/2018/wordml/cex" xmlns:w16cid="http://schemas.microsoft.com/office/word/2016/wordml/cid" xmlns:w16="http://schemas.microsoft.com/office/word/2018/wordml" xmlns:w16du="http://schemas.microsoft.com/office/word/2023/wordml/word16du" xmlns:w16sdtdh="http://schemas.microsoft.com/office/word/2020/wordml/sdtdatahash" xmlns:w16sdtfl="http://schemas.microsoft.com/office/word/2024/wordml/sdtformatlock" xmlns:w16se="http://schemas.microsoft.com/office/word/2015/wordml/symex" xmlns:wpg="http://schemas.microsoft.com/office/word/2010/wordprocessingGroup" xmlns:wpi="http://schemas.microsoft.com/office/word/2010/wordprocessingInk" xmlns:wne="http://schemas.microsoft.com/office/word/2006/wordml" xmlns:wps="http://schemas.microsoft.com/office/word/2010/wordprocessingShape" mc:Ignorable="w14 w15 w16se w16cid w16 w16cex w16sdtdh w16sdtfl w16du wp14">
   <w:endnote w:type="separator" w:id="-1">
     <w:p>
       <w:pPr>
@@ -3397,7 +3405,7 @@
 </file>
 
 <file path=word/footer1.xml><?xml version="1.0" encoding="utf-8"?>
-<w:ftr xmlns:wpc="http://schemas.microsoft.com/office/word/2010/wordprocessingCanvas" xmlns:cx="http://schemas.microsoft.com/office/drawing/2014/chartex" xmlns:cx1="http://schemas.microsoft.com/office/drawing/2015/9/8/chartex" xmlns:cx2="http://schemas.microsoft.com/office/drawing/2015/10/21/chartex" xmlns:cx3="http://schemas.microsoft.com/office/drawing/2016/5/9/chartex" xmlns:cx4="http://schemas.microsoft.com/office/drawing/2016/5/10/chartex" xmlns:cx5="http://schemas.microsoft.com/office/drawing/2016/5/11/chartex" xmlns:cx6="http://schemas.microsoft.com/office/drawing/2016/5/12/chartex" xmlns:cx7="http://schemas.microsoft.com/office/drawing/2016/5/13/chartex" xmlns:cx8="http://schemas.microsoft.com/office/drawing/2016/5/14/chartex" xmlns:mc="http://schemas.openxmlformats.org/markup-compatibility/2006" xmlns:aink="http://schemas.microsoft.com/office/drawing/2016/ink" xmlns:am3d="http://schemas.microsoft.com/office/drawing/2017/model3d" xmlns:o="urn:schemas-microsoft-com:office:office" xmlns:oel="http://schemas.microsoft.com/office/2019/extlst" xmlns:r="http://schemas.openxmlformats.org/officeDocument/2006/relationships" xmlns:m="http://schemas.openxmlformats.org/officeDocument/2006/math" xmlns:v="urn:schemas-microsoft-com:vml" xmlns:wp14="http://schemas.microsoft.com/office/word/2010/wordprocessingDrawing" xmlns:wp="http://schemas.openxmlformats.org/drawingml/2006/wordprocessingDrawing" xmlns:w10="urn:schemas-microsoft-com:office:word" xmlns:w="http://schemas.openxmlformats.org/wordprocessingml/2006/main" xmlns:w14="http://schemas.microsoft.com/office/word/2010/wordml" xmlns:w15="http://schemas.microsoft.com/office/word/2012/wordml" xmlns:w16cex="http://schemas.microsoft.com/office/word/2018/wordml/cex" xmlns:w16cid="http://schemas.microsoft.com/office/word/2016/wordml/cid" xmlns:w16="http://schemas.microsoft.com/office/word/2018/wordml" xmlns:w16sdtdh="http://schemas.microsoft.com/office/word/2020/wordml/sdtdatahash" xmlns:w16se="http://schemas.microsoft.com/office/word/2015/wordml/symex" xmlns:wpg="http://schemas.microsoft.com/office/word/2010/wordprocessingGroup" xmlns:wpi="http://schemas.microsoft.com/office/word/2010/wordprocessingInk" xmlns:wne="http://schemas.microsoft.com/office/word/2006/wordml" xmlns:wps="http://schemas.microsoft.com/office/word/2010/wordprocessingShape" mc:Ignorable="w14 w15 w16se w16cid w16 w16cex w16sdtdh wp14">
+<w:ftr xmlns:wpc="http://schemas.microsoft.com/office/word/2010/wordprocessingCanvas" xmlns:cx="http://schemas.microsoft.com/office/drawing/2014/chartex" xmlns:cx1="http://schemas.microsoft.com/office/drawing/2015/9/8/chartex" xmlns:cx2="http://schemas.microsoft.com/office/drawing/2015/10/21/chartex" xmlns:cx3="http://schemas.microsoft.com/office/drawing/2016/5/9/chartex" xmlns:cx4="http://schemas.microsoft.com/office/drawing/2016/5/10/chartex" xmlns:cx5="http://schemas.microsoft.com/office/drawing/2016/5/11/chartex" xmlns:cx6="http://schemas.microsoft.com/office/drawing/2016/5/12/chartex" xmlns:cx7="http://schemas.microsoft.com/office/drawing/2016/5/13/chartex" xmlns:cx8="http://schemas.microsoft.com/office/drawing/2016/5/14/chartex" xmlns:mc="http://schemas.openxmlformats.org/markup-compatibility/2006" xmlns:aink="http://schemas.microsoft.com/office/drawing/2016/ink" xmlns:am3d="http://schemas.microsoft.com/office/drawing/2017/model3d" xmlns:o="urn:schemas-microsoft-com:office:office" xmlns:oel="http://schemas.microsoft.com/office/2019/extlst" xmlns:r="http://schemas.openxmlformats.org/officeDocument/2006/relationships" xmlns:m="http://schemas.openxmlformats.org/officeDocument/2006/math" xmlns:v="urn:schemas-microsoft-com:vml" xmlns:wp14="http://schemas.microsoft.com/office/word/2010/wordprocessingDrawing" xmlns:wp="http://schemas.openxmlformats.org/drawingml/2006/wordprocessingDrawing" xmlns:w10="urn:schemas-microsoft-com:office:word" xmlns:w="http://schemas.openxmlformats.org/wordprocessingml/2006/main" xmlns:w14="http://schemas.microsoft.com/office/word/2010/wordml" xmlns:w15="http://schemas.microsoft.com/office/word/2012/wordml" xmlns:w16cex="http://schemas.microsoft.com/office/word/2018/wordml/cex" xmlns:w16cid="http://schemas.microsoft.com/office/word/2016/wordml/cid" xmlns:w16="http://schemas.microsoft.com/office/word/2018/wordml" xmlns:w16du="http://schemas.microsoft.com/office/word/2023/wordml/word16du" xmlns:w16sdtdh="http://schemas.microsoft.com/office/word/2020/wordml/sdtdatahash" xmlns:w16sdtfl="http://schemas.microsoft.com/office/word/2024/wordml/sdtformatlock" xmlns:w16se="http://schemas.microsoft.com/office/word/2015/wordml/symex" xmlns:wpg="http://schemas.microsoft.com/office/word/2010/wordprocessingGroup" xmlns:wpi="http://schemas.microsoft.com/office/word/2010/wordprocessingInk" xmlns:wne="http://schemas.microsoft.com/office/word/2006/wordml" xmlns:wps="http://schemas.microsoft.com/office/word/2010/wordprocessingShape" mc:Ignorable="w14 w15 w16se w16cid w16 w16cex w16sdtdh w16sdtfl w16du wp14">
   <w:tbl>
     <w:tblPr>
       <w:tblW w:w="0" w:type="auto"/>
@@ -3418,7 +3426,7 @@
         </w:tcPr>
         <w:p>
           <w:pPr>
-            <w:pStyle w:val="Encabezado"/>
+            <w:pStyle w:val="Header"/>
             <w:ind w:left="-115"/>
           </w:pPr>
         </w:p>
@@ -3429,7 +3437,7 @@
         </w:tcPr>
         <w:p>
           <w:pPr>
-            <w:pStyle w:val="Encabezado"/>
+            <w:pStyle w:val="Header"/>
             <w:jc w:val="center"/>
           </w:pPr>
         </w:p>
@@ -3440,7 +3448,7 @@
         </w:tcPr>
         <w:p>
           <w:pPr>
-            <w:pStyle w:val="Encabezado"/>
+            <w:pStyle w:val="Header"/>
             <w:ind w:right="-115"/>
             <w:jc w:val="right"/>
           </w:pPr>
@@ -3450,14 +3458,14 @@
   </w:tbl>
   <w:p>
     <w:pPr>
-      <w:pStyle w:val="Piedepgina"/>
+      <w:pStyle w:val="Footer"/>
     </w:pPr>
   </w:p>
 </w:ftr>
 </file>
 
 <file path=word/footnotes.xml><?xml version="1.0" encoding="utf-8"?>
-<w:footnotes xmlns:wpc="http://schemas.microsoft.com/office/word/2010/wordprocessingCanvas" xmlns:cx="http://schemas.microsoft.com/office/drawing/2014/chartex" xmlns:cx1="http://schemas.microsoft.com/office/drawing/2015/9/8/chartex" xmlns:cx2="http://schemas.microsoft.com/office/drawing/2015/10/21/chartex" xmlns:cx3="http://schemas.microsoft.com/office/drawing/2016/5/9/chartex" xmlns:cx4="http://schemas.microsoft.com/office/drawing/2016/5/10/chartex" xmlns:cx5="http://schemas.microsoft.com/office/drawing/2016/5/11/chartex" xmlns:cx6="http://schemas.microsoft.com/office/drawing/2016/5/12/chartex" xmlns:cx7="http://schemas.microsoft.com/office/drawing/2016/5/13/chartex" xmlns:cx8="http://schemas.microsoft.com/office/drawing/2016/5/14/chartex" xmlns:mc="http://schemas.openxmlformats.org/markup-compatibility/2006" xmlns:aink="http://schemas.microsoft.com/office/drawing/2016/ink" xmlns:am3d="http://schemas.microsoft.com/office/drawing/2017/model3d" xmlns:o="urn:schemas-microsoft-com:office:office" xmlns:oel="http://schemas.microsoft.com/office/2019/extlst" xmlns:r="http://schemas.openxmlformats.org/officeDocument/2006/relationships" xmlns:m="http://schemas.openxmlformats.org/officeDocument/2006/math" xmlns:v="urn:schemas-microsoft-com:vml" xmlns:wp14="http://schemas.microsoft.com/office/word/2010/wordprocessingDrawing" xmlns:wp="http://schemas.openxmlformats.org/drawingml/2006/wordprocessingDrawing" xmlns:w10="urn:schemas-microsoft-com:office:word" xmlns:w="http://schemas.openxmlformats.org/wordprocessingml/2006/main" xmlns:w14="http://schemas.microsoft.com/office/word/2010/wordml" xmlns:w15="http://schemas.microsoft.com/office/word/2012/wordml" xmlns:w16cex="http://schemas.microsoft.com/office/word/2018/wordml/cex" xmlns:w16cid="http://schemas.microsoft.com/office/word/2016/wordml/cid" xmlns:w16="http://schemas.microsoft.com/office/word/2018/wordml" xmlns:w16sdtdh="http://schemas.microsoft.com/office/word/2020/wordml/sdtdatahash" xmlns:w16se="http://schemas.microsoft.com/office/word/2015/wordml/symex" xmlns:wpg="http://schemas.microsoft.com/office/word/2010/wordprocessingGroup" xmlns:wpi="http://schemas.microsoft.com/office/word/2010/wordprocessingInk" xmlns:wne="http://schemas.microsoft.com/office/word/2006/wordml" xmlns:wps="http://schemas.microsoft.com/office/word/2010/wordprocessingShape" mc:Ignorable="w14 w15 w16se w16cid w16 w16cex w16sdtdh wp14">
+<w:footnotes xmlns:wpc="http://schemas.microsoft.com/office/word/2010/wordprocessingCanvas" xmlns:cx="http://schemas.microsoft.com/office/drawing/2014/chartex" xmlns:cx1="http://schemas.microsoft.com/office/drawing/2015/9/8/chartex" xmlns:cx2="http://schemas.microsoft.com/office/drawing/2015/10/21/chartex" xmlns:cx3="http://schemas.microsoft.com/office/drawing/2016/5/9/chartex" xmlns:cx4="http://schemas.microsoft.com/office/drawing/2016/5/10/chartex" xmlns:cx5="http://schemas.microsoft.com/office/drawing/2016/5/11/chartex" xmlns:cx6="http://schemas.microsoft.com/office/drawing/2016/5/12/chartex" xmlns:cx7="http://schemas.microsoft.com/office/drawing/2016/5/13/chartex" xmlns:cx8="http://schemas.microsoft.com/office/drawing/2016/5/14/chartex" xmlns:mc="http://schemas.openxmlformats.org/markup-compatibility/2006" xmlns:aink="http://schemas.microsoft.com/office/drawing/2016/ink" xmlns:am3d="http://schemas.microsoft.com/office/drawing/2017/model3d" xmlns:o="urn:schemas-microsoft-com:office:office" xmlns:oel="http://schemas.microsoft.com/office/2019/extlst" xmlns:r="http://schemas.openxmlformats.org/officeDocument/2006/relationships" xmlns:m="http://schemas.openxmlformats.org/officeDocument/2006/math" xmlns:v="urn:schemas-microsoft-com:vml" xmlns:wp14="http://schemas.microsoft.com/office/word/2010/wordprocessingDrawing" xmlns:wp="http://schemas.openxmlformats.org/drawingml/2006/wordprocessingDrawing" xmlns:w10="urn:schemas-microsoft-com:office:word" xmlns:w="http://schemas.openxmlformats.org/wordprocessingml/2006/main" xmlns:w14="http://schemas.microsoft.com/office/word/2010/wordml" xmlns:w15="http://schemas.microsoft.com/office/word/2012/wordml" xmlns:w16cex="http://schemas.microsoft.com/office/word/2018/wordml/cex" xmlns:w16cid="http://schemas.microsoft.com/office/word/2016/wordml/cid" xmlns:w16="http://schemas.microsoft.com/office/word/2018/wordml" xmlns:w16du="http://schemas.microsoft.com/office/word/2023/wordml/word16du" xmlns:w16sdtdh="http://schemas.microsoft.com/office/word/2020/wordml/sdtdatahash" xmlns:w16sdtfl="http://schemas.microsoft.com/office/word/2024/wordml/sdtformatlock" xmlns:w16se="http://schemas.microsoft.com/office/word/2015/wordml/symex" xmlns:wpg="http://schemas.microsoft.com/office/word/2010/wordprocessingGroup" xmlns:wpi="http://schemas.microsoft.com/office/word/2010/wordprocessingInk" xmlns:wne="http://schemas.microsoft.com/office/word/2006/wordml" xmlns:wps="http://schemas.microsoft.com/office/word/2010/wordprocessingShape" mc:Ignorable="w14 w15 w16se w16cid w16 w16cex w16sdtdh w16sdtfl w16du wp14">
   <w:footnote w:type="separator" w:id="-1">
     <w:p>
       <w:pPr>
@@ -3489,7 +3497,7 @@
 </file>
 
 <file path=word/header1.xml><?xml version="1.0" encoding="utf-8"?>
-<w:hdr xmlns:wpc="http://schemas.microsoft.com/office/word/2010/wordprocessingCanvas" xmlns:cx="http://schemas.microsoft.com/office/drawing/2014/chartex" xmlns:cx1="http://schemas.microsoft.com/office/drawing/2015/9/8/chartex" xmlns:cx2="http://schemas.microsoft.com/office/drawing/2015/10/21/chartex" xmlns:cx3="http://schemas.microsoft.com/office/drawing/2016/5/9/chartex" xmlns:cx4="http://schemas.microsoft.com/office/drawing/2016/5/10/chartex" xmlns:cx5="http://schemas.microsoft.com/office/drawing/2016/5/11/chartex" xmlns:cx6="http://schemas.microsoft.com/office/drawing/2016/5/12/chartex" xmlns:cx7="http://schemas.microsoft.com/office/drawing/2016/5/13/chartex" xmlns:cx8="http://schemas.microsoft.com/office/drawing/2016/5/14/chartex" xmlns:mc="http://schemas.openxmlformats.org/markup-compatibility/2006" xmlns:aink="http://schemas.microsoft.com/office/drawing/2016/ink" xmlns:am3d="http://schemas.microsoft.com/office/drawing/2017/model3d" xmlns:o="urn:schemas-microsoft-com:office:office" xmlns:oel="http://schemas.microsoft.com/office/2019/extlst" xmlns:r="http://schemas.openxmlformats.org/officeDocument/2006/relationships" xmlns:m="http://schemas.openxmlformats.org/officeDocument/2006/math" xmlns:v="urn:schemas-microsoft-com:vml" xmlns:wp14="http://schemas.microsoft.com/office/word/2010/wordprocessingDrawing" xmlns:wp="http://schemas.openxmlformats.org/drawingml/2006/wordprocessingDrawing" xmlns:w10="urn:schemas-microsoft-com:office:word" xmlns:w="http://schemas.openxmlformats.org/wordprocessingml/2006/main" xmlns:w14="http://schemas.microsoft.com/office/word/2010/wordml" xmlns:w15="http://schemas.microsoft.com/office/word/2012/wordml" xmlns:w16cex="http://schemas.microsoft.com/office/word/2018/wordml/cex" xmlns:w16cid="http://schemas.microsoft.com/office/word/2016/wordml/cid" xmlns:w16="http://schemas.microsoft.com/office/word/2018/wordml" xmlns:w16sdtdh="http://schemas.microsoft.com/office/word/2020/wordml/sdtdatahash" xmlns:w16se="http://schemas.microsoft.com/office/word/2015/wordml/symex" xmlns:wpg="http://schemas.microsoft.com/office/word/2010/wordprocessingGroup" xmlns:wpi="http://schemas.microsoft.com/office/word/2010/wordprocessingInk" xmlns:wne="http://schemas.microsoft.com/office/word/2006/wordml" xmlns:wps="http://schemas.microsoft.com/office/word/2010/wordprocessingShape" mc:Ignorable="w14 w15 w16se w16cid w16 w16cex w16sdtdh wp14">
+<w:hdr xmlns:wpc="http://schemas.microsoft.com/office/word/2010/wordprocessingCanvas" xmlns:cx="http://schemas.microsoft.com/office/drawing/2014/chartex" xmlns:cx1="http://schemas.microsoft.com/office/drawing/2015/9/8/chartex" xmlns:cx2="http://schemas.microsoft.com/office/drawing/2015/10/21/chartex" xmlns:cx3="http://schemas.microsoft.com/office/drawing/2016/5/9/chartex" xmlns:cx4="http://schemas.microsoft.com/office/drawing/2016/5/10/chartex" xmlns:cx5="http://schemas.microsoft.com/office/drawing/2016/5/11/chartex" xmlns:cx6="http://schemas.microsoft.com/office/drawing/2016/5/12/chartex" xmlns:cx7="http://schemas.microsoft.com/office/drawing/2016/5/13/chartex" xmlns:cx8="http://schemas.microsoft.com/office/drawing/2016/5/14/chartex" xmlns:mc="http://schemas.openxmlformats.org/markup-compatibility/2006" xmlns:aink="http://schemas.microsoft.com/office/drawing/2016/ink" xmlns:am3d="http://schemas.microsoft.com/office/drawing/2017/model3d" xmlns:o="urn:schemas-microsoft-com:office:office" xmlns:oel="http://schemas.microsoft.com/office/2019/extlst" xmlns:r="http://schemas.openxmlformats.org/officeDocument/2006/relationships" xmlns:m="http://schemas.openxmlformats.org/officeDocument/2006/math" xmlns:v="urn:schemas-microsoft-com:vml" xmlns:wp14="http://schemas.microsoft.com/office/word/2010/wordprocessingDrawing" xmlns:wp="http://schemas.openxmlformats.org/drawingml/2006/wordprocessingDrawing" xmlns:w10="urn:schemas-microsoft-com:office:word" xmlns:w="http://schemas.openxmlformats.org/wordprocessingml/2006/main" xmlns:w14="http://schemas.microsoft.com/office/word/2010/wordml" xmlns:w15="http://schemas.microsoft.com/office/word/2012/wordml" xmlns:w16cex="http://schemas.microsoft.com/office/word/2018/wordml/cex" xmlns:w16cid="http://schemas.microsoft.com/office/word/2016/wordml/cid" xmlns:w16="http://schemas.microsoft.com/office/word/2018/wordml" xmlns:w16du="http://schemas.microsoft.com/office/word/2023/wordml/word16du" xmlns:w16sdtdh="http://schemas.microsoft.com/office/word/2020/wordml/sdtdatahash" xmlns:w16sdtfl="http://schemas.microsoft.com/office/word/2024/wordml/sdtformatlock" xmlns:w16se="http://schemas.microsoft.com/office/word/2015/wordml/symex" xmlns:wpg="http://schemas.microsoft.com/office/word/2010/wordprocessingGroup" xmlns:wpi="http://schemas.microsoft.com/office/word/2010/wordprocessingInk" xmlns:wne="http://schemas.microsoft.com/office/word/2006/wordml" xmlns:wps="http://schemas.microsoft.com/office/word/2010/wordprocessingShape" mc:Ignorable="w14 w15 w16se w16cid w16 w16cex w16sdtdh w16sdtfl w16du wp14">
   <w:tbl>
     <w:tblPr>
       <w:tblW w:w="0" w:type="auto"/>
@@ -3510,7 +3518,7 @@
         </w:tcPr>
         <w:p>
           <w:pPr>
-            <w:pStyle w:val="Encabezado"/>
+            <w:pStyle w:val="Header"/>
             <w:ind w:left="-115"/>
           </w:pPr>
         </w:p>
@@ -3521,7 +3529,7 @@
         </w:tcPr>
         <w:p>
           <w:pPr>
-            <w:pStyle w:val="Encabezado"/>
+            <w:pStyle w:val="Header"/>
             <w:jc w:val="center"/>
           </w:pPr>
         </w:p>
@@ -3532,7 +3540,7 @@
         </w:tcPr>
         <w:p>
           <w:pPr>
-            <w:pStyle w:val="Encabezado"/>
+            <w:pStyle w:val="Header"/>
             <w:ind w:right="-115"/>
             <w:jc w:val="right"/>
           </w:pPr>
@@ -3542,14 +3550,14 @@
   </w:tbl>
   <w:p>
     <w:pPr>
-      <w:pStyle w:val="Encabezado"/>
+      <w:pStyle w:val="Header"/>
     </w:pPr>
   </w:p>
 </w:hdr>
 </file>
 
 <file path=word/numbering.xml><?xml version="1.0" encoding="utf-8"?>
-<w:numbering xmlns:wpc="http://schemas.microsoft.com/office/word/2010/wordprocessingCanvas" xmlns:cx="http://schemas.microsoft.com/office/drawing/2014/chartex" xmlns:cx1="http://schemas.microsoft.com/office/drawing/2015/9/8/chartex" xmlns:cx2="http://schemas.microsoft.com/office/drawing/2015/10/21/chartex" xmlns:cx3="http://schemas.microsoft.com/office/drawing/2016/5/9/chartex" xmlns:cx4="http://schemas.microsoft.com/office/drawing/2016/5/10/chartex" xmlns:cx5="http://schemas.microsoft.com/office/drawing/2016/5/11/chartex" xmlns:cx6="http://schemas.microsoft.com/office/drawing/2016/5/12/chartex" xmlns:cx7="http://schemas.microsoft.com/office/drawing/2016/5/13/chartex" xmlns:cx8="http://schemas.microsoft.com/office/drawing/2016/5/14/chartex" xmlns:mc="http://schemas.openxmlformats.org/markup-compatibility/2006" xmlns:aink="http://schemas.microsoft.com/office/drawing/2016/ink" xmlns:am3d="http://schemas.microsoft.com/office/drawing/2017/model3d" xmlns:o="urn:schemas-microsoft-com:office:office" xmlns:oel="http://schemas.microsoft.com/office/2019/extlst" xmlns:r="http://schemas.openxmlformats.org/officeDocument/2006/relationships" xmlns:m="http://schemas.openxmlformats.org/officeDocument/2006/math" xmlns:v="urn:schemas-microsoft-com:vml" xmlns:wp14="http://schemas.microsoft.com/office/word/2010/wordprocessingDrawing" xmlns:wp="http://schemas.openxmlformats.org/drawingml/2006/wordprocessingDrawing" xmlns:w10="urn:schemas-microsoft-com:office:word" xmlns:w="http://schemas.openxmlformats.org/wordprocessingml/2006/main" xmlns:w14="http://schemas.microsoft.com/office/word/2010/wordml" xmlns:w15="http://schemas.microsoft.com/office/word/2012/wordml" xmlns:w16cex="http://schemas.microsoft.com/office/word/2018/wordml/cex" xmlns:w16cid="http://schemas.microsoft.com/office/word/2016/wordml/cid" xmlns:w16="http://schemas.microsoft.com/office/word/2018/wordml" xmlns:w16sdtdh="http://schemas.microsoft.com/office/word/2020/wordml/sdtdatahash" xmlns:w16se="http://schemas.microsoft.com/office/word/2015/wordml/symex" xmlns:wpg="http://schemas.microsoft.com/office/word/2010/wordprocessingGroup" xmlns:wpi="http://schemas.microsoft.com/office/word/2010/wordprocessingInk" xmlns:wne="http://schemas.microsoft.com/office/word/2006/wordml" xmlns:wps="http://schemas.microsoft.com/office/word/2010/wordprocessingShape" mc:Ignorable="w14 w15 w16se w16cid w16 w16cex w16sdtdh wp14">
+<w:numbering xmlns:wpc="http://schemas.microsoft.com/office/word/2010/wordprocessingCanvas" xmlns:cx="http://schemas.microsoft.com/office/drawing/2014/chartex" xmlns:cx1="http://schemas.microsoft.com/office/drawing/2015/9/8/chartex" xmlns:cx2="http://schemas.microsoft.com/office/drawing/2015/10/21/chartex" xmlns:cx3="http://schemas.microsoft.com/office/drawing/2016/5/9/chartex" xmlns:cx4="http://schemas.microsoft.com/office/drawing/2016/5/10/chartex" xmlns:cx5="http://schemas.microsoft.com/office/drawing/2016/5/11/chartex" xmlns:cx6="http://schemas.microsoft.com/office/drawing/2016/5/12/chartex" xmlns:cx7="http://schemas.microsoft.com/office/drawing/2016/5/13/chartex" xmlns:cx8="http://schemas.microsoft.com/office/drawing/2016/5/14/chartex" xmlns:mc="http://schemas.openxmlformats.org/markup-compatibility/2006" xmlns:aink="http://schemas.microsoft.com/office/drawing/2016/ink" xmlns:am3d="http://schemas.microsoft.com/office/drawing/2017/model3d" xmlns:o="urn:schemas-microsoft-com:office:office" xmlns:oel="http://schemas.microsoft.com/office/2019/extlst" xmlns:r="http://schemas.openxmlformats.org/officeDocument/2006/relationships" xmlns:m="http://schemas.openxmlformats.org/officeDocument/2006/math" xmlns:v="urn:schemas-microsoft-com:vml" xmlns:wp14="http://schemas.microsoft.com/office/word/2010/wordprocessingDrawing" xmlns:wp="http://schemas.openxmlformats.org/drawingml/2006/wordprocessingDrawing" xmlns:w10="urn:schemas-microsoft-com:office:word" xmlns:w="http://schemas.openxmlformats.org/wordprocessingml/2006/main" xmlns:w14="http://schemas.microsoft.com/office/word/2010/wordml" xmlns:w15="http://schemas.microsoft.com/office/word/2012/wordml" xmlns:w16cex="http://schemas.microsoft.com/office/word/2018/wordml/cex" xmlns:w16cid="http://schemas.microsoft.com/office/word/2016/wordml/cid" xmlns:w16="http://schemas.microsoft.com/office/word/2018/wordml" xmlns:w16du="http://schemas.microsoft.com/office/word/2023/wordml/word16du" xmlns:w16sdtdh="http://schemas.microsoft.com/office/word/2020/wordml/sdtdatahash" xmlns:w16sdtfl="http://schemas.microsoft.com/office/word/2024/wordml/sdtformatlock" xmlns:w16se="http://schemas.microsoft.com/office/word/2015/wordml/symex" xmlns:wpg="http://schemas.microsoft.com/office/word/2010/wordprocessingGroup" xmlns:wpi="http://schemas.microsoft.com/office/word/2010/wordprocessingInk" xmlns:wne="http://schemas.microsoft.com/office/word/2006/wordml" xmlns:wps="http://schemas.microsoft.com/office/word/2010/wordprocessingShape" mc:Ignorable="w14 w15 w16se w16cid w16 w16cex w16sdtdh w16sdtfl w16du wp14">
   <w:abstractNum w:abstractNumId="0" w15:restartNumberingAfterBreak="0">
     <w:nsid w:val="0487CB84"/>
     <w:multiLevelType w:val="hybridMultilevel"/>
@@ -3648,7 +3656,7 @@
         <w:ind w:left="720" w:hanging="360"/>
       </w:pPr>
       <w:rPr>
-        <w:rFonts w:hint="default" w:ascii="Aptos" w:hAnsi="Aptos" w:eastAsiaTheme="minorHAnsi" w:cstheme="minorBidi"/>
+        <w:rFonts w:ascii="Aptos" w:eastAsiaTheme="minorHAnsi" w:hAnsi="Aptos" w:cstheme="minorBidi" w:hint="default"/>
         <w:b/>
       </w:rPr>
     </w:lvl>
@@ -3661,7 +3669,7 @@
         <w:ind w:left="1440" w:hanging="360"/>
       </w:pPr>
       <w:rPr>
-        <w:rFonts w:hint="default" w:ascii="Courier New" w:hAnsi="Courier New" w:cs="Courier New"/>
+        <w:rFonts w:ascii="Courier New" w:hAnsi="Courier New" w:cs="Courier New" w:hint="default"/>
       </w:rPr>
     </w:lvl>
     <w:lvl w:ilvl="2" w:tplc="0C0A0005" w:tentative="1">
@@ -3673,7 +3681,7 @@
         <w:ind w:left="2160" w:hanging="360"/>
       </w:pPr>
       <w:rPr>
-        <w:rFonts w:hint="default" w:ascii="Wingdings" w:hAnsi="Wingdings"/>
+        <w:rFonts w:ascii="Wingdings" w:hAnsi="Wingdings" w:hint="default"/>
       </w:rPr>
     </w:lvl>
     <w:lvl w:ilvl="3" w:tplc="0C0A0001" w:tentative="1">
@@ -3685,7 +3693,7 @@
         <w:ind w:left="2880" w:hanging="360"/>
       </w:pPr>
       <w:rPr>
-        <w:rFonts w:hint="default" w:ascii="Symbol" w:hAnsi="Symbol"/>
+        <w:rFonts w:ascii="Symbol" w:hAnsi="Symbol" w:hint="default"/>
       </w:rPr>
     </w:lvl>
     <w:lvl w:ilvl="4" w:tplc="0C0A0003" w:tentative="1">
@@ -3697,7 +3705,7 @@
         <w:ind w:left="3600" w:hanging="360"/>
       </w:pPr>
       <w:rPr>
-        <w:rFonts w:hint="default" w:ascii="Courier New" w:hAnsi="Courier New" w:cs="Courier New"/>
+        <w:rFonts w:ascii="Courier New" w:hAnsi="Courier New" w:cs="Courier New" w:hint="default"/>
       </w:rPr>
     </w:lvl>
     <w:lvl w:ilvl="5" w:tplc="0C0A0005" w:tentative="1">
@@ -3709,7 +3717,7 @@
         <w:ind w:left="4320" w:hanging="360"/>
       </w:pPr>
       <w:rPr>
-        <w:rFonts w:hint="default" w:ascii="Wingdings" w:hAnsi="Wingdings"/>
+        <w:rFonts w:ascii="Wingdings" w:hAnsi="Wingdings" w:hint="default"/>
       </w:rPr>
     </w:lvl>
     <w:lvl w:ilvl="6" w:tplc="0C0A0001" w:tentative="1">
@@ -3721,7 +3729,7 @@
         <w:ind w:left="5040" w:hanging="360"/>
       </w:pPr>
       <w:rPr>
-        <w:rFonts w:hint="default" w:ascii="Symbol" w:hAnsi="Symbol"/>
+        <w:rFonts w:ascii="Symbol" w:hAnsi="Symbol" w:hint="default"/>
       </w:rPr>
     </w:lvl>
     <w:lvl w:ilvl="7" w:tplc="0C0A0003" w:tentative="1">
@@ -3733,7 +3741,7 @@
         <w:ind w:left="5760" w:hanging="360"/>
       </w:pPr>
       <w:rPr>
-        <w:rFonts w:hint="default" w:ascii="Courier New" w:hAnsi="Courier New" w:cs="Courier New"/>
+        <w:rFonts w:ascii="Courier New" w:hAnsi="Courier New" w:cs="Courier New" w:hint="default"/>
       </w:rPr>
     </w:lvl>
     <w:lvl w:ilvl="8" w:tplc="0C0A0005" w:tentative="1">
@@ -3745,7 +3753,7 @@
         <w:ind w:left="6480" w:hanging="360"/>
       </w:pPr>
       <w:rPr>
-        <w:rFonts w:hint="default" w:ascii="Wingdings" w:hAnsi="Wingdings"/>
+        <w:rFonts w:ascii="Wingdings" w:hAnsi="Wingdings" w:hint="default"/>
       </w:rPr>
     </w:lvl>
   </w:abstractNum>
@@ -3762,7 +3770,7 @@
         <w:ind w:left="720" w:hanging="360"/>
       </w:pPr>
       <w:rPr>
-        <w:rFonts w:hint="default" w:ascii="Symbol" w:hAnsi="Symbol"/>
+        <w:rFonts w:ascii="Symbol" w:hAnsi="Symbol" w:hint="default"/>
       </w:rPr>
     </w:lvl>
     <w:lvl w:ilvl="1" w:tplc="C7A49B12">
@@ -3774,7 +3782,7 @@
         <w:ind w:left="1440" w:hanging="360"/>
       </w:pPr>
       <w:rPr>
-        <w:rFonts w:hint="default" w:ascii="Courier New" w:hAnsi="Courier New"/>
+        <w:rFonts w:ascii="Courier New" w:hAnsi="Courier New" w:hint="default"/>
       </w:rPr>
     </w:lvl>
     <w:lvl w:ilvl="2" w:tplc="A9C0986C">
@@ -3786,7 +3794,7 @@
         <w:ind w:left="2160" w:hanging="360"/>
       </w:pPr>
       <w:rPr>
-        <w:rFonts w:hint="default" w:ascii="Wingdings" w:hAnsi="Wingdings"/>
+        <w:rFonts w:ascii="Wingdings" w:hAnsi="Wingdings" w:hint="default"/>
       </w:rPr>
     </w:lvl>
     <w:lvl w:ilvl="3" w:tplc="04EAD070">
@@ -3798,7 +3806,7 @@
         <w:ind w:left="2880" w:hanging="360"/>
       </w:pPr>
       <w:rPr>
-        <w:rFonts w:hint="default" w:ascii="Symbol" w:hAnsi="Symbol"/>
+        <w:rFonts w:ascii="Symbol" w:hAnsi="Symbol" w:hint="default"/>
       </w:rPr>
     </w:lvl>
     <w:lvl w:ilvl="4" w:tplc="02CA71CA">
@@ -3810,7 +3818,7 @@
         <w:ind w:left="3600" w:hanging="360"/>
       </w:pPr>
       <w:rPr>
-        <w:rFonts w:hint="default" w:ascii="Courier New" w:hAnsi="Courier New"/>
+        <w:rFonts w:ascii="Courier New" w:hAnsi="Courier New" w:hint="default"/>
       </w:rPr>
     </w:lvl>
     <w:lvl w:ilvl="5" w:tplc="E022392C">
@@ -3822,7 +3830,7 @@
         <w:ind w:left="4320" w:hanging="360"/>
       </w:pPr>
       <w:rPr>
-        <w:rFonts w:hint="default" w:ascii="Wingdings" w:hAnsi="Wingdings"/>
+        <w:rFonts w:ascii="Wingdings" w:hAnsi="Wingdings" w:hint="default"/>
       </w:rPr>
     </w:lvl>
     <w:lvl w:ilvl="6" w:tplc="C3F4F482">
@@ -3834,7 +3842,7 @@
         <w:ind w:left="5040" w:hanging="360"/>
       </w:pPr>
       <w:rPr>
-        <w:rFonts w:hint="default" w:ascii="Symbol" w:hAnsi="Symbol"/>
+        <w:rFonts w:ascii="Symbol" w:hAnsi="Symbol" w:hint="default"/>
       </w:rPr>
     </w:lvl>
     <w:lvl w:ilvl="7" w:tplc="9FE21CC2">
@@ -3846,7 +3854,7 @@
         <w:ind w:left="5760" w:hanging="360"/>
       </w:pPr>
       <w:rPr>
-        <w:rFonts w:hint="default" w:ascii="Courier New" w:hAnsi="Courier New"/>
+        <w:rFonts w:ascii="Courier New" w:hAnsi="Courier New" w:hint="default"/>
       </w:rPr>
     </w:lvl>
     <w:lvl w:ilvl="8" w:tplc="B7B64906">
@@ -3858,7 +3866,7 @@
         <w:ind w:left="6480" w:hanging="360"/>
       </w:pPr>
       <w:rPr>
-        <w:rFonts w:hint="default" w:ascii="Wingdings" w:hAnsi="Wingdings"/>
+        <w:rFonts w:ascii="Wingdings" w:hAnsi="Wingdings" w:hint="default"/>
       </w:rPr>
     </w:lvl>
   </w:abstractNum>
@@ -3875,7 +3883,7 @@
         <w:ind w:left="720" w:hanging="360"/>
       </w:pPr>
       <w:rPr>
-        <w:rFonts w:hint="default" w:ascii="Aptos" w:hAnsi="Aptos"/>
+        <w:rFonts w:ascii="Aptos" w:hAnsi="Aptos" w:hint="default"/>
       </w:rPr>
     </w:lvl>
     <w:lvl w:ilvl="1" w:tplc="85C8F142">
@@ -3887,7 +3895,7 @@
         <w:ind w:left="1440" w:hanging="360"/>
       </w:pPr>
       <w:rPr>
-        <w:rFonts w:hint="default" w:ascii="Courier New" w:hAnsi="Courier New"/>
+        <w:rFonts w:ascii="Courier New" w:hAnsi="Courier New" w:hint="default"/>
       </w:rPr>
     </w:lvl>
     <w:lvl w:ilvl="2" w:tplc="08BC7CBA">
@@ -3899,7 +3907,7 @@
         <w:ind w:left="2160" w:hanging="360"/>
       </w:pPr>
       <w:rPr>
-        <w:rFonts w:hint="default" w:ascii="Wingdings" w:hAnsi="Wingdings"/>
+        <w:rFonts w:ascii="Wingdings" w:hAnsi="Wingdings" w:hint="default"/>
       </w:rPr>
     </w:lvl>
     <w:lvl w:ilvl="3" w:tplc="54ACAEE6">
@@ -3911,7 +3919,7 @@
         <w:ind w:left="2880" w:hanging="360"/>
       </w:pPr>
       <w:rPr>
-        <w:rFonts w:hint="default" w:ascii="Symbol" w:hAnsi="Symbol"/>
+        <w:rFonts w:ascii="Symbol" w:hAnsi="Symbol" w:hint="default"/>
       </w:rPr>
     </w:lvl>
     <w:lvl w:ilvl="4" w:tplc="28968DE6">
@@ -3923,7 +3931,7 @@
         <w:ind w:left="3600" w:hanging="360"/>
       </w:pPr>
       <w:rPr>
-        <w:rFonts w:hint="default" w:ascii="Courier New" w:hAnsi="Courier New"/>
+        <w:rFonts w:ascii="Courier New" w:hAnsi="Courier New" w:hint="default"/>
       </w:rPr>
     </w:lvl>
     <w:lvl w:ilvl="5" w:tplc="159ECA94">
@@ -3935,7 +3943,7 @@
         <w:ind w:left="4320" w:hanging="360"/>
       </w:pPr>
       <w:rPr>
-        <w:rFonts w:hint="default" w:ascii="Wingdings" w:hAnsi="Wingdings"/>
+        <w:rFonts w:ascii="Wingdings" w:hAnsi="Wingdings" w:hint="default"/>
       </w:rPr>
     </w:lvl>
     <w:lvl w:ilvl="6" w:tplc="22323CE6">
@@ -3947,7 +3955,7 @@
         <w:ind w:left="5040" w:hanging="360"/>
       </w:pPr>
       <w:rPr>
-        <w:rFonts w:hint="default" w:ascii="Symbol" w:hAnsi="Symbol"/>
+        <w:rFonts w:ascii="Symbol" w:hAnsi="Symbol" w:hint="default"/>
       </w:rPr>
     </w:lvl>
     <w:lvl w:ilvl="7" w:tplc="A9B04CD6">
@@ -3959,7 +3967,7 @@
         <w:ind w:left="5760" w:hanging="360"/>
       </w:pPr>
       <w:rPr>
-        <w:rFonts w:hint="default" w:ascii="Courier New" w:hAnsi="Courier New"/>
+        <w:rFonts w:ascii="Courier New" w:hAnsi="Courier New" w:hint="default"/>
       </w:rPr>
     </w:lvl>
     <w:lvl w:ilvl="8" w:tplc="2EEA23B4">
@@ -3971,7 +3979,7 @@
         <w:ind w:left="6480" w:hanging="360"/>
       </w:pPr>
       <w:rPr>
-        <w:rFonts w:hint="default" w:ascii="Wingdings" w:hAnsi="Wingdings"/>
+        <w:rFonts w:ascii="Wingdings" w:hAnsi="Wingdings" w:hint="default"/>
       </w:rPr>
     </w:lvl>
   </w:abstractNum>
@@ -4077,7 +4085,7 @@
         <w:ind w:left="720" w:hanging="360"/>
       </w:pPr>
       <w:rPr>
-        <w:rFonts w:hint="default" w:ascii="Symbol" w:hAnsi="Symbol"/>
+        <w:rFonts w:ascii="Symbol" w:hAnsi="Symbol" w:hint="default"/>
         <w:sz w:val="20"/>
       </w:rPr>
     </w:lvl>
@@ -4093,7 +4101,7 @@
         <w:ind w:left="1440" w:hanging="360"/>
       </w:pPr>
       <w:rPr>
-        <w:rFonts w:hint="default" w:ascii="Courier New" w:hAnsi="Courier New"/>
+        <w:rFonts w:ascii="Courier New" w:hAnsi="Courier New" w:hint="default"/>
         <w:sz w:val="20"/>
       </w:rPr>
     </w:lvl>
@@ -4109,7 +4117,7 @@
         <w:ind w:left="2160" w:hanging="360"/>
       </w:pPr>
       <w:rPr>
-        <w:rFonts w:hint="default" w:ascii="Wingdings" w:hAnsi="Wingdings"/>
+        <w:rFonts w:ascii="Wingdings" w:hAnsi="Wingdings" w:hint="default"/>
         <w:sz w:val="20"/>
       </w:rPr>
     </w:lvl>
@@ -4125,7 +4133,7 @@
         <w:ind w:left="2880" w:hanging="360"/>
       </w:pPr>
       <w:rPr>
-        <w:rFonts w:hint="default" w:ascii="Wingdings" w:hAnsi="Wingdings"/>
+        <w:rFonts w:ascii="Wingdings" w:hAnsi="Wingdings" w:hint="default"/>
         <w:sz w:val="20"/>
       </w:rPr>
     </w:lvl>
@@ -4141,7 +4149,7 @@
         <w:ind w:left="3600" w:hanging="360"/>
       </w:pPr>
       <w:rPr>
-        <w:rFonts w:hint="default" w:ascii="Wingdings" w:hAnsi="Wingdings"/>
+        <w:rFonts w:ascii="Wingdings" w:hAnsi="Wingdings" w:hint="default"/>
         <w:sz w:val="20"/>
       </w:rPr>
     </w:lvl>
@@ -4157,7 +4165,7 @@
         <w:ind w:left="4320" w:hanging="360"/>
       </w:pPr>
       <w:rPr>
-        <w:rFonts w:hint="default" w:ascii="Wingdings" w:hAnsi="Wingdings"/>
+        <w:rFonts w:ascii="Wingdings" w:hAnsi="Wingdings" w:hint="default"/>
         <w:sz w:val="20"/>
       </w:rPr>
     </w:lvl>
@@ -4173,7 +4181,7 @@
         <w:ind w:left="5040" w:hanging="360"/>
       </w:pPr>
       <w:rPr>
-        <w:rFonts w:hint="default" w:ascii="Wingdings" w:hAnsi="Wingdings"/>
+        <w:rFonts w:ascii="Wingdings" w:hAnsi="Wingdings" w:hint="default"/>
         <w:sz w:val="20"/>
       </w:rPr>
     </w:lvl>
@@ -4189,7 +4197,7 @@
         <w:ind w:left="5760" w:hanging="360"/>
       </w:pPr>
       <w:rPr>
-        <w:rFonts w:hint="default" w:ascii="Wingdings" w:hAnsi="Wingdings"/>
+        <w:rFonts w:ascii="Wingdings" w:hAnsi="Wingdings" w:hint="default"/>
         <w:sz w:val="20"/>
       </w:rPr>
     </w:lvl>
@@ -4205,7 +4213,7 @@
         <w:ind w:left="6480" w:hanging="360"/>
       </w:pPr>
       <w:rPr>
-        <w:rFonts w:hint="default" w:ascii="Wingdings" w:hAnsi="Wingdings"/>
+        <w:rFonts w:ascii="Wingdings" w:hAnsi="Wingdings" w:hint="default"/>
         <w:sz w:val="20"/>
       </w:rPr>
     </w:lvl>
@@ -4226,7 +4234,7 @@
         <w:ind w:left="720" w:hanging="360"/>
       </w:pPr>
       <w:rPr>
-        <w:rFonts w:hint="default" w:ascii="Symbol" w:hAnsi="Symbol"/>
+        <w:rFonts w:ascii="Symbol" w:hAnsi="Symbol" w:hint="default"/>
         <w:sz w:val="20"/>
       </w:rPr>
     </w:lvl>
@@ -4242,7 +4250,7 @@
         <w:ind w:left="1440" w:hanging="360"/>
       </w:pPr>
       <w:rPr>
-        <w:rFonts w:hint="default" w:ascii="Courier New" w:hAnsi="Courier New"/>
+        <w:rFonts w:ascii="Courier New" w:hAnsi="Courier New" w:hint="default"/>
         <w:sz w:val="20"/>
       </w:rPr>
     </w:lvl>
@@ -4258,7 +4266,7 @@
         <w:ind w:left="2160" w:hanging="360"/>
       </w:pPr>
       <w:rPr>
-        <w:rFonts w:hint="default" w:ascii="Wingdings" w:hAnsi="Wingdings"/>
+        <w:rFonts w:ascii="Wingdings" w:hAnsi="Wingdings" w:hint="default"/>
         <w:sz w:val="20"/>
       </w:rPr>
     </w:lvl>
@@ -4274,7 +4282,7 @@
         <w:ind w:left="2880" w:hanging="360"/>
       </w:pPr>
       <w:rPr>
-        <w:rFonts w:hint="default" w:ascii="Wingdings" w:hAnsi="Wingdings"/>
+        <w:rFonts w:ascii="Wingdings" w:hAnsi="Wingdings" w:hint="default"/>
         <w:sz w:val="20"/>
       </w:rPr>
     </w:lvl>
@@ -4290,7 +4298,7 @@
         <w:ind w:left="3600" w:hanging="360"/>
       </w:pPr>
       <w:rPr>
-        <w:rFonts w:hint="default" w:ascii="Wingdings" w:hAnsi="Wingdings"/>
+        <w:rFonts w:ascii="Wingdings" w:hAnsi="Wingdings" w:hint="default"/>
         <w:sz w:val="20"/>
       </w:rPr>
     </w:lvl>
@@ -4306,7 +4314,7 @@
         <w:ind w:left="4320" w:hanging="360"/>
       </w:pPr>
       <w:rPr>
-        <w:rFonts w:hint="default" w:ascii="Wingdings" w:hAnsi="Wingdings"/>
+        <w:rFonts w:ascii="Wingdings" w:hAnsi="Wingdings" w:hint="default"/>
         <w:sz w:val="20"/>
       </w:rPr>
     </w:lvl>
@@ -4322,7 +4330,7 @@
         <w:ind w:left="5040" w:hanging="360"/>
       </w:pPr>
       <w:rPr>
-        <w:rFonts w:hint="default" w:ascii="Wingdings" w:hAnsi="Wingdings"/>
+        <w:rFonts w:ascii="Wingdings" w:hAnsi="Wingdings" w:hint="default"/>
         <w:sz w:val="20"/>
       </w:rPr>
     </w:lvl>
@@ -4338,7 +4346,7 @@
         <w:ind w:left="5760" w:hanging="360"/>
       </w:pPr>
       <w:rPr>
-        <w:rFonts w:hint="default" w:ascii="Wingdings" w:hAnsi="Wingdings"/>
+        <w:rFonts w:ascii="Wingdings" w:hAnsi="Wingdings" w:hint="default"/>
         <w:sz w:val="20"/>
       </w:rPr>
     </w:lvl>
@@ -4354,7 +4362,7 @@
         <w:ind w:left="6480" w:hanging="360"/>
       </w:pPr>
       <w:rPr>
-        <w:rFonts w:hint="default" w:ascii="Wingdings" w:hAnsi="Wingdings"/>
+        <w:rFonts w:ascii="Wingdings" w:hAnsi="Wingdings" w:hint="default"/>
         <w:sz w:val="20"/>
       </w:rPr>
     </w:lvl>
@@ -4372,7 +4380,7 @@
         <w:ind w:left="720" w:hanging="360"/>
       </w:pPr>
       <w:rPr>
-        <w:rFonts w:hint="default" w:ascii="Symbol" w:hAnsi="Symbol"/>
+        <w:rFonts w:ascii="Symbol" w:hAnsi="Symbol" w:hint="default"/>
       </w:rPr>
     </w:lvl>
     <w:lvl w:ilvl="1" w:tplc="F1223098">
@@ -4384,7 +4392,7 @@
         <w:ind w:left="1440" w:hanging="360"/>
       </w:pPr>
       <w:rPr>
-        <w:rFonts w:hint="default" w:ascii="Courier New" w:hAnsi="Courier New"/>
+        <w:rFonts w:ascii="Courier New" w:hAnsi="Courier New" w:hint="default"/>
       </w:rPr>
     </w:lvl>
     <w:lvl w:ilvl="2" w:tplc="A330F532">
@@ -4396,7 +4404,7 @@
         <w:ind w:left="2160" w:hanging="360"/>
       </w:pPr>
       <w:rPr>
-        <w:rFonts w:hint="default" w:ascii="Wingdings" w:hAnsi="Wingdings"/>
+        <w:rFonts w:ascii="Wingdings" w:hAnsi="Wingdings" w:hint="default"/>
       </w:rPr>
     </w:lvl>
     <w:lvl w:ilvl="3" w:tplc="22A44CE6">
@@ -4408,7 +4416,7 @@
         <w:ind w:left="2880" w:hanging="360"/>
       </w:pPr>
       <w:rPr>
-        <w:rFonts w:hint="default" w:ascii="Symbol" w:hAnsi="Symbol"/>
+        <w:rFonts w:ascii="Symbol" w:hAnsi="Symbol" w:hint="default"/>
       </w:rPr>
     </w:lvl>
     <w:lvl w:ilvl="4" w:tplc="967A5EE0">
@@ -4420,7 +4428,7 @@
         <w:ind w:left="3600" w:hanging="360"/>
       </w:pPr>
       <w:rPr>
-        <w:rFonts w:hint="default" w:ascii="Courier New" w:hAnsi="Courier New"/>
+        <w:rFonts w:ascii="Courier New" w:hAnsi="Courier New" w:hint="default"/>
       </w:rPr>
     </w:lvl>
     <w:lvl w:ilvl="5" w:tplc="3EE2B056">
@@ -4432,7 +4440,7 @@
         <w:ind w:left="4320" w:hanging="360"/>
       </w:pPr>
       <w:rPr>
-        <w:rFonts w:hint="default" w:ascii="Wingdings" w:hAnsi="Wingdings"/>
+        <w:rFonts w:ascii="Wingdings" w:hAnsi="Wingdings" w:hint="default"/>
       </w:rPr>
     </w:lvl>
     <w:lvl w:ilvl="6" w:tplc="72580A12">
@@ -4444,7 +4452,7 @@
         <w:ind w:left="5040" w:hanging="360"/>
       </w:pPr>
       <w:rPr>
-        <w:rFonts w:hint="default" w:ascii="Symbol" w:hAnsi="Symbol"/>
+        <w:rFonts w:ascii="Symbol" w:hAnsi="Symbol" w:hint="default"/>
       </w:rPr>
     </w:lvl>
     <w:lvl w:ilvl="7" w:tplc="C878479A">
@@ -4456,7 +4464,7 @@
         <w:ind w:left="5760" w:hanging="360"/>
       </w:pPr>
       <w:rPr>
-        <w:rFonts w:hint="default" w:ascii="Courier New" w:hAnsi="Courier New"/>
+        <w:rFonts w:ascii="Courier New" w:hAnsi="Courier New" w:hint="default"/>
       </w:rPr>
     </w:lvl>
     <w:lvl w:ilvl="8" w:tplc="740EBA06">
@@ -4468,7 +4476,7 @@
         <w:ind w:left="6480" w:hanging="360"/>
       </w:pPr>
       <w:rPr>
-        <w:rFonts w:hint="default" w:ascii="Wingdings" w:hAnsi="Wingdings"/>
+        <w:rFonts w:ascii="Wingdings" w:hAnsi="Wingdings" w:hint="default"/>
       </w:rPr>
     </w:lvl>
   </w:abstractNum>
@@ -4657,7 +4665,7 @@
         <w:ind w:left="720" w:hanging="360"/>
       </w:pPr>
       <w:rPr>
-        <w:rFonts w:hint="default" w:ascii="Symbol" w:hAnsi="Symbol"/>
+        <w:rFonts w:ascii="Symbol" w:hAnsi="Symbol" w:hint="default"/>
       </w:rPr>
     </w:lvl>
     <w:lvl w:ilvl="1" w:tplc="F774E9DC">
@@ -4669,7 +4677,7 @@
         <w:ind w:left="1440" w:hanging="360"/>
       </w:pPr>
       <w:rPr>
-        <w:rFonts w:hint="default" w:ascii="Courier New" w:hAnsi="Courier New"/>
+        <w:rFonts w:ascii="Courier New" w:hAnsi="Courier New" w:hint="default"/>
       </w:rPr>
     </w:lvl>
     <w:lvl w:ilvl="2" w:tplc="40D81BD6">
@@ -4681,7 +4689,7 @@
         <w:ind w:left="2160" w:hanging="360"/>
       </w:pPr>
       <w:rPr>
-        <w:rFonts w:hint="default" w:ascii="Wingdings" w:hAnsi="Wingdings"/>
+        <w:rFonts w:ascii="Wingdings" w:hAnsi="Wingdings" w:hint="default"/>
       </w:rPr>
     </w:lvl>
     <w:lvl w:ilvl="3" w:tplc="38E4E478">
@@ -4693,7 +4701,7 @@
         <w:ind w:left="2880" w:hanging="360"/>
       </w:pPr>
       <w:rPr>
-        <w:rFonts w:hint="default" w:ascii="Symbol" w:hAnsi="Symbol"/>
+        <w:rFonts w:ascii="Symbol" w:hAnsi="Symbol" w:hint="default"/>
       </w:rPr>
     </w:lvl>
     <w:lvl w:ilvl="4" w:tplc="8208E3BE">
@@ -4705,7 +4713,7 @@
         <w:ind w:left="3600" w:hanging="360"/>
       </w:pPr>
       <w:rPr>
-        <w:rFonts w:hint="default" w:ascii="Courier New" w:hAnsi="Courier New"/>
+        <w:rFonts w:ascii="Courier New" w:hAnsi="Courier New" w:hint="default"/>
       </w:rPr>
     </w:lvl>
     <w:lvl w:ilvl="5" w:tplc="9E50D772">
@@ -4717,7 +4725,7 @@
         <w:ind w:left="4320" w:hanging="360"/>
       </w:pPr>
       <w:rPr>
-        <w:rFonts w:hint="default" w:ascii="Wingdings" w:hAnsi="Wingdings"/>
+        <w:rFonts w:ascii="Wingdings" w:hAnsi="Wingdings" w:hint="default"/>
       </w:rPr>
     </w:lvl>
     <w:lvl w:ilvl="6" w:tplc="E334D1FE">
@@ -4729,7 +4737,7 @@
         <w:ind w:left="5040" w:hanging="360"/>
       </w:pPr>
       <w:rPr>
-        <w:rFonts w:hint="default" w:ascii="Symbol" w:hAnsi="Symbol"/>
+        <w:rFonts w:ascii="Symbol" w:hAnsi="Symbol" w:hint="default"/>
       </w:rPr>
     </w:lvl>
     <w:lvl w:ilvl="7" w:tplc="994A49E4">
@@ -4741,7 +4749,7 @@
         <w:ind w:left="5760" w:hanging="360"/>
       </w:pPr>
       <w:rPr>
-        <w:rFonts w:hint="default" w:ascii="Courier New" w:hAnsi="Courier New"/>
+        <w:rFonts w:ascii="Courier New" w:hAnsi="Courier New" w:hint="default"/>
       </w:rPr>
     </w:lvl>
     <w:lvl w:ilvl="8" w:tplc="1910CBC0">
@@ -4753,7 +4761,7 @@
         <w:ind w:left="6480" w:hanging="360"/>
       </w:pPr>
       <w:rPr>
-        <w:rFonts w:hint="default" w:ascii="Wingdings" w:hAnsi="Wingdings"/>
+        <w:rFonts w:ascii="Wingdings" w:hAnsi="Wingdings" w:hint="default"/>
       </w:rPr>
     </w:lvl>
   </w:abstractNum>
@@ -4929,54 +4937,54 @@
       </w:pPr>
     </w:lvl>
   </w:abstractNum>
-  <w:num w:numId="1" w16cid:durableId="1817332283">
-    <w:abstractNumId w:val="8"/>
+  <w:num w:numId="1" w16cid:durableId="1015545936">
+    <w:abstractNumId w:val="7"/>
   </w:num>
-  <w:num w:numId="2" w16cid:durableId="571618663">
-    <w:abstractNumId w:val="4"/>
+  <w:num w:numId="2" w16cid:durableId="1048988523">
+    <w:abstractNumId w:val="3"/>
   </w:num>
   <w:num w:numId="3" w16cid:durableId="13844102">
     <w:abstractNumId w:val="2"/>
   </w:num>
-  <w:num w:numId="4" w16cid:durableId="1015545936">
-    <w:abstractNumId w:val="7"/>
+  <w:num w:numId="4" w16cid:durableId="1421953723">
+    <w:abstractNumId w:val="5"/>
   </w:num>
   <w:num w:numId="5" w16cid:durableId="1452282957">
     <w:abstractNumId w:val="11"/>
   </w:num>
-  <w:num w:numId="6" w16cid:durableId="433742685">
+  <w:num w:numId="6" w16cid:durableId="1567379756">
+    <w:abstractNumId w:val="6"/>
+  </w:num>
+  <w:num w:numId="7" w16cid:durableId="1817332283">
+    <w:abstractNumId w:val="8"/>
+  </w:num>
+  <w:num w:numId="8" w16cid:durableId="2084403704">
+    <w:abstractNumId w:val="1"/>
+  </w:num>
+  <w:num w:numId="9" w16cid:durableId="433742685">
     <w:abstractNumId w:val="10"/>
   </w:num>
-  <w:num w:numId="7" w16cid:durableId="702362505">
+  <w:num w:numId="10" w16cid:durableId="571618663">
+    <w:abstractNumId w:val="4"/>
+  </w:num>
+  <w:num w:numId="11" w16cid:durableId="612130589">
+    <w:abstractNumId w:val="12"/>
+  </w:num>
+  <w:num w:numId="12" w16cid:durableId="702362505">
     <w:abstractNumId w:val="9"/>
   </w:num>
-  <w:num w:numId="8" w16cid:durableId="612130589">
-    <w:abstractNumId w:val="12"/>
-  </w:num>
-  <w:num w:numId="9" w16cid:durableId="97798789">
+  <w:num w:numId="13" w16cid:durableId="97798789">
     <w:abstractNumId w:val="0"/>
-  </w:num>
-  <w:num w:numId="10" w16cid:durableId="1048988523">
-    <w:abstractNumId w:val="3"/>
-  </w:num>
-  <w:num w:numId="11" w16cid:durableId="1567379756">
-    <w:abstractNumId w:val="6"/>
-  </w:num>
-  <w:num w:numId="12" w16cid:durableId="1421953723">
-    <w:abstractNumId w:val="5"/>
-  </w:num>
-  <w:num w:numId="13" w16cid:durableId="2084403704">
-    <w:abstractNumId w:val="1"/>
   </w:num>
 </w:numbering>
 </file>
 
 <file path=word/styles.xml><?xml version="1.0" encoding="utf-8"?>
-<w:styles xmlns:mc="http://schemas.openxmlformats.org/markup-compatibility/2006" xmlns:r="http://schemas.openxmlformats.org/officeDocument/2006/relationships" xmlns:w="http://schemas.openxmlformats.org/wordprocessingml/2006/main" xmlns:w14="http://schemas.microsoft.com/office/word/2010/wordml" xmlns:w15="http://schemas.microsoft.com/office/word/2012/wordml" xmlns:w16cex="http://schemas.microsoft.com/office/word/2018/wordml/cex" xmlns:w16cid="http://schemas.microsoft.com/office/word/2016/wordml/cid" xmlns:w16="http://schemas.microsoft.com/office/word/2018/wordml" xmlns:w16sdtdh="http://schemas.microsoft.com/office/word/2020/wordml/sdtdatahash" xmlns:w16se="http://schemas.microsoft.com/office/word/2015/wordml/symex" mc:Ignorable="w14 w15 w16se w16cid w16 w16cex w16sdtdh">
+<w:styles xmlns:mc="http://schemas.openxmlformats.org/markup-compatibility/2006" xmlns:r="http://schemas.openxmlformats.org/officeDocument/2006/relationships" xmlns:w="http://schemas.openxmlformats.org/wordprocessingml/2006/main" xmlns:w14="http://schemas.microsoft.com/office/word/2010/wordml" xmlns:w15="http://schemas.microsoft.com/office/word/2012/wordml" xmlns:w16cex="http://schemas.microsoft.com/office/word/2018/wordml/cex" xmlns:w16cid="http://schemas.microsoft.com/office/word/2016/wordml/cid" xmlns:w16="http://schemas.microsoft.com/office/word/2018/wordml" xmlns:w16du="http://schemas.microsoft.com/office/word/2023/wordml/word16du" xmlns:w16sdtdh="http://schemas.microsoft.com/office/word/2020/wordml/sdtdatahash" xmlns:w16sdtfl="http://schemas.microsoft.com/office/word/2024/wordml/sdtformatlock" xmlns:w16se="http://schemas.microsoft.com/office/word/2015/wordml/symex" mc:Ignorable="w14 w15 w16se w16cid w16 w16cex w16sdtdh w16sdtfl w16du">
   <w:docDefaults>
     <w:rPrDefault>
       <w:rPr>
-        <w:rFonts w:asciiTheme="minorHAnsi" w:hAnsiTheme="minorHAnsi" w:eastAsiaTheme="minorHAnsi" w:cstheme="minorBidi"/>
+        <w:rFonts w:asciiTheme="minorHAnsi" w:eastAsiaTheme="minorHAnsi" w:hAnsiTheme="minorHAnsi" w:cstheme="minorBidi"/>
         <w:sz w:val="24"/>
         <w:szCs w:val="24"/>
         <w:lang w:val="es-ES" w:eastAsia="en-US" w:bidi="ar-SA"/>
@@ -4991,14 +4999,14 @@
   <w:latentStyles w:defLockedState="0" w:defUIPriority="99" w:defSemiHidden="0" w:defUnhideWhenUsed="0" w:defQFormat="0" w:count="376">
     <w:lsdException w:name="Normal" w:uiPriority="0" w:qFormat="1"/>
     <w:lsdException w:name="heading 1" w:uiPriority="9" w:qFormat="1"/>
-    <w:lsdException w:name="heading 2" w:uiPriority="9" w:semiHidden="1" w:unhideWhenUsed="1" w:qFormat="1"/>
-    <w:lsdException w:name="heading 3" w:uiPriority="9" w:semiHidden="1" w:unhideWhenUsed="1" w:qFormat="1"/>
-    <w:lsdException w:name="heading 4" w:uiPriority="9" w:semiHidden="1" w:unhideWhenUsed="1" w:qFormat="1"/>
-    <w:lsdException w:name="heading 5" w:uiPriority="9" w:semiHidden="1" w:unhideWhenUsed="1" w:qFormat="1"/>
-    <w:lsdException w:name="heading 6" w:uiPriority="9" w:semiHidden="1" w:unhideWhenUsed="1" w:qFormat="1"/>
-    <w:lsdException w:name="heading 7" w:uiPriority="9" w:semiHidden="1" w:unhideWhenUsed="1" w:qFormat="1"/>
-    <w:lsdException w:name="heading 8" w:uiPriority="9" w:semiHidden="1" w:unhideWhenUsed="1" w:qFormat="1"/>
-    <w:lsdException w:name="heading 9" w:uiPriority="9" w:semiHidden="1" w:unhideWhenUsed="1" w:qFormat="1"/>
+    <w:lsdException w:name="heading 2" w:semiHidden="1" w:uiPriority="9" w:unhideWhenUsed="1" w:qFormat="1"/>
+    <w:lsdException w:name="heading 3" w:semiHidden="1" w:uiPriority="9" w:unhideWhenUsed="1" w:qFormat="1"/>
+    <w:lsdException w:name="heading 4" w:semiHidden="1" w:uiPriority="9" w:unhideWhenUsed="1" w:qFormat="1"/>
+    <w:lsdException w:name="heading 5" w:semiHidden="1" w:uiPriority="9" w:unhideWhenUsed="1" w:qFormat="1"/>
+    <w:lsdException w:name="heading 6" w:semiHidden="1" w:uiPriority="9" w:unhideWhenUsed="1" w:qFormat="1"/>
+    <w:lsdException w:name="heading 7" w:semiHidden="1" w:uiPriority="9" w:unhideWhenUsed="1" w:qFormat="1"/>
+    <w:lsdException w:name="heading 8" w:semiHidden="1" w:uiPriority="9" w:unhideWhenUsed="1" w:qFormat="1"/>
+    <w:lsdException w:name="heading 9" w:semiHidden="1" w:uiPriority="9" w:unhideWhenUsed="1" w:qFormat="1"/>
     <w:lsdException w:name="index 1" w:semiHidden="1" w:unhideWhenUsed="1"/>
     <w:lsdException w:name="index 2" w:semiHidden="1" w:unhideWhenUsed="1"/>
     <w:lsdException w:name="index 3" w:semiHidden="1" w:unhideWhenUsed="1"/>
@@ -5008,22 +5016,22 @@
     <w:lsdException w:name="index 7" w:semiHidden="1" w:unhideWhenUsed="1"/>
     <w:lsdException w:name="index 8" w:semiHidden="1" w:unhideWhenUsed="1"/>
     <w:lsdException w:name="index 9" w:semiHidden="1" w:unhideWhenUsed="1"/>
-    <w:lsdException w:name="toc 1" w:uiPriority="39" w:semiHidden="1" w:unhideWhenUsed="1"/>
-    <w:lsdException w:name="toc 2" w:uiPriority="39" w:semiHidden="1" w:unhideWhenUsed="1"/>
-    <w:lsdException w:name="toc 3" w:uiPriority="39" w:semiHidden="1" w:unhideWhenUsed="1"/>
-    <w:lsdException w:name="toc 4" w:uiPriority="39" w:semiHidden="1" w:unhideWhenUsed="1"/>
-    <w:lsdException w:name="toc 5" w:uiPriority="39" w:semiHidden="1" w:unhideWhenUsed="1"/>
-    <w:lsdException w:name="toc 6" w:uiPriority="39" w:semiHidden="1" w:unhideWhenUsed="1"/>
-    <w:lsdException w:name="toc 7" w:uiPriority="39" w:semiHidden="1" w:unhideWhenUsed="1"/>
-    <w:lsdException w:name="toc 8" w:uiPriority="39" w:semiHidden="1" w:unhideWhenUsed="1"/>
-    <w:lsdException w:name="toc 9" w:uiPriority="39" w:semiHidden="1" w:unhideWhenUsed="1"/>
+    <w:lsdException w:name="toc 1" w:semiHidden="1" w:uiPriority="39" w:unhideWhenUsed="1"/>
+    <w:lsdException w:name="toc 2" w:semiHidden="1" w:uiPriority="39" w:unhideWhenUsed="1"/>
+    <w:lsdException w:name="toc 3" w:semiHidden="1" w:uiPriority="39" w:unhideWhenUsed="1"/>
+    <w:lsdException w:name="toc 4" w:semiHidden="1" w:uiPriority="39" w:unhideWhenUsed="1"/>
+    <w:lsdException w:name="toc 5" w:semiHidden="1" w:uiPriority="39" w:unhideWhenUsed="1"/>
+    <w:lsdException w:name="toc 6" w:semiHidden="1" w:uiPriority="39" w:unhideWhenUsed="1"/>
+    <w:lsdException w:name="toc 7" w:semiHidden="1" w:uiPriority="39" w:unhideWhenUsed="1"/>
+    <w:lsdException w:name="toc 8" w:semiHidden="1" w:uiPriority="39" w:unhideWhenUsed="1"/>
+    <w:lsdException w:name="toc 9" w:semiHidden="1" w:uiPriority="39" w:unhideWhenUsed="1"/>
     <w:lsdException w:name="Normal Indent" w:semiHidden="1" w:unhideWhenUsed="1"/>
     <w:lsdException w:name="footnote text" w:semiHidden="1" w:unhideWhenUsed="1"/>
     <w:lsdException w:name="annotation text" w:semiHidden="1" w:unhideWhenUsed="1"/>
     <w:lsdException w:name="header" w:semiHidden="1" w:unhideWhenUsed="1"/>
     <w:lsdException w:name="footer" w:semiHidden="1" w:unhideWhenUsed="1"/>
     <w:lsdException w:name="index heading" w:semiHidden="1" w:unhideWhenUsed="1"/>
-    <w:lsdException w:name="caption" w:uiPriority="35" w:semiHidden="1" w:unhideWhenUsed="1" w:qFormat="1"/>
+    <w:lsdException w:name="caption" w:semiHidden="1" w:uiPriority="35" w:unhideWhenUsed="1" w:qFormat="1"/>
     <w:lsdException w:name="table of figures" w:semiHidden="1" w:unhideWhenUsed="1"/>
     <w:lsdException w:name="envelope address" w:semiHidden="1" w:unhideWhenUsed="1"/>
     <w:lsdException w:name="envelope return" w:semiHidden="1" w:unhideWhenUsed="1"/>
@@ -5054,7 +5062,7 @@
     <w:lsdException w:name="Title" w:uiPriority="10" w:qFormat="1"/>
     <w:lsdException w:name="Closing" w:semiHidden="1" w:unhideWhenUsed="1"/>
     <w:lsdException w:name="Signature" w:semiHidden="1" w:unhideWhenUsed="1"/>
-    <w:lsdException w:name="Default Paragraph Font" w:uiPriority="1" w:semiHidden="1" w:unhideWhenUsed="1"/>
+    <w:lsdException w:name="Default Paragraph Font" w:semiHidden="1" w:uiPriority="1" w:unhideWhenUsed="1"/>
     <w:lsdException w:name="Body Text" w:semiHidden="1" w:unhideWhenUsed="1"/>
     <w:lsdException w:name="Body Text Indent" w:semiHidden="1" w:unhideWhenUsed="1"/>
     <w:lsdException w:name="List Continue" w:semiHidden="1" w:unhideWhenUsed="1"/>
@@ -5254,8 +5262,8 @@
     <w:lsdException w:name="Subtle Reference" w:uiPriority="31" w:qFormat="1"/>
     <w:lsdException w:name="Intense Reference" w:uiPriority="32" w:qFormat="1"/>
     <w:lsdException w:name="Book Title" w:uiPriority="33" w:qFormat="1"/>
-    <w:lsdException w:name="Bibliography" w:uiPriority="37" w:semiHidden="1" w:unhideWhenUsed="1"/>
-    <w:lsdException w:name="TOC Heading" w:uiPriority="39" w:semiHidden="1" w:unhideWhenUsed="1" w:qFormat="1"/>
+    <w:lsdException w:name="Bibliography" w:semiHidden="1" w:uiPriority="37" w:unhideWhenUsed="1"/>
+    <w:lsdException w:name="TOC Heading" w:semiHidden="1" w:uiPriority="39" w:unhideWhenUsed="1" w:qFormat="1"/>
     <w:lsdException w:name="Plain Table 1" w:uiPriority="41"/>
     <w:lsdException w:name="Plain Table 2" w:uiPriority="42"/>
     <w:lsdException w:name="Plain Table 3" w:uiPriority="43"/>
@@ -5366,11 +5374,11 @@
     <w:lsdException w:name="Unresolved Mention" w:semiHidden="1" w:unhideWhenUsed="1"/>
     <w:lsdException w:name="Smart Link" w:semiHidden="1" w:unhideWhenUsed="1"/>
   </w:latentStyles>
-  <w:style w:type="paragraph" w:styleId="Normal" w:default="1">
+  <w:style w:type="paragraph" w:default="1" w:styleId="Normal">
     <w:name w:val="Normal"/>
     <w:qFormat/>
   </w:style>
-  <w:style w:type="paragraph" w:styleId="Ttulo2">
+  <w:style w:type="paragraph" w:styleId="Heading2">
     <w:name w:val="heading 2"/>
     <w:basedOn w:val="Normal"/>
     <w:next w:val="Normal"/>
@@ -5385,17 +5393,17 @@
       <w:outlineLvl w:val="1"/>
     </w:pPr>
     <w:rPr>
-      <w:rFonts w:asciiTheme="majorHAnsi" w:hAnsiTheme="majorHAnsi" w:eastAsiaTheme="majorEastAsia" w:cstheme="majorBidi"/>
+      <w:rFonts w:asciiTheme="majorHAnsi" w:eastAsiaTheme="majorEastAsia" w:hAnsiTheme="majorHAnsi" w:cstheme="majorBidi"/>
       <w:color w:val="0F4761" w:themeColor="accent1" w:themeShade="BF"/>
       <w:sz w:val="32"/>
       <w:szCs w:val="32"/>
     </w:rPr>
   </w:style>
-  <w:style w:type="paragraph" w:styleId="Ttulo3">
+  <w:style w:type="paragraph" w:styleId="Heading3">
     <w:name w:val="heading 3"/>
     <w:basedOn w:val="Normal"/>
     <w:next w:val="Normal"/>
-    <w:link w:val="Ttulo3Car"/>
+    <w:link w:val="Heading3Char"/>
     <w:uiPriority w:val="9"/>
     <w:semiHidden/>
     <w:unhideWhenUsed/>
@@ -5408,17 +5416,17 @@
       <w:outlineLvl w:val="2"/>
     </w:pPr>
     <w:rPr>
-      <w:rFonts w:asciiTheme="majorHAnsi" w:hAnsiTheme="majorHAnsi" w:eastAsiaTheme="majorEastAsia" w:cstheme="majorBidi"/>
+      <w:rFonts w:asciiTheme="majorHAnsi" w:eastAsiaTheme="majorEastAsia" w:hAnsiTheme="majorHAnsi" w:cstheme="majorBidi"/>
       <w:color w:val="0A2F40" w:themeColor="accent1" w:themeShade="7F"/>
     </w:rPr>
   </w:style>
-  <w:style w:type="character" w:styleId="Fuentedeprrafopredeter" w:default="1">
+  <w:style w:type="character" w:default="1" w:styleId="DefaultParagraphFont">
     <w:name w:val="Default Paragraph Font"/>
     <w:uiPriority w:val="1"/>
     <w:semiHidden/>
     <w:unhideWhenUsed/>
   </w:style>
-  <w:style w:type="table" w:styleId="Tablanormal" w:default="1">
+  <w:style w:type="table" w:default="1" w:styleId="TableNormal">
     <w:name w:val="Normal Table"/>
     <w:uiPriority w:val="99"/>
     <w:semiHidden/>
@@ -5433,13 +5441,13 @@
       </w:tblCellMar>
     </w:tblPr>
   </w:style>
-  <w:style w:type="numbering" w:styleId="Sinlista" w:default="1">
+  <w:style w:type="numbering" w:default="1" w:styleId="NoList">
     <w:name w:val="No List"/>
     <w:uiPriority w:val="99"/>
     <w:semiHidden/>
     <w:unhideWhenUsed/>
   </w:style>
-  <w:style w:type="paragraph" w:styleId="Prrafodelista">
+  <w:style w:type="paragraph" w:styleId="ListParagraph">
     <w:name w:val="List Paragraph"/>
     <w:basedOn w:val="Normal"/>
     <w:uiPriority w:val="34"/>
@@ -5450,9 +5458,9 @@
       <w:contextualSpacing/>
     </w:pPr>
   </w:style>
-  <w:style w:type="character" w:styleId="Hipervnculo">
+  <w:style w:type="character" w:styleId="Hyperlink">
     <w:name w:val="Hyperlink"/>
-    <w:basedOn w:val="Fuentedeprrafopredeter"/>
+    <w:basedOn w:val="DefaultParagraphFont"/>
     <w:uiPriority w:val="99"/>
     <w:unhideWhenUsed/>
     <w:rsid w:val="06F781DD"/>
@@ -5461,7 +5469,7 @@
       <w:u w:val="single"/>
     </w:rPr>
   </w:style>
-  <w:style w:type="paragraph" w:styleId="Encabezado">
+  <w:style w:type="paragraph" w:styleId="Header">
     <w:name w:val="header"/>
     <w:basedOn w:val="Normal"/>
     <w:uiPriority w:val="99"/>
@@ -5475,7 +5483,7 @@
       <w:spacing w:after="0" w:line="240" w:lineRule="auto"/>
     </w:pPr>
   </w:style>
-  <w:style w:type="paragraph" w:styleId="Piedepgina">
+  <w:style w:type="paragraph" w:styleId="Footer">
     <w:name w:val="footer"/>
     <w:basedOn w:val="Normal"/>
     <w:uiPriority w:val="99"/>
@@ -5489,9 +5497,9 @@
       <w:spacing w:after="0" w:line="240" w:lineRule="auto"/>
     </w:pPr>
   </w:style>
-  <w:style w:type="table" w:styleId="Tablaconcuadrcula">
+  <w:style w:type="table" w:styleId="TableGrid">
     <w:name w:val="Table Grid"/>
-    <w:basedOn w:val="Tablanormal"/>
+    <w:basedOn w:val="TableNormal"/>
     <w:uiPriority w:val="59"/>
     <w:rsid w:val="00FB4123"/>
     <w:pPr>
@@ -5499,18 +5507,18 @@
     </w:pPr>
     <w:tblPr>
       <w:tblBorders>
-        <w:top w:val="single" w:color="000000" w:themeColor="text1" w:sz="4" w:space="0"/>
-        <w:left w:val="single" w:color="000000" w:themeColor="text1" w:sz="4" w:space="0"/>
-        <w:bottom w:val="single" w:color="000000" w:themeColor="text1" w:sz="4" w:space="0"/>
-        <w:right w:val="single" w:color="000000" w:themeColor="text1" w:sz="4" w:space="0"/>
-        <w:insideH w:val="single" w:color="000000" w:themeColor="text1" w:sz="4" w:space="0"/>
-        <w:insideV w:val="single" w:color="000000" w:themeColor="text1" w:sz="4" w:space="0"/>
+        <w:top w:val="single" w:sz="4" w:space="0" w:color="000000" w:themeColor="text1"/>
+        <w:left w:val="single" w:sz="4" w:space="0" w:color="000000" w:themeColor="text1"/>
+        <w:bottom w:val="single" w:sz="4" w:space="0" w:color="000000" w:themeColor="text1"/>
+        <w:right w:val="single" w:sz="4" w:space="0" w:color="000000" w:themeColor="text1"/>
+        <w:insideH w:val="single" w:sz="4" w:space="0" w:color="000000" w:themeColor="text1"/>
+        <w:insideV w:val="single" w:sz="4" w:space="0" w:color="000000" w:themeColor="text1"/>
       </w:tblBorders>
     </w:tblPr>
   </w:style>
-  <w:style w:type="character" w:styleId="Hipervnculovisitado">
+  <w:style w:type="character" w:styleId="FollowedHyperlink">
     <w:name w:val="FollowedHyperlink"/>
-    <w:basedOn w:val="Fuentedeprrafopredeter"/>
+    <w:basedOn w:val="DefaultParagraphFont"/>
     <w:uiPriority w:val="99"/>
     <w:semiHidden/>
     <w:unhideWhenUsed/>
@@ -5520,15 +5528,15 @@
       <w:u w:val="single"/>
     </w:rPr>
   </w:style>
-  <w:style w:type="character" w:styleId="Ttulo3Car" w:customStyle="1">
-    <w:name w:val="Título 3 Car"/>
-    <w:basedOn w:val="Fuentedeprrafopredeter"/>
-    <w:link w:val="Ttulo3"/>
+  <w:style w:type="character" w:customStyle="1" w:styleId="Heading3Char">
+    <w:name w:val="Heading 3 Char"/>
+    <w:basedOn w:val="DefaultParagraphFont"/>
+    <w:link w:val="Heading3"/>
     <w:uiPriority w:val="9"/>
     <w:semiHidden/>
     <w:rsid w:val="00EC0504"/>
     <w:rPr>
-      <w:rFonts w:asciiTheme="majorHAnsi" w:hAnsiTheme="majorHAnsi" w:eastAsiaTheme="majorEastAsia" w:cstheme="majorBidi"/>
+      <w:rFonts w:asciiTheme="majorHAnsi" w:eastAsiaTheme="majorEastAsia" w:hAnsiTheme="majorHAnsi" w:cstheme="majorBidi"/>
       <w:color w:val="0A2F40" w:themeColor="accent1" w:themeShade="7F"/>
     </w:rPr>
   </w:style>
@@ -5536,7 +5544,7 @@
 </file>
 
 <file path=word/theme/theme1.xml><?xml version="1.0" encoding="utf-8"?>
-<a:theme xmlns:a="http://schemas.openxmlformats.org/drawingml/2006/main" xmlns:thm15="http://schemas.microsoft.com/office/thememl/2012/main" name="Office Theme">
+<a:theme xmlns:a="http://schemas.openxmlformats.org/drawingml/2006/main" name="Office Theme">
   <a:themeElements>
     <a:clrScheme name="Office">
       <a:dk1>

</xml_diff>